<commit_message>
Make Distribution N/A for electronic only
</commit_message>
<xml_diff>
--- a/public/CAFTOP_Template.docx
+++ b/public/CAFTOP_Template.docx
@@ -136,7 +136,6 @@
               </w:rPr>
               <w:t>{</w:t>
             </w:r>
-            <w:proofErr w:type="spellStart"/>
             <w:r>
               <w:rPr>
                 <w:rFonts w:ascii="Times New Roman" w:eastAsiaTheme="majorEastAsia" w:hAnsi="Times New Roman"/>
@@ -151,16 +150,7 @@
                 <w:sz w:val="32"/>
                 <w:szCs w:val="32"/>
               </w:rPr>
-              <w:t>ProgramGroup</w:t>
-            </w:r>
-            <w:proofErr w:type="spellEnd"/>
-            <w:r>
-              <w:rPr>
-                <w:rFonts w:ascii="Times New Roman" w:eastAsiaTheme="majorEastAsia" w:hAnsi="Times New Roman"/>
-                <w:sz w:val="32"/>
-                <w:szCs w:val="32"/>
-              </w:rPr>
-              <w:t>}</w:t>
+              <w:t>ProgramGroup}</w:t>
             </w:r>
           </w:p>
           <w:p>
@@ -211,25 +201,7 @@
                 <w:sz w:val="32"/>
                 <w:szCs w:val="32"/>
               </w:rPr>
-              <w:t>{</w:t>
-            </w:r>
-            <w:proofErr w:type="spellStart"/>
-            <w:r>
-              <w:rPr>
-                <w:rFonts w:ascii="Times New Roman" w:eastAsiaTheme="majorEastAsia" w:hAnsi="Times New Roman"/>
-                <w:sz w:val="32"/>
-                <w:szCs w:val="32"/>
-              </w:rPr>
-              <w:t>Info.ProgramName</w:t>
-            </w:r>
-            <w:proofErr w:type="spellEnd"/>
-            <w:r>
-              <w:rPr>
-                <w:rFonts w:ascii="Times New Roman" w:eastAsiaTheme="majorEastAsia" w:hAnsi="Times New Roman"/>
-                <w:sz w:val="32"/>
-                <w:szCs w:val="32"/>
-              </w:rPr>
-              <w:t>}</w:t>
+              <w:t>{Info.ProgramName}</w:t>
             </w:r>
           </w:p>
           <w:p>
@@ -266,7 +238,6 @@
               </w:rPr>
               <w:t>{</w:t>
             </w:r>
-            <w:proofErr w:type="spellStart"/>
             <w:r>
               <w:rPr>
                 <w:rFonts w:ascii="Times New Roman" w:eastAsiaTheme="majorEastAsia" w:hAnsi="Times New Roman"/>
@@ -281,16 +252,7 @@
                 <w:sz w:val="32"/>
                 <w:szCs w:val="32"/>
               </w:rPr>
-              <w:t>ProgramElementCode</w:t>
-            </w:r>
-            <w:proofErr w:type="spellEnd"/>
-            <w:r>
-              <w:rPr>
-                <w:rFonts w:ascii="Times New Roman" w:eastAsiaTheme="majorEastAsia" w:hAnsi="Times New Roman"/>
-                <w:sz w:val="32"/>
-                <w:szCs w:val="32"/>
-              </w:rPr>
-              <w:t>}</w:t>
+              <w:t>ProgramElementCode}</w:t>
             </w:r>
             <w:r>
               <w:rPr>
@@ -434,25 +396,7 @@
                 <w:sz w:val="28"/>
                 <w:szCs w:val="28"/>
               </w:rPr>
-              <w:t>{</w:t>
-            </w:r>
-            <w:proofErr w:type="spellStart"/>
-            <w:r>
-              <w:rPr>
-                <w:rFonts w:ascii="Times New Roman" w:eastAsiaTheme="majorEastAsia" w:hAnsi="Times New Roman"/>
-                <w:sz w:val="28"/>
-                <w:szCs w:val="28"/>
-              </w:rPr>
-              <w:t>Info.PreparingOffice</w:t>
-            </w:r>
-            <w:proofErr w:type="spellEnd"/>
-            <w:r>
-              <w:rPr>
-                <w:rFonts w:ascii="Times New Roman" w:eastAsiaTheme="majorEastAsia" w:hAnsi="Times New Roman"/>
-                <w:sz w:val="28"/>
-                <w:szCs w:val="28"/>
-              </w:rPr>
-              <w:t>}</w:t>
+              <w:t>{Info.PreparingOffice}</w:t>
             </w:r>
           </w:p>
           <w:p>
@@ -471,25 +415,7 @@
                 <w:sz w:val="28"/>
                 <w:szCs w:val="28"/>
               </w:rPr>
-              <w:t>{</w:t>
-            </w:r>
-            <w:proofErr w:type="spellStart"/>
-            <w:r>
-              <w:rPr>
-                <w:rFonts w:ascii="Times New Roman" w:eastAsiaTheme="majorEastAsia" w:hAnsi="Times New Roman"/>
-                <w:sz w:val="28"/>
-                <w:szCs w:val="28"/>
-              </w:rPr>
-              <w:t>Info.PreparingBase</w:t>
-            </w:r>
-            <w:proofErr w:type="spellEnd"/>
-            <w:r>
-              <w:rPr>
-                <w:rFonts w:ascii="Times New Roman" w:eastAsiaTheme="majorEastAsia" w:hAnsi="Times New Roman"/>
-                <w:sz w:val="28"/>
-                <w:szCs w:val="28"/>
-              </w:rPr>
-              <w:t>}</w:t>
+              <w:t>{Info.PreparingBase}</w:t>
             </w:r>
           </w:p>
           <w:p>
@@ -696,7 +622,16 @@
                 <w:sz w:val="28"/>
                 <w:szCs w:val="28"/>
               </w:rPr>
-              <w:t>{/}</w:t>
+              <w:t>{</w:t>
+            </w:r>
+            <w:proofErr w:type="gramStart"/>
+            <w:r>
+              <w:rPr>
+                <w:rFonts w:ascii="Times New Roman" w:eastAsiaTheme="majorEastAsia" w:hAnsi="Times New Roman"/>
+                <w:sz w:val="28"/>
+                <w:szCs w:val="28"/>
+              </w:rPr>
+              <w:t>/}</w:t>
             </w:r>
             <w:r>
               <w:rPr>
@@ -704,7 +639,16 @@
                 <w:sz w:val="28"/>
                 <w:szCs w:val="28"/>
               </w:rPr>
-              <w:t>{#Info.TechOrderManagers}</w:t>
+              <w:t>{</w:t>
+            </w:r>
+            <w:proofErr w:type="gramEnd"/>
+            <w:r>
+              <w:rPr>
+                <w:rFonts w:ascii="Times New Roman" w:eastAsiaTheme="majorEastAsia" w:hAnsi="Times New Roman"/>
+                <w:sz w:val="28"/>
+                <w:szCs w:val="28"/>
+              </w:rPr>
+              <w:t>#Info.TechOrderManagers}</w:t>
             </w:r>
           </w:p>
           <w:p>
@@ -2987,21 +2931,7 @@
         <w:rPr>
           <w:rStyle w:val="Heading1Char"/>
         </w:rPr>
-        <w:t>{</w:t>
-      </w:r>
-      <w:proofErr w:type="spellStart"/>
-      <w:r>
-        <w:rPr>
-          <w:rStyle w:val="Heading1Char"/>
-        </w:rPr>
-        <w:t>Info.ProgramName</w:t>
-      </w:r>
-      <w:proofErr w:type="spellEnd"/>
-      <w:r>
-        <w:rPr>
-          <w:rStyle w:val="Heading1Char"/>
-        </w:rPr>
-        <w:t>}</w:t>
+        <w:t>{Info.ProgramName}</w:t>
       </w:r>
       <w:r>
         <w:rPr>
@@ -3036,15 +2966,7 @@
         <w:t xml:space="preserve"> </w:t>
       </w:r>
       <w:r>
-        <w:t>{</w:t>
-      </w:r>
-      <w:proofErr w:type="spellStart"/>
-      <w:r>
-        <w:t>Description.Description</w:t>
-      </w:r>
-      <w:proofErr w:type="spellEnd"/>
-      <w:r>
-        <w:t>}</w:t>
+        <w:t>{Description.Description}</w:t>
       </w:r>
     </w:p>
     <w:p/>
@@ -3068,15 +2990,7 @@
         <w:t xml:space="preserve"> </w:t>
       </w:r>
       <w:r>
-        <w:t>{</w:t>
-      </w:r>
-      <w:proofErr w:type="spellStart"/>
-      <w:r>
-        <w:t>Description.Introduction</w:t>
-      </w:r>
-      <w:proofErr w:type="spellEnd"/>
-      <w:r>
-        <w:t>}</w:t>
+        <w:t>{Description.Introduction}</w:t>
       </w:r>
     </w:p>
     <w:p/>
@@ -3100,15 +3014,7 @@
         <w:t xml:space="preserve"> </w:t>
       </w:r>
       <w:r>
-        <w:t>The {</w:t>
-      </w:r>
-      <w:proofErr w:type="spellStart"/>
-      <w:r>
-        <w:t>Info.ProgramName</w:t>
-      </w:r>
-      <w:proofErr w:type="spellEnd"/>
-      <w:r>
-        <w:t xml:space="preserve">} TO sustainment support is provided by </w:t>
+        <w:t xml:space="preserve">The {Info.ProgramName} TO sustainment support is provided by </w:t>
       </w:r>
       <w:r>
         <w:t>{#</w:t>
@@ -3158,7 +3064,6 @@
       <w:r>
         <w:t>{</w:t>
       </w:r>
-      <w:proofErr w:type="spellStart"/>
       <w:r>
         <w:t>Labor</w:t>
       </w:r>
@@ -3171,7 +3076,6 @@
       <w:r>
         <w:t>LaborCost</w:t>
       </w:r>
-      <w:proofErr w:type="spellEnd"/>
       <w:r>
         <w:t xml:space="preserve"> | comma</w:t>
       </w:r>
@@ -3190,6 +3094,7 @@
       <w:r>
         <w:t>ContractNumber} for the TO labor/sustainment. This contract will expire on {</w:t>
       </w:r>
+      <w:proofErr w:type="gramStart"/>
       <w:r>
         <w:t>Labor</w:t>
       </w:r>
@@ -3200,7 +3105,11 @@
         <w:t>ContractorSupport.</w:t>
       </w:r>
       <w:r>
-        <w:t>ContractExpiration}.{/}{#Distribution.</w:t>
+        <w:t>ContractExpiration</w:t>
+      </w:r>
+      <w:proofErr w:type="gramEnd"/>
+      <w:r>
+        <w:t>}.{/}{#Distribution.</w:t>
       </w:r>
       <w:r>
         <w:t>hasDistCost</w:t>
@@ -3209,6 +3118,9 @@
         <w:t xml:space="preserve"> === “no”</w:t>
       </w:r>
       <w:r>
+        <w:t xml:space="preserve"> || Distribution.hasDistCost === “”</w:t>
+      </w:r>
+      <w:r>
         <w:t>}</w:t>
       </w:r>
       <w:r>
@@ -3235,7 +3147,6 @@
       <w:r>
         <w:t>{</w:t>
       </w:r>
-      <w:proofErr w:type="spellStart"/>
       <w:r>
         <w:t>Distribution</w:t>
       </w:r>
@@ -3245,7 +3156,6 @@
       <w:r>
         <w:t>Cost</w:t>
       </w:r>
-      <w:proofErr w:type="spellEnd"/>
       <w:r>
         <w:t xml:space="preserve"> | comma </w:t>
       </w:r>
@@ -3336,30 +3246,38 @@
         <w:t>AuthoredInTOAPType</w:t>
       </w:r>
       <w:r>
-        <w:t xml:space="preserve"> === “fully”</w:t>
+        <w:t xml:space="preserve"> === “fully</w:t>
+      </w:r>
+      <w:proofErr w:type="gramStart"/>
+      <w:r>
+        <w:t>”</w:t>
       </w:r>
       <w:r>
         <w:t>}</w:t>
       </w:r>
       <w:r>
-        <w:t xml:space="preserve">All </w:t>
+        <w:t>All</w:t>
+      </w:r>
+      <w:proofErr w:type="gramEnd"/>
+      <w:r>
+        <w:t xml:space="preserve"> </w:t>
+      </w:r>
+      <w:r>
+        <w:t xml:space="preserve">{Info.ProgramName} </w:t>
+      </w:r>
+      <w:r>
+        <w:t xml:space="preserve">TOs are authored and sustained in TOAP. All future TOs to include modification or newly developed TOs will be developed in TOAP. TOs moving from acquisition to sustainment will be authored and sustained in </w:t>
+      </w:r>
+      <w:proofErr w:type="gramStart"/>
+      <w:r>
+        <w:t>TOAP.</w:t>
       </w:r>
       <w:r>
         <w:t>{</w:t>
       </w:r>
-      <w:proofErr w:type="spellStart"/>
-      <w:r>
-        <w:t>Info.ProgramName</w:t>
-      </w:r>
-      <w:proofErr w:type="spellEnd"/>
-      <w:r>
-        <w:t xml:space="preserve">} </w:t>
-      </w:r>
-      <w:r>
-        <w:t>TOs are authored and sustained in TOAP. All future TOs to include modification or newly developed TOs will be developed in TOAP. TOs moving from acquisition to sustainment will be authored and sustained in TOAP.</w:t>
-      </w:r>
-      <w:r>
-        <w:t>{/</w:t>
+      <w:proofErr w:type="gramEnd"/>
+      <w:r>
+        <w:t>/</w:t>
       </w:r>
       <w:r>
         <w:t>}</w:t>
@@ -3377,58 +3295,29 @@
         <w:t>AuthoredInTOAPType</w:t>
       </w:r>
       <w:r>
-        <w:t xml:space="preserve"> === “partially”}{</w:t>
-      </w:r>
-      <w:proofErr w:type="spellStart"/>
-      <w:r>
-        <w:t>Info.ProgramName</w:t>
-      </w:r>
-      <w:proofErr w:type="spellEnd"/>
-      <w:r>
-        <w:t xml:space="preserve">} </w:t>
+        <w:t xml:space="preserve"> === “partially”}{Info.ProgramName} </w:t>
       </w:r>
       <w:r>
         <w:t>consisting of</w:t>
       </w:r>
       <w:r>
-        <w:t xml:space="preserve"> {</w:t>
-      </w:r>
-      <w:proofErr w:type="spellStart"/>
-      <w:r>
-        <w:t>TechnicalOrders.TotalCount</w:t>
-      </w:r>
-      <w:proofErr w:type="spellEnd"/>
-      <w:r>
-        <w:t xml:space="preserve">} </w:t>
+        <w:t xml:space="preserve"> {TechnicalOrders.TotalCount} </w:t>
       </w:r>
       <w:r>
         <w:t>TOs. Of the</w:t>
       </w:r>
       <w:r>
-        <w:t xml:space="preserve"> {</w:t>
-      </w:r>
-      <w:proofErr w:type="spellStart"/>
-      <w:r>
-        <w:t>TechnicalOrders.TotalCount</w:t>
-      </w:r>
-      <w:proofErr w:type="spellEnd"/>
-      <w:r>
-        <w:t xml:space="preserve">} </w:t>
+        <w:t xml:space="preserve"> {TechnicalOrders.TotalCount} </w:t>
       </w:r>
       <w:r>
         <w:t xml:space="preserve">TOs, </w:t>
       </w:r>
       <w:r>
-        <w:t>{</w:t>
-      </w:r>
-      <w:proofErr w:type="spellStart"/>
-      <w:r>
-        <w:t>TechnicalOrders.</w:t>
+        <w:t>{TechnicalOrders.</w:t>
       </w:r>
       <w:r>
         <w:t>NumAuthoredInTOAP</w:t>
       </w:r>
-      <w:proofErr w:type="spellEnd"/>
       <w:r>
         <w:t>}</w:t>
       </w:r>
@@ -3454,16 +3343,11 @@
         <w:t xml:space="preserve"> Additional </w:t>
       </w:r>
       <w:r>
-        <w:t>{</w:t>
-      </w:r>
-      <w:proofErr w:type="spellStart"/>
-      <w:r>
-        <w:t>TechnicalOrders.</w:t>
+        <w:t>{TechnicalOrders.</w:t>
       </w:r>
       <w:r>
         <w:t>NumNotAuthoredInTOAP</w:t>
       </w:r>
-      <w:proofErr w:type="spellEnd"/>
       <w:r>
         <w:t xml:space="preserve">} </w:t>
       </w:r>
@@ -3496,32 +3380,27 @@
         <w:t>Currently there are </w:t>
       </w:r>
       <w:r>
+        <w:t>{TechnicalOrders.</w:t>
+      </w:r>
+      <w:r>
+        <w:t xml:space="preserve"> NumUnpublished</w:t>
+      </w:r>
+      <w:r>
+        <w:t>}</w:t>
+      </w:r>
+      <w:r>
+        <w:t xml:space="preserve"> unpublished TOs that will be authored in </w:t>
+      </w:r>
+      <w:proofErr w:type="gramStart"/>
+      <w:r>
+        <w:t>TOAP.</w:t>
+      </w:r>
+      <w:r>
         <w:t>{</w:t>
       </w:r>
-      <w:proofErr w:type="spellStart"/>
-      <w:r>
-        <w:t>TechnicalOrders</w:t>
-      </w:r>
-      <w:proofErr w:type="spellEnd"/>
-      <w:r>
-        <w:t>.</w:t>
-      </w:r>
-      <w:r>
-        <w:t xml:space="preserve"> </w:t>
-      </w:r>
-      <w:proofErr w:type="spellStart"/>
-      <w:r>
-        <w:t>NumUnpublished</w:t>
-      </w:r>
-      <w:proofErr w:type="spellEnd"/>
-      <w:r>
-        <w:t>}</w:t>
-      </w:r>
-      <w:r>
-        <w:t> unpublished TOs that will be authored in TOAP.</w:t>
-      </w:r>
-      <w:r>
-        <w:t>{/}</w:t>
+      <w:proofErr w:type="gramEnd"/>
+      <w:r>
+        <w:t>/}</w:t>
       </w:r>
       <w:r>
         <w:t>{#TechnicalOrders.</w:t>
@@ -3546,30 +3425,33 @@
         <w:t>The remaining </w:t>
       </w:r>
       <w:r>
+        <w:t>{TechnicalOrders.</w:t>
+      </w:r>
+      <w:r>
+        <w:t>NumWillNotBeAuthoredInTOAP</w:t>
+      </w:r>
+      <w:r>
+        <w:t>}</w:t>
+      </w:r>
+      <w:r>
+        <w:t> TOs will not be authored in TOAP.</w:t>
+      </w:r>
+      <w:r>
+        <w:t xml:space="preserve"> </w:t>
+      </w:r>
+      <w:r>
         <w:t>{</w:t>
       </w:r>
-      <w:proofErr w:type="spellStart"/>
-      <w:r>
-        <w:t>TechnicalOrders.</w:t>
-      </w:r>
-      <w:r>
-        <w:t>NumWillNotBeAuthoredInTOAP</w:t>
-      </w:r>
-      <w:proofErr w:type="spellEnd"/>
-      <w:r>
-        <w:t>}</w:t>
-      </w:r>
-      <w:r>
-        <w:t> TOs will not be authored in TOAP.</w:t>
-      </w:r>
-      <w:r>
-        <w:t xml:space="preserve"> </w:t>
-      </w:r>
-      <w:r>
-        <w:t>{TechnicalOrders.Explanation}</w:t>
-      </w:r>
-      <w:r>
-        <w:t>{/}{/}</w:t>
+      <w:proofErr w:type="gramStart"/>
+      <w:r>
+        <w:t>TechnicalOrders.Explanation}</w:t>
+      </w:r>
+      <w:r>
+        <w:t>{</w:t>
+      </w:r>
+      <w:proofErr w:type="gramEnd"/>
+      <w:r>
+        <w:t>/}{/}</w:t>
       </w:r>
       <w:r>
         <w:t>{#TechnicalOrders.</w:t>
@@ -3650,114 +3532,85 @@
         <w:t>”}</w:t>
       </w:r>
       <w:r>
+        <w:t>{Info.</w:t>
+      </w:r>
+      <w:r>
+        <w:t>ProgramName</w:t>
+      </w:r>
+      <w:r>
+        <w:t xml:space="preserve">} </w:t>
+      </w:r>
+      <w:r>
+        <w:t>is currently authoring TOs to MIL-STD-3048 (S1000D) utilizing</w:t>
+      </w:r>
+      <w:r>
+        <w:t xml:space="preserve"> {#Labor.MILSTD</w:t>
+      </w:r>
+      <w:r>
+        <w:t>3048</w:t>
+      </w:r>
+      <w:r>
+        <w:t>Location !== “outside”}</w:t>
+      </w:r>
+      <w:r>
+        <w:t>{Labor.MILSTD3048Contractor}</w:t>
+      </w:r>
+      <w:r>
+        <w:t>{/}</w:t>
+      </w:r>
+      <w:r>
         <w:t>{</w:t>
       </w:r>
-      <w:proofErr w:type="spellStart"/>
-      <w:r>
-        <w:t>Info.</w:t>
-      </w:r>
-      <w:r>
-        <w:t>ProgramName</w:t>
-      </w:r>
-      <w:proofErr w:type="spellEnd"/>
-      <w:r>
-        <w:t xml:space="preserve">} </w:t>
-      </w:r>
-      <w:r>
-        <w:t>is currently authoring TOs to MIL-STD-3048 (S1000D) utilizing</w:t>
-      </w:r>
-      <w:r>
-        <w:t xml:space="preserve"> {#Labor.MILSTD</w:t>
-      </w:r>
-      <w:r>
-        <w:t>3048</w:t>
-      </w:r>
-      <w:r>
-        <w:t>Location !== “outside”}</w:t>
-      </w:r>
-      <w:r>
-        <w:t>{Labor.MILSTD3048Contractor}</w:t>
+      <w:r>
+        <w:t>#</w:t>
+      </w:r>
+      <w:r>
+        <w:t>Labor.</w:t>
+      </w:r>
+      <w:r>
+        <w:t>MILSTD3048Location === “outside”}{Labor.MILSTD3048Source</w:t>
+      </w:r>
+      <w:r>
+        <w:t>Data</w:t>
+      </w:r>
+      <w:r>
+        <w:t>}{/}</w:t>
+      </w:r>
+      <w:r>
+        <w:t>.</w:t>
       </w:r>
       <w:r>
         <w:t>{/}</w:t>
       </w:r>
       <w:r>
-        <w:t>{</w:t>
-      </w:r>
-      <w:r>
-        <w:t>#</w:t>
-      </w:r>
-      <w:r>
-        <w:t>Labor.</w:t>
-      </w:r>
-      <w:r>
-        <w:t>MILSTD3048Location === “outside”}{Labor.MILSTD3048Source</w:t>
-      </w:r>
-      <w:r>
-        <w:t>Data</w:t>
-      </w:r>
-      <w:r>
-        <w:t>}{/}</w:t>
-      </w:r>
-      <w:r>
-        <w:t>.</w:t>
+        <w:t>{#Labor.MILSTD3048Status === “</w:t>
+      </w:r>
+      <w:r>
+        <w:t>plan</w:t>
+      </w:r>
+      <w:r>
+        <w:t>”}</w:t>
+      </w:r>
+      <w:r>
+        <w:t>{Info.ProgramName}</w:t>
+      </w:r>
+      <w:r>
+        <w:t xml:space="preserve"> is currently in the process of converting Tech Data to MIL-STD-3048 (S1000D) utilizing</w:t>
+      </w:r>
+      <w:r>
+        <w:t xml:space="preserve"> {Labor.MILSTD3048Contractor} </w:t>
+      </w:r>
+      <w:r>
+        <w:t>contract, data will be sustained in TOAP</w:t>
       </w:r>
       <w:r>
         <w:t>{/}</w:t>
       </w:r>
       <w:r>
-        <w:t>{#Labor.MILSTD3048Status === “</w:t>
-      </w:r>
-      <w:r>
-        <w:t>plan</w:t>
-      </w:r>
-      <w:r>
-        <w:t>”}</w:t>
-      </w:r>
-      <w:r>
-        <w:t>{</w:t>
-      </w:r>
-      <w:proofErr w:type="spellStart"/>
-      <w:r>
-        <w:t>Info.ProgramName</w:t>
-      </w:r>
-      <w:proofErr w:type="spellEnd"/>
-      <w:r>
-        <w:t>}</w:t>
-      </w:r>
-      <w:r>
-        <w:t xml:space="preserve"> is currently in the process of converting Tech Data to MIL-STD-3048 (S1000D) utilizing</w:t>
-      </w:r>
-      <w:r>
-        <w:t xml:space="preserve"> {Labor.MILSTD3048Contractor} </w:t>
-      </w:r>
-      <w:r>
-        <w:t>contract, data will be sustained in TOAP</w:t>
-      </w:r>
-      <w:r>
-        <w:t>{/}</w:t>
-      </w:r>
-      <w:r>
-        <w:t>{#Labor.MILSTD3048Status === “</w:t>
-      </w:r>
-      <w:proofErr w:type="spellStart"/>
-      <w:r>
-        <w:t>noplan</w:t>
-      </w:r>
-      <w:proofErr w:type="spellEnd"/>
-      <w:r>
-        <w:t>”} There are no plans to convert</w:t>
-      </w:r>
-      <w:r>
-        <w:t xml:space="preserve"> {</w:t>
-      </w:r>
-      <w:proofErr w:type="spellStart"/>
-      <w:r>
-        <w:t>Info.ProgramName</w:t>
-      </w:r>
-      <w:proofErr w:type="spellEnd"/>
-      <w:r>
-        <w:t xml:space="preserve">} </w:t>
+        <w:t>{#Labor.MILSTD3048Status === “noplan”} There are no plans to convert</w:t>
+      </w:r>
+      <w:r>
+        <w:t xml:space="preserve"> {Info.ProgramName} </w:t>
       </w:r>
       <w:r>
         <w:t>TOs to MIL-STD-3048 (S1000D).{/}</w:t>
@@ -3828,13 +3681,21 @@
         <w:t>NumInAcquisition</w:t>
       </w:r>
       <w:r>
-        <w:t xml:space="preserve"> === 0</w:t>
+        <w:t xml:space="preserve"> === </w:t>
+      </w:r>
+      <w:proofErr w:type="gramStart"/>
+      <w:r>
+        <w:t>0</w:t>
       </w:r>
       <w:r>
         <w:t>}</w:t>
       </w:r>
       <w:r>
-        <w:t>There are no TOs currently in Acquisition.</w:t>
+        <w:t>There</w:t>
+      </w:r>
+      <w:proofErr w:type="gramEnd"/>
+      <w:r>
+        <w:t xml:space="preserve"> are no TOs currently in Acquisition.</w:t>
       </w:r>
       <w:r>
         <w:t>{/}</w:t>
@@ -3852,24 +3713,27 @@
         <w:t xml:space="preserve">There are currently </w:t>
       </w:r>
       <w:r>
+        <w:t>{TechnicalOrders.</w:t>
+      </w:r>
+      <w:r>
+        <w:t>NumInAcquisition</w:t>
+      </w:r>
+      <w:r>
+        <w:t>}</w:t>
+      </w:r>
+      <w:r>
+        <w:t xml:space="preserve"> TOs in the acquisition process. Effort will be made to ensure that all future TOs acquired will be delivered in digital </w:t>
+      </w:r>
+      <w:proofErr w:type="gramStart"/>
+      <w:r>
+        <w:t>format.</w:t>
+      </w:r>
+      <w:r>
         <w:t>{</w:t>
       </w:r>
-      <w:proofErr w:type="spellStart"/>
-      <w:r>
-        <w:t>TechnicalOrders.</w:t>
-      </w:r>
-      <w:r>
-        <w:t>NumInAcquisition</w:t>
-      </w:r>
-      <w:proofErr w:type="spellEnd"/>
-      <w:r>
-        <w:t>}</w:t>
-      </w:r>
-      <w:r>
-        <w:t xml:space="preserve"> TOs in the acquisition process. Effort will be made to ensure that all future TOs acquired will be delivered in digital format.</w:t>
-      </w:r>
-      <w:r>
-        <w:t>{/}</w:t>
+      <w:proofErr w:type="gramEnd"/>
+      <w:r>
+        <w:t>/}</w:t>
       </w:r>
     </w:p>
     <w:p/>
@@ -3909,15 +3773,7 @@
         <w:t xml:space="preserve"> </w:t>
       </w:r>
       <w:r>
-        <w:t>{</w:t>
-      </w:r>
-      <w:proofErr w:type="spellStart"/>
-      <w:r>
-        <w:t>Description.ConfigurationPlan</w:t>
-      </w:r>
-      <w:proofErr w:type="spellEnd"/>
-      <w:r>
-        <w:t>}</w:t>
+        <w:t>{Description.ConfigurationPlan}</w:t>
       </w:r>
       <w:r>
         <w:t xml:space="preserve"> </w:t>
@@ -3956,15 +3812,7 @@
         <w:t xml:space="preserve">The </w:t>
       </w:r>
       <w:r>
-        <w:t>{</w:t>
-      </w:r>
-      <w:proofErr w:type="spellStart"/>
-      <w:r>
-        <w:t>Info.ProgramName</w:t>
-      </w:r>
-      <w:proofErr w:type="spellEnd"/>
-      <w:r>
-        <w:t>}</w:t>
+        <w:t>{Info.ProgramName}</w:t>
       </w:r>
       <w:r>
         <w:t xml:space="preserve"> program</w:t>
@@ -3976,15 +3824,7 @@
         <w:t xml:space="preserve">maintains </w:t>
       </w:r>
       <w:r>
-        <w:t>{</w:t>
-      </w:r>
-      <w:proofErr w:type="spellStart"/>
-      <w:r>
-        <w:t>TechnicalOrders.TotalTypeCount</w:t>
-      </w:r>
-      <w:proofErr w:type="spellEnd"/>
-      <w:r>
-        <w:t>}</w:t>
+        <w:t>{TechnicalOrders.TotalTypeCount}</w:t>
       </w:r>
       <w:r>
         <w:t xml:space="preserve"> </w:t>
@@ -3999,15 +3839,7 @@
         <w:t xml:space="preserve">Os; </w:t>
       </w:r>
       <w:r>
-        <w:t>{</w:t>
-      </w:r>
-      <w:proofErr w:type="spellStart"/>
-      <w:r>
-        <w:t>TechnicalOrders.NumPaper</w:t>
-      </w:r>
-      <w:proofErr w:type="spellEnd"/>
-      <w:r>
-        <w:t>}</w:t>
+        <w:t>{TechnicalOrders.NumPaper}</w:t>
       </w:r>
       <w:r>
         <w:t xml:space="preserve"> </w:t>
@@ -4016,15 +3848,7 @@
         <w:t xml:space="preserve">paper, </w:t>
       </w:r>
       <w:r>
-        <w:t>{</w:t>
-      </w:r>
-      <w:proofErr w:type="spellStart"/>
-      <w:r>
-        <w:t>TechnicalOrders.NumElectronic</w:t>
-      </w:r>
-      <w:proofErr w:type="spellEnd"/>
-      <w:r>
-        <w:t>}</w:t>
+        <w:t>{TechnicalOrders.NumElectronic}</w:t>
       </w:r>
       <w:r>
         <w:t xml:space="preserve"> </w:t>
@@ -4039,15 +3863,7 @@
         <w:t xml:space="preserve">, </w:t>
       </w:r>
       <w:r>
-        <w:t>{</w:t>
-      </w:r>
-      <w:proofErr w:type="spellStart"/>
-      <w:r>
-        <w:t>TechnicalOrders.NumCDDVD</w:t>
-      </w:r>
-      <w:proofErr w:type="spellEnd"/>
-      <w:r>
-        <w:t>}</w:t>
+        <w:t>{TechnicalOrders.NumCDDVD}</w:t>
       </w:r>
       <w:r>
         <w:t xml:space="preserve"> </w:t>
@@ -4083,21 +3899,21 @@
         <w:t xml:space="preserve">there are no plans to convert to Standard Generalized Markup Language (SGML). </w:t>
       </w:r>
       <w:r>
-        <w:t>{#TechnicalOrders.NumUnpublished &gt; 0}</w:t>
-      </w:r>
-      <w:r>
-        <w:t>Currently there are</w:t>
-      </w:r>
-      <w:r>
-        <w:t xml:space="preserve"> {</w:t>
-      </w:r>
-      <w:proofErr w:type="spellStart"/>
-      <w:r>
-        <w:t>TechnicalOrders.NumUnpublished</w:t>
-      </w:r>
-      <w:proofErr w:type="spellEnd"/>
-      <w:r>
-        <w:t>}</w:t>
+        <w:t xml:space="preserve">{#TechnicalOrders.NumUnpublished &gt; </w:t>
+      </w:r>
+      <w:proofErr w:type="gramStart"/>
+      <w:r>
+        <w:t>0}</w:t>
+      </w:r>
+      <w:r>
+        <w:t>Currently</w:t>
+      </w:r>
+      <w:proofErr w:type="gramEnd"/>
+      <w:r>
+        <w:t xml:space="preserve"> there are</w:t>
+      </w:r>
+      <w:r>
+        <w:t xml:space="preserve"> {TechnicalOrders.NumUnpublished}</w:t>
       </w:r>
       <w:r>
         <w:t xml:space="preserve"> </w:t>
@@ -4156,15 +3972,7 @@
         <w:t xml:space="preserve"> </w:t>
       </w:r>
       <w:r>
-        <w:t>{</w:t>
-      </w:r>
-      <w:proofErr w:type="spellStart"/>
-      <w:r>
-        <w:t>Description.SystemMissionDescription</w:t>
-      </w:r>
-      <w:proofErr w:type="spellEnd"/>
-      <w:r>
-        <w:t>}</w:t>
+        <w:t>{Description.SystemMissionDescription}</w:t>
       </w:r>
       <w:r>
         <w:t xml:space="preserve"> </w:t>
@@ -4190,55 +3998,39 @@
         </w:rPr>
         <w:t>{</w:t>
       </w:r>
-      <w:proofErr w:type="spellStart"/>
       <w:r>
         <w:rPr>
           <w:rStyle w:val="Heading1Char"/>
         </w:rPr>
-        <w:t>Info.ProgramName</w:t>
-      </w:r>
-      <w:proofErr w:type="spellEnd"/>
+        <w:t>Info.ProgramName}</w:t>
+      </w:r>
       <w:r>
         <w:rPr>
           <w:rStyle w:val="Heading1Char"/>
         </w:rPr>
-        <w:t>}</w:t>
+        <w:t xml:space="preserve"> </w:t>
       </w:r>
       <w:r>
         <w:rPr>
           <w:rStyle w:val="Heading1Char"/>
         </w:rPr>
+        <w:t>Labor</w:t>
+      </w:r>
+      <w:bookmarkEnd w:id="9"/>
+      <w:r>
+        <w:rPr>
+          <w:b/>
+        </w:rPr>
+        <w:t>:</w:t>
+      </w:r>
+      <w:r>
+        <w:rPr>
+          <w:b/>
+        </w:rPr>
         <w:t xml:space="preserve"> </w:t>
       </w:r>
       <w:r>
-        <w:rPr>
-          <w:rStyle w:val="Heading1Char"/>
-        </w:rPr>
-        <w:t>Labor</w:t>
-      </w:r>
-      <w:bookmarkEnd w:id="9"/>
-      <w:r>
-        <w:rPr>
-          <w:b/>
-        </w:rPr>
-        <w:t>:</w:t>
-      </w:r>
-      <w:r>
-        <w:rPr>
-          <w:b/>
-        </w:rPr>
-        <w:t xml:space="preserve"> </w:t>
-      </w:r>
-      <w:r>
-        <w:t>All labor requirements for {</w:t>
-      </w:r>
-      <w:proofErr w:type="spellStart"/>
-      <w:r>
-        <w:t>Info.ProgramName</w:t>
-      </w:r>
-      <w:proofErr w:type="spellEnd"/>
-      <w:r>
-        <w:t>}</w:t>
+        <w:t>All labor requirements for {Info.ProgramName}</w:t>
       </w:r>
       <w:r>
         <w:t xml:space="preserve"> </w:t>
@@ -4285,27 +4077,13 @@
         <w:rPr>
           <w:rStyle w:val="Heading2Char"/>
         </w:rPr>
-        <w:t>{</w:t>
-      </w:r>
-      <w:proofErr w:type="spellStart"/>
+        <w:t>{In</w:t>
+      </w:r>
       <w:r>
         <w:rPr>
           <w:rStyle w:val="Heading2Char"/>
         </w:rPr>
-        <w:t>In</w:t>
-      </w:r>
-      <w:r>
-        <w:rPr>
-          <w:rStyle w:val="Heading2Char"/>
-        </w:rPr>
-        <w:t>fo.ProgramName</w:t>
-      </w:r>
-      <w:proofErr w:type="spellEnd"/>
-      <w:r>
-        <w:rPr>
-          <w:rStyle w:val="Heading2Char"/>
-        </w:rPr>
-        <w:t>}</w:t>
+        <w:t>fo.ProgramName}</w:t>
       </w:r>
       <w:r>
         <w:rPr>
@@ -4421,53 +4199,40 @@
         </w:rPr>
         <w:t>{</w:t>
       </w:r>
-      <w:proofErr w:type="spellStart"/>
       <w:r>
         <w:rPr>
           <w:rStyle w:val="Heading2Char"/>
         </w:rPr>
-        <w:t>Info.ProgramName</w:t>
-      </w:r>
-      <w:proofErr w:type="spellEnd"/>
+        <w:t>Info.ProgramName}</w:t>
+      </w:r>
       <w:r>
         <w:rPr>
           <w:rStyle w:val="Heading2Char"/>
         </w:rPr>
-        <w:t>}</w:t>
+        <w:t xml:space="preserve"> </w:t>
       </w:r>
       <w:r>
         <w:rPr>
           <w:rStyle w:val="Heading2Char"/>
         </w:rPr>
+        <w:t xml:space="preserve">Labor </w:t>
+      </w:r>
+      <w:r>
+        <w:rPr>
+          <w:rStyle w:val="Heading2Char"/>
+        </w:rPr>
+        <w:t>Non-Mod Revision</w:t>
+      </w:r>
+      <w:bookmarkEnd w:id="11"/>
+      <w:r>
         <w:t xml:space="preserve"> </w:t>
       </w:r>
       <w:r>
-        <w:rPr>
-          <w:rStyle w:val="Heading2Char"/>
-        </w:rPr>
-        <w:t xml:space="preserve">Labor </w:t>
-      </w:r>
-      <w:r>
-        <w:rPr>
-          <w:rStyle w:val="Heading2Char"/>
-        </w:rPr>
-        <w:t>Non-Mod Revision</w:t>
-      </w:r>
-      <w:bookmarkEnd w:id="11"/>
-      <w:r>
-        <w:t xml:space="preserve"> </w:t>
-      </w:r>
-      <w:r>
         <w:t xml:space="preserve">requirements are labor </w:t>
       </w:r>
       <w:r>
-        <w:t xml:space="preserve">cost associated with updates to </w:t>
-      </w:r>
-      <w:proofErr w:type="spellStart"/>
-      <w:r>
-        <w:t>TO</w:t>
-      </w:r>
-      <w:proofErr w:type="spellEnd"/>
+        <w:t>cost associated with updates to TO</w:t>
+      </w:r>
       <w:r>
         <w:t xml:space="preserve"> revisions supporting the field and depot users by providing </w:t>
       </w:r>
@@ -4516,15 +4281,7 @@
         <w:t xml:space="preserve">of </w:t>
       </w:r>
       <w:r>
-        <w:t>{</w:t>
-      </w:r>
-      <w:proofErr w:type="spellStart"/>
-      <w:r>
-        <w:t>Info.ProgramName</w:t>
-      </w:r>
-      <w:proofErr w:type="spellEnd"/>
-      <w:r>
-        <w:t>}</w:t>
+        <w:t>{Info.ProgramName}</w:t>
       </w:r>
       <w:r>
         <w:t xml:space="preserve"> Labor</w:t>
@@ -4545,7 +4302,15 @@
         <w:t xml:space="preserve"> </w:t>
       </w:r>
       <w:r>
-        <w:t>Labor Non-Mod revisions cannot be create</w:t>
+        <w:t xml:space="preserve">Labor </w:t>
+      </w:r>
+      <w:proofErr w:type="gramStart"/>
+      <w:r>
+        <w:t>Non-Mod</w:t>
+      </w:r>
+      <w:proofErr w:type="gramEnd"/>
+      <w:r>
+        <w:t xml:space="preserve"> revisions cannot be create</w:t>
       </w:r>
       <w:r>
         <w:t>d</w:t>
@@ -4607,33 +4372,19 @@
         <w:rPr>
           <w:rStyle w:val="Heading2Char"/>
         </w:rPr>
-        <w:t>{</w:t>
-      </w:r>
-      <w:proofErr w:type="spellStart"/>
+        <w:t>{Info.ProgramName}</w:t>
+      </w:r>
       <w:r>
         <w:rPr>
           <w:rStyle w:val="Heading2Char"/>
         </w:rPr>
-        <w:t>Info.ProgramName</w:t>
-      </w:r>
-      <w:proofErr w:type="spellEnd"/>
+        <w:t xml:space="preserve"> S1000D Interactive Electronic Technical Manual (IETM)</w:t>
+      </w:r>
+      <w:bookmarkEnd w:id="12"/>
       <w:r>
         <w:rPr>
           <w:rStyle w:val="Heading2Char"/>
         </w:rPr>
-        <w:t>}</w:t>
-      </w:r>
-      <w:r>
-        <w:rPr>
-          <w:rStyle w:val="Heading2Char"/>
-        </w:rPr>
-        <w:t xml:space="preserve"> S1000D Interactive Electronic Technical Manual (IETM)</w:t>
-      </w:r>
-      <w:bookmarkEnd w:id="12"/>
-      <w:r>
-        <w:rPr>
-          <w:rStyle w:val="Heading2Char"/>
-        </w:rPr>
         <w:t xml:space="preserve"> </w:t>
       </w:r>
       <w:r>
@@ -4643,18 +4394,18 @@
         <w:t>,</w:t>
       </w:r>
       <w:r>
-        <w:t xml:space="preserve"> and maintaining current status of data within an electronic database for electronic display of </w:t>
-      </w:r>
-      <w:r>
-        <w:t>{</w:t>
-      </w:r>
-      <w:proofErr w:type="spellStart"/>
-      <w:r>
-        <w:t>Info.ProgramName</w:t>
-      </w:r>
-      <w:proofErr w:type="spellEnd"/>
-      <w:r>
-        <w:t>}</w:t>
+        <w:t xml:space="preserve"> and maintaining </w:t>
+      </w:r>
+      <w:proofErr w:type="gramStart"/>
+      <w:r>
+        <w:t>current status</w:t>
+      </w:r>
+      <w:proofErr w:type="gramEnd"/>
+      <w:r>
+        <w:t xml:space="preserve"> of data within an electronic database for electronic display of </w:t>
+      </w:r>
+      <w:r>
+        <w:t>{Info.ProgramName}</w:t>
       </w:r>
       <w:r>
         <w:t xml:space="preserve"> Technical Data. The mission of S1000D IETM is to provide data in a current format to operate in the electronic environment allowing security configuration updates from any location, at any time.</w:t>
@@ -4690,7 +4441,15 @@
         <w:t>D</w:t>
       </w:r>
       <w:r>
-        <w:t xml:space="preserve"> 3048B) are located in the Technical Manual Contract Requirements (TMCR) document.</w:t>
+        <w:t xml:space="preserve"> 3048B) </w:t>
+      </w:r>
+      <w:proofErr w:type="gramStart"/>
+      <w:r>
+        <w:t>are located in</w:t>
+      </w:r>
+      <w:proofErr w:type="gramEnd"/>
+      <w:r>
+        <w:t xml:space="preserve"> the Technical Manual Contract Requirements (TMCR) document.</w:t>
       </w:r>
       <w:r>
         <w:t xml:space="preserve"> </w:t>
@@ -4752,66 +4511,63 @@
         <w:t xml:space="preserve"> </w:t>
       </w:r>
       <w:r>
+        <w:t>{Info.ProgramName}</w:t>
+      </w:r>
+      <w:r>
+        <w:rPr>
+          <w:b/>
+        </w:rPr>
+        <w:t xml:space="preserve"> </w:t>
+      </w:r>
+      <w:r>
+        <w:t>S1000D IETM Development means a corresponding delay in completion of data conversion into S1000D industry standards, and a slip to the right of the projected timeline for completion and field use of the S1000D product funded by the requirement.</w:t>
+      </w:r>
+      <w:r>
+        <w:t xml:space="preserve"> </w:t>
+      </w:r>
+      <w:r>
+        <w:t>Once the conversion is underway all sustainment changes to TOs will be put on hold to maintain configuration management and control until the conversion is complete. Therefore</w:t>
+      </w:r>
+      <w:r>
+        <w:t>,</w:t>
+      </w:r>
+      <w:r>
+        <w:t xml:space="preserve"> under funding could not only negatively impact conversion but also impact the ability to support sustainment changes including but not limited to safety change.</w:t>
+      </w:r>
+      <w:r>
+        <w:t xml:space="preserve"> </w:t>
+      </w:r>
+      <w:r>
+        <w:t xml:space="preserve">If the TOs are not updated it could result in safety and operational capabilities of various aircraft or equipment, </w:t>
+      </w:r>
+      <w:r>
+        <w:t>jeopardize the safety of personnel</w:t>
+      </w:r>
+      <w:r>
+        <w:t>,</w:t>
+      </w:r>
+      <w:r>
+        <w:t xml:space="preserve"> </w:t>
+      </w:r>
+      <w:r>
+        <w:t>and</w:t>
+      </w:r>
+      <w:r>
+        <w:t xml:space="preserve"> potentially cause equipment damage or work </w:t>
+      </w:r>
+      <w:proofErr w:type="gramStart"/>
+      <w:r>
+        <w:t>stoppage</w:t>
+      </w:r>
+      <w:r>
+        <w:t>.</w:t>
+      </w:r>
+      <w:r>
         <w:t>{</w:t>
       </w:r>
-      <w:proofErr w:type="spellStart"/>
-      <w:r>
-        <w:t>Info.ProgramName</w:t>
-      </w:r>
-      <w:proofErr w:type="spellEnd"/>
-      <w:r>
-        <w:t>}</w:t>
-      </w:r>
-      <w:r>
-        <w:rPr>
-          <w:b/>
-        </w:rPr>
-        <w:t xml:space="preserve"> </w:t>
-      </w:r>
-      <w:r>
-        <w:t>S1000D IETM Development means a corresponding delay in completion of data conversion into S1000D industry standards, and a slip to the right of the projected timeline for completion and field use of the S1000D product funded by the requirement.</w:t>
-      </w:r>
-      <w:r>
-        <w:t xml:space="preserve"> </w:t>
-      </w:r>
-      <w:r>
-        <w:t>Once the conversion is underway all sustainment changes to TOs will be put on hold to maintain configuration management and control until the conversion is complete. Therefore</w:t>
-      </w:r>
-      <w:r>
-        <w:t>,</w:t>
-      </w:r>
-      <w:r>
-        <w:t xml:space="preserve"> under funding could not only negatively impact conversion but also impact the ability to support sustainment changes including but not limited to safety change.</w:t>
-      </w:r>
-      <w:r>
-        <w:t xml:space="preserve"> </w:t>
-      </w:r>
-      <w:r>
-        <w:t xml:space="preserve">If the TOs are not updated it could result in safety and operational capabilities of various aircraft or equipment, </w:t>
-      </w:r>
-      <w:r>
-        <w:t>jeopardize the safety of personnel</w:t>
-      </w:r>
-      <w:r>
-        <w:t>,</w:t>
-      </w:r>
-      <w:r>
-        <w:t xml:space="preserve"> </w:t>
-      </w:r>
-      <w:r>
-        <w:t>and</w:t>
-      </w:r>
-      <w:r>
-        <w:t xml:space="preserve"> potentially cause equipment damage or work </w:t>
-      </w:r>
-      <w:r>
-        <w:t>stoppage</w:t>
-      </w:r>
-      <w:r>
-        <w:t>.</w:t>
-      </w:r>
-      <w:r>
-        <w:t>{/}</w:t>
+      <w:proofErr w:type="gramEnd"/>
+      <w:r>
+        <w:t>/}</w:t>
       </w:r>
       <w:r>
         <w:t xml:space="preserve"> </w:t>
@@ -4819,15 +4575,15 @@
     </w:p>
     <w:p>
       <w:r>
-        <w:t xml:space="preserve">{#Labor.ContractorSupport.TDSSe ===”yes” &amp;&amp; </w:t>
-      </w:r>
-      <w:proofErr w:type="spellStart"/>
-      <w:r>
-        <w:t>Labor.ContractorSupport.TDSSeRobins</w:t>
-      </w:r>
-      <w:proofErr w:type="spellEnd"/>
-      <w:r>
-        <w:t xml:space="preserve"> === “yes”}</w:t>
+        <w:t>{#</w:t>
+      </w:r>
+      <w:proofErr w:type="gramStart"/>
+      <w:r>
+        <w:t>Labor.ContractorSupport.TDSSe</w:t>
+      </w:r>
+      <w:proofErr w:type="gramEnd"/>
+      <w:r>
+        <w:t xml:space="preserve"> ===”yes” &amp;&amp; Labor.ContractorSupport.TDSSeRobins === “yes”}</w:t>
       </w:r>
     </w:p>
     <w:p>
@@ -4847,41 +4603,11 @@
         <w:rPr>
           <w:rStyle w:val="Heading2Char"/>
         </w:rPr>
-        <w:t>{</w:t>
-      </w:r>
-      <w:proofErr w:type="spellStart"/>
-      <w:r>
-        <w:rPr>
-          <w:rStyle w:val="Heading2Char"/>
-        </w:rPr>
-        <w:t>Info.ProgramName</w:t>
-      </w:r>
-      <w:proofErr w:type="spellEnd"/>
-      <w:r>
-        <w:rPr>
-          <w:rStyle w:val="Heading2Char"/>
-        </w:rPr>
-        <w:t>} Product Data Services (PDS) TO Sustainment Contract</w:t>
+        <w:t>{Info.ProgramName} Product Data Services (PDS) TO Sustainment Contract</w:t>
       </w:r>
       <w:bookmarkEnd w:id="13"/>
       <w:r>
-        <w:t xml:space="preserve"> task provides labor associated with the sustainment of Technical Orders (TO) to ensure the most current version of TO documents are available and accurately archived. This includes conversion of engineering drawings into text searchable .PDF files, sustainment of parts configuration data extracted from Illustrated Parts Breakdown (IPB) TOs to include conversion, validation, and identification of errors to ensure data extracted from new IPB TOs is captured, sustained, and updated for the Applications, Programs, and Indentures (API/D200F) databases. Contract labor to sustain systems utilized by the AF to manage sustainment, such as </w:t>
-      </w:r>
-      <w:proofErr w:type="spellStart"/>
-      <w:r>
-        <w:t>Contenta</w:t>
-      </w:r>
-      <w:proofErr w:type="spellEnd"/>
-      <w:r>
-        <w:t xml:space="preserve">, </w:t>
-      </w:r>
-      <w:proofErr w:type="spellStart"/>
-      <w:r>
-        <w:t>Framemaker</w:t>
-      </w:r>
-      <w:proofErr w:type="spellEnd"/>
-      <w:r>
-        <w:t xml:space="preserve"> and graphic TO source data. Effort enables the sustainment of TO publishing systems and style libraries. Sustains conversion tool utilized to convert Standard Generalized Markup Language (SGML) to Hypertext Markup Language (HTML) to allow publishing of Type I Interactive Electronic Technical Manuals (IETM) data. Provides labor to sustain user interface tools and access to electronic TO and engineering source data, and enterprise-level search linked U.S. Air Force (USAF) data sources. Effort also provides the labor to evaluate military specifications governing structure, style, and format of TO data and to assess impacts of military specification changes on TO source data. </w:t>
+        <w:t xml:space="preserve"> task provides labor associated with the sustainment of Technical Orders (TO) to ensure the most current version of TO documents are available and accurately archived. This includes conversion of engineering drawings into text searchable .PDF files, sustainment of parts configuration data extracted from Illustrated Parts Breakdown (IPB) TOs to include conversion, validation, and identification of errors to ensure data extracted from new IPB TOs is captured, sustained, and updated for the Applications, Programs, and Indentures (API/D200F) databases. Contract labor to sustain systems utilized by the AF to manage sustainment, such as Contenta, Framemaker and graphic TO source data. Effort enables the sustainment of TO publishing systems and style libraries. Sustains conversion tool utilized to convert Standard Generalized Markup Language (SGML) to Hypertext Markup Language (HTML) to allow publishing of Type I Interactive Electronic Technical Manuals (IETM) data. Provides labor to sustain user interface tools and access to electronic TO and engineering source data, and enterprise-level search linked U.S. Air Force (USAF) data sources. Effort also provides the labor to evaluate military specifications governing structure, style, and format of TO data and to assess impacts of military specification changes on TO source data. </w:t>
       </w:r>
     </w:p>
     <w:p>
@@ -4893,15 +4619,7 @@
         <w:t>Impact Statement:</w:t>
       </w:r>
       <w:r>
-        <w:t xml:space="preserve"> Without the support of Product Data Services (PDS) TO Sustainment Contract {</w:t>
-      </w:r>
-      <w:proofErr w:type="spellStart"/>
-      <w:r>
-        <w:t>Info.ProgramName</w:t>
-      </w:r>
-      <w:proofErr w:type="spellEnd"/>
-      <w:r>
-        <w:t xml:space="preserve">} technical data, the Operational Safety, Suitability, and Effectiveness (OSS&amp;E) of the mission is drastically put at risk. A reduced level of support would create an unacceptable risk to life, health, property, mission capability and the environment. This support maintains the accuracy and consistency of TOs available to users. Without technically accurate data, full mission capability cannot be realized at field level. This task follows guidance provided by AFI 63-101/20-101 which requires that current, valid, </w:t>
+        <w:t xml:space="preserve"> Without the support of Product Data Services (PDS) TO Sustainment Contract {Info.ProgramName} technical data, the Operational Safety, Suitability, and Effectiveness (OSS&amp;E) of the mission is drastically put at risk. A reduced level of support would create an unacceptable risk to life, health, property, mission capability and the environment. This support maintains the accuracy and consistency of TOs available to users. Without technically accurate data, full mission capability cannot be realized at field level. This task follows guidance provided by AFI 63-101/20-101 which requires that current, valid, </w:t>
       </w:r>
       <w:r>
         <w:lastRenderedPageBreak/>
@@ -4928,19 +4646,11 @@
         </w:rPr>
         <w:t>{</w:t>
       </w:r>
-      <w:proofErr w:type="spellStart"/>
       <w:r>
         <w:rPr>
           <w:rStyle w:val="Heading2Char"/>
         </w:rPr>
-        <w:t>Info.ProgramName</w:t>
-      </w:r>
-      <w:proofErr w:type="spellEnd"/>
-      <w:r>
-        <w:rPr>
-          <w:rStyle w:val="Heading2Char"/>
-        </w:rPr>
-        <w:t>} Technical Data Support Services (TDSS) CORE Contract</w:t>
+        <w:t>Info.ProgramName} Technical Data Support Services (TDSS) CORE Contract</w:t>
       </w:r>
       <w:bookmarkEnd w:id="14"/>
       <w:r>
@@ -4956,10 +4666,18 @@
         <w:t>Impact Statement:</w:t>
       </w:r>
       <w:r>
-        <w:t xml:space="preserve"> This task follows guidance provided by AFI 63-101/20-101 which requires that current, valid, verified TOs and technical data must be provided that clearly identifies procedures and requirements necessary to preserve OSS&amp;E baselines and to diagnose, repair, calibrate, operate, and test systems or end items. Without full support, the technical data and the OSS&amp;E of the mission is drastically put at risk. A reduced level of support would create an unacceptable risk to life, health, property, mission capability and the environment. This support maintains the accuracy and consistency of TOs available to users. Without technically accurate data, full mission capability cannot be realized at field level.</w:t>
-      </w:r>
-      <w:r>
-        <w:t>{/}</w:t>
+        <w:t xml:space="preserve"> This task follows guidance provided by AFI 63-101/20-101 which requires that current, valid, verified TOs and technical data must be provided that clearly identifies procedures and requirements necessary to preserve OSS&amp;E baselines and to diagnose, repair, calibrate, operate, and test systems or end items. Without full support, the technical data and the OSS&amp;E of the mission is drastically put at risk. A reduced level of support would create an unacceptable risk to life, health, property, mission capability and the environment. This support maintains the accuracy and consistency of TOs available to users. Without technically accurate data, full mission capability cannot be realized at field </w:t>
+      </w:r>
+      <w:proofErr w:type="gramStart"/>
+      <w:r>
+        <w:t>level.</w:t>
+      </w:r>
+      <w:r>
+        <w:t>{</w:t>
+      </w:r>
+      <w:proofErr w:type="gramEnd"/>
+      <w:r>
+        <w:t>/}</w:t>
       </w:r>
     </w:p>
     <w:p>
@@ -4985,21 +4703,7 @@
         <w:rPr>
           <w:rStyle w:val="Heading2Char"/>
         </w:rPr>
-        <w:t>{</w:t>
-      </w:r>
-      <w:proofErr w:type="spellStart"/>
-      <w:r>
-        <w:rPr>
-          <w:rStyle w:val="Heading2Char"/>
-        </w:rPr>
-        <w:t>Info.ProgramName</w:t>
-      </w:r>
-      <w:proofErr w:type="spellEnd"/>
-      <w:r>
-        <w:rPr>
-          <w:rStyle w:val="Heading2Char"/>
-        </w:rPr>
-        <w:t>}</w:t>
+        <w:t>{Info.ProgramName}</w:t>
       </w:r>
       <w:r>
         <w:rPr>
@@ -5027,6 +4731,7 @@
           <w:tab w:val="left" w:pos="360"/>
         </w:tabs>
       </w:pPr>
+      <w:proofErr w:type="gramStart"/>
       <w:r>
         <w:rPr>
           <w:b/>
@@ -5035,7 +4740,11 @@
         <w:t>Impact:</w:t>
       </w:r>
       <w:r>
-        <w:t>{Impact}</w:t>
+        <w:t>{</w:t>
+      </w:r>
+      <w:proofErr w:type="gramEnd"/>
+      <w:r>
+        <w:t>Impact}</w:t>
       </w:r>
     </w:p>
     <w:p>
@@ -5074,138 +4783,130 @@
         </w:rPr>
         <w:t>{</w:t>
       </w:r>
-      <w:proofErr w:type="spellStart"/>
       <w:r>
         <w:rPr>
           <w:rStyle w:val="Heading1Char"/>
         </w:rPr>
-        <w:t>Info.ProgramName</w:t>
-      </w:r>
-      <w:proofErr w:type="spellEnd"/>
+        <w:t>Info.ProgramName}</w:t>
+      </w:r>
       <w:r>
         <w:rPr>
           <w:rStyle w:val="Heading1Char"/>
         </w:rPr>
-        <w:t>}</w:t>
+        <w:t xml:space="preserve"> </w:t>
       </w:r>
       <w:r>
         <w:rPr>
           <w:rStyle w:val="Heading1Char"/>
         </w:rPr>
+        <w:t>Distribution</w:t>
+      </w:r>
+      <w:bookmarkEnd w:id="16"/>
+      <w:r>
+        <w:rPr>
+          <w:b/>
+        </w:rPr>
+        <w:t>:</w:t>
+      </w:r>
+      <w:r>
+        <w:rPr>
+          <w:b/>
+        </w:rPr>
         <w:t xml:space="preserve"> </w:t>
       </w:r>
       <w:r>
-        <w:rPr>
-          <w:rStyle w:val="Heading1Char"/>
-        </w:rPr>
-        <w:t>Distribution</w:t>
-      </w:r>
-      <w:bookmarkEnd w:id="16"/>
-      <w:r>
-        <w:rPr>
-          <w:b/>
-        </w:rPr>
-        <w:t>:</w:t>
-      </w:r>
-      <w:r>
-        <w:rPr>
-          <w:b/>
-        </w:rPr>
+        <w:t xml:space="preserve">Distribution covers the costs associated with several activities to get </w:t>
+      </w:r>
+      <w:r>
+        <w:t>Technical</w:t>
+      </w:r>
+      <w:r>
+        <w:t xml:space="preserve"> Orders (</w:t>
+      </w:r>
+      <w:r>
+        <w:t>TOs</w:t>
+      </w:r>
+      <w:r>
+        <w:t>)</w:t>
+      </w:r>
+      <w:r>
+        <w:t xml:space="preserve"> into the hands of the users; field/flight line, intermediate and depot maintainers, Equipment Specialists, </w:t>
+      </w:r>
+      <w:r>
+        <w:t>Engineers</w:t>
+      </w:r>
+      <w:r>
+        <w:t>,</w:t>
+      </w:r>
+      <w:r>
         <w:t xml:space="preserve"> </w:t>
       </w:r>
       <w:r>
-        <w:t xml:space="preserve">Distribution covers the costs associated with several activities to get </w:t>
-      </w:r>
-      <w:r>
-        <w:t>Technical</w:t>
-      </w:r>
-      <w:r>
-        <w:t xml:space="preserve"> Orders (</w:t>
-      </w:r>
-      <w:r>
-        <w:t>TOs</w:t>
-      </w:r>
-      <w:r>
-        <w:t>)</w:t>
-      </w:r>
-      <w:r>
-        <w:t xml:space="preserve"> into the hands of the users; field/flight line, intermediate and depot maintainers, Equipment Specialists, </w:t>
-      </w:r>
-      <w:r>
-        <w:t>Engineers</w:t>
-      </w:r>
-      <w:r>
-        <w:t>,</w:t>
+        <w:t>and quality offices. These activities include printing, packaging, postage, prep for digital uploading, and the actual uploading to a database for delivery to and access by the users.</w:t>
       </w:r>
       <w:r>
         <w:t xml:space="preserve"> </w:t>
       </w:r>
       <w:r>
-        <w:t>and quality offices. These activities include printing, packaging, postage, prep for digital uploading, and the actual uploading to a database for delivery to and access by the users.</w:t>
+        <w:t xml:space="preserve">The </w:t>
+      </w:r>
+      <w:r>
+        <w:t xml:space="preserve">primary </w:t>
+      </w:r>
+      <w:r>
+        <w:t>database used for storing and distribution of AF TOs is Enhanced Technical Information Management System (ETIMS).</w:t>
       </w:r>
       <w:r>
         <w:t xml:space="preserve"> </w:t>
       </w:r>
       <w:r>
-        <w:t xml:space="preserve">The </w:t>
-      </w:r>
-      <w:r>
-        <w:t xml:space="preserve">primary </w:t>
-      </w:r>
-      <w:r>
-        <w:t>database used for storing and distribution of AF TOs is Enhanced Technical Information Management System (ETIMS).</w:t>
+        <w:t xml:space="preserve">{#TechnicalOrders.NumPaper &gt; 0 || TechnicalOrders.NumCDDVD &gt; </w:t>
+      </w:r>
+      <w:proofErr w:type="gramStart"/>
+      <w:r>
+        <w:t>0}</w:t>
+      </w:r>
+      <w:r>
+        <w:t>The</w:t>
+      </w:r>
+      <w:proofErr w:type="gramEnd"/>
+      <w:r>
+        <w:t xml:space="preserve"> AF </w:t>
+      </w:r>
+      <w:r>
+        <w:t>transitioned</w:t>
       </w:r>
       <w:r>
         <w:t xml:space="preserve"> </w:t>
       </w:r>
       <w:r>
-        <w:t xml:space="preserve">{#TechnicalOrders.NumPaper &gt; 0 || </w:t>
-      </w:r>
-      <w:proofErr w:type="spellStart"/>
-      <w:r>
-        <w:t>TechnicalOrders.NumCDDVD</w:t>
-      </w:r>
-      <w:proofErr w:type="spellEnd"/>
-      <w:r>
-        <w:t xml:space="preserve"> &gt; 0}</w:t>
-      </w:r>
-      <w:r>
-        <w:t xml:space="preserve">The AF </w:t>
-      </w:r>
-      <w:r>
-        <w:t>transitioned</w:t>
+        <w:t xml:space="preserve">print and distribution </w:t>
+      </w:r>
+      <w:r>
+        <w:t xml:space="preserve">of </w:t>
+      </w:r>
+      <w:r>
+        <w:t xml:space="preserve">TOs </w:t>
+      </w:r>
+      <w:r>
+        <w:t xml:space="preserve">to </w:t>
+      </w:r>
+      <w:r>
+        <w:t>Defense Logistics Agency (DLA) Document Services</w:t>
+      </w:r>
+      <w:r>
+        <w:t xml:space="preserve">, </w:t>
+      </w:r>
+      <w:r>
+        <w:t>Data Services Online (DSO)</w:t>
+      </w:r>
+      <w:r>
+        <w:t>.</w:t>
       </w:r>
       <w:r>
         <w:t xml:space="preserve"> </w:t>
       </w:r>
       <w:r>
-        <w:t xml:space="preserve">print and distribution </w:t>
-      </w:r>
-      <w:r>
-        <w:t xml:space="preserve">of </w:t>
-      </w:r>
-      <w:r>
-        <w:t xml:space="preserve">TOs </w:t>
-      </w:r>
-      <w:r>
-        <w:t xml:space="preserve">to </w:t>
-      </w:r>
-      <w:r>
-        <w:t>Defense Logistics Agency (DLA) Document Services</w:t>
-      </w:r>
-      <w:r>
-        <w:t xml:space="preserve">, </w:t>
-      </w:r>
-      <w:r>
-        <w:t>Data Services Online (DSO)</w:t>
-      </w:r>
-      <w:r>
-        <w:t>.</w:t>
-      </w:r>
-      <w:r>
-        <w:t xml:space="preserve"> </w:t>
-      </w:r>
-      <w:r>
         <w:t xml:space="preserve">The distribution section is made up of several specific areas all associated with preparing and delivering TOs to libraries and the field users. </w:t>
       </w:r>
       <w:r>
@@ -5233,34 +4934,29 @@
         <w:t xml:space="preserve">requirements </w:t>
       </w:r>
       <w:r>
-        <w:t>under the following task.</w:t>
-      </w:r>
-      <w:r>
-        <w:t xml:space="preserve">{/}{#TechnicalOrders.NumPaper === 0 &amp;&amp; </w:t>
-      </w:r>
-      <w:proofErr w:type="spellStart"/>
-      <w:r>
-        <w:t>TechnicalOrders.NumCDDVD</w:t>
-      </w:r>
-      <w:proofErr w:type="spellEnd"/>
-      <w:r>
-        <w:t xml:space="preserve"> </w:t>
+        <w:t xml:space="preserve">under the following </w:t>
+      </w:r>
+      <w:proofErr w:type="gramStart"/>
+      <w:r>
+        <w:t>task.</w:t>
+      </w:r>
+      <w:r>
+        <w:t>{</w:t>
+      </w:r>
+      <w:proofErr w:type="gramEnd"/>
+      <w:r>
+        <w:t xml:space="preserve">/}{#TechnicalOrders.NumPaper === 0 &amp;&amp; TechnicalOrders.NumCDDVD </w:t>
       </w:r>
       <w:r>
         <w:lastRenderedPageBreak/>
         <w:t xml:space="preserve">=== 0}There are no distribution requirements for </w:t>
       </w:r>
       <w:r>
-        <w:t>{</w:t>
-      </w:r>
-      <w:proofErr w:type="spellStart"/>
-      <w:r>
-        <w:t>Info.</w:t>
+        <w:t>{Info.</w:t>
       </w:r>
       <w:r>
         <w:t>ProgramName</w:t>
       </w:r>
-      <w:proofErr w:type="spellEnd"/>
       <w:r>
         <w:t>}</w:t>
       </w:r>
@@ -5301,26 +4997,21 @@
         <w:ind w:left="0"/>
       </w:pPr>
       <w:r>
-        <w:t>{#Distribution.hasDSO===”yes”</w:t>
+        <w:t>{#Distribution.hasDSO==</w:t>
+      </w:r>
+      <w:proofErr w:type="gramStart"/>
+      <w:r>
+        <w:t>=”yes</w:t>
+      </w:r>
+      <w:proofErr w:type="gramEnd"/>
+      <w:r>
+        <w:t>”</w:t>
       </w:r>
       <w:r>
         <w:t xml:space="preserve"> &amp;&amp; (</w:t>
       </w:r>
-      <w:proofErr w:type="spellStart"/>
-      <w:r>
-        <w:t>TechnicalOrders.NumPaper</w:t>
-      </w:r>
-      <w:proofErr w:type="spellEnd"/>
-      <w:r>
-        <w:t xml:space="preserve"> &gt; 0 || </w:t>
-      </w:r>
-      <w:proofErr w:type="spellStart"/>
-      <w:r>
-        <w:t>TechnicalOrders.NumCDDVD</w:t>
-      </w:r>
-      <w:proofErr w:type="spellEnd"/>
-      <w:r>
-        <w:t xml:space="preserve"> &gt; 0</w:t>
+      <w:r>
+        <w:t>TechnicalOrders.NumPaper &gt; 0 || TechnicalOrders.NumCDDVD &gt; 0</w:t>
       </w:r>
       <w:r>
         <w:t>)</w:t>
@@ -5352,57 +5043,51 @@
         <w:rPr>
           <w:rStyle w:val="Heading2Char"/>
         </w:rPr>
-        <w:t>{</w:t>
-      </w:r>
-      <w:proofErr w:type="spellStart"/>
+        <w:t>{Info.ProgramName}</w:t>
+      </w:r>
       <w:r>
         <w:rPr>
           <w:rStyle w:val="Heading2Char"/>
         </w:rPr>
-        <w:t>Info.ProgramName</w:t>
-      </w:r>
-      <w:proofErr w:type="spellEnd"/>
+        <w:t xml:space="preserve"> </w:t>
+      </w:r>
       <w:r>
         <w:rPr>
           <w:rStyle w:val="Heading2Char"/>
         </w:rPr>
-        <w:t>}</w:t>
+        <w:t>Duplication</w:t>
       </w:r>
       <w:r>
         <w:rPr>
           <w:rStyle w:val="Heading2Char"/>
         </w:rPr>
-        <w:t xml:space="preserve"> </w:t>
+        <w:t xml:space="preserve"> Sustainment Changes, Non-Mod Revisions and One-Time Requisitions (OTRs), </w:t>
       </w:r>
       <w:r>
         <w:rPr>
           <w:rStyle w:val="Heading2Char"/>
         </w:rPr>
-        <w:t>Duplication</w:t>
-      </w:r>
+        <w:t>{#</w:t>
+      </w:r>
+      <w:proofErr w:type="gramStart"/>
       <w:r>
         <w:rPr>
           <w:rStyle w:val="Heading2Char"/>
         </w:rPr>
-        <w:t xml:space="preserve"> Sustainment Changes, Non-Mod Revisions and One-Time Requisitions (OTRs), </w:t>
+        <w:t>TechnicalOrders</w:t>
       </w:r>
       <w:r>
         <w:rPr>
           <w:rStyle w:val="Heading2Char"/>
         </w:rPr>
-        <w:t>{#</w:t>
-      </w:r>
+        <w:t>}{</w:t>
+      </w:r>
+      <w:proofErr w:type="gramEnd"/>
       <w:r>
         <w:rPr>
           <w:rStyle w:val="Heading2Char"/>
         </w:rPr>
-        <w:t>TechnicalOrders</w:t>
-      </w:r>
-      <w:r>
-        <w:rPr>
-          <w:rStyle w:val="Heading2Char"/>
-        </w:rPr>
-        <w:t>}{#</w:t>
+        <w:t>#</w:t>
       </w:r>
       <w:r>
         <w:rPr>
@@ -5612,15 +5297,7 @@
         <w:t xml:space="preserve">support of </w:t>
       </w:r>
       <w:r>
-        <w:t>{</w:t>
-      </w:r>
-      <w:proofErr w:type="spellStart"/>
-      <w:r>
-        <w:t>Info.ProgramName</w:t>
-      </w:r>
-      <w:proofErr w:type="spellEnd"/>
-      <w:r>
-        <w:t>}</w:t>
+        <w:t>{Info.ProgramName}</w:t>
       </w:r>
       <w:r>
         <w:t xml:space="preserve"> </w:t>
@@ -5697,26 +5374,21 @@
     </w:p>
     <w:p>
       <w:r>
-        <w:t>{#Distribution.hasDSO ==”yes”</w:t>
+        <w:t>{#Distribution.hasDSO =</w:t>
+      </w:r>
+      <w:proofErr w:type="gramStart"/>
+      <w:r>
+        <w:t>=”yes</w:t>
+      </w:r>
+      <w:proofErr w:type="gramEnd"/>
+      <w:r>
+        <w:t>”</w:t>
       </w:r>
       <w:r>
         <w:t xml:space="preserve"> &amp;&amp; (</w:t>
       </w:r>
-      <w:proofErr w:type="spellStart"/>
-      <w:r>
-        <w:t>TechnicalOrders.NumPaper</w:t>
-      </w:r>
-      <w:proofErr w:type="spellEnd"/>
-      <w:r>
-        <w:t xml:space="preserve"> &gt; 0 || </w:t>
-      </w:r>
-      <w:proofErr w:type="spellStart"/>
-      <w:r>
-        <w:t>TechnicalOrders.NumCDDVD</w:t>
-      </w:r>
-      <w:proofErr w:type="spellEnd"/>
-      <w:r>
-        <w:t xml:space="preserve"> &gt; 0</w:t>
+      <w:r>
+        <w:t>TechnicalOrders.NumPaper &gt; 0 || TechnicalOrders.NumCDDVD &gt; 0</w:t>
       </w:r>
       <w:r>
         <w:t>)</w:t>
@@ -5742,21 +5414,7 @@
         <w:rPr>
           <w:rStyle w:val="Heading2Char"/>
         </w:rPr>
-        <w:t>{</w:t>
-      </w:r>
-      <w:proofErr w:type="spellStart"/>
-      <w:r>
-        <w:rPr>
-          <w:rStyle w:val="Heading2Char"/>
-        </w:rPr>
-        <w:t>Info.ProgramName</w:t>
-      </w:r>
-      <w:proofErr w:type="spellEnd"/>
-      <w:r>
-        <w:rPr>
-          <w:rStyle w:val="Heading2Char"/>
-        </w:rPr>
-        <w:t>}</w:t>
+        <w:t>{Info.ProgramName}</w:t>
       </w:r>
       <w:r>
         <w:rPr>
@@ -5966,21 +5624,7 @@
         <w:rPr>
           <w:bCs/>
         </w:rPr>
-        <w:t>{</w:t>
-      </w:r>
-      <w:proofErr w:type="spellStart"/>
-      <w:r>
-        <w:rPr>
-          <w:bCs/>
-        </w:rPr>
-        <w:t>Info.ProgramName</w:t>
-      </w:r>
-      <w:proofErr w:type="spellEnd"/>
-      <w:r>
-        <w:rPr>
-          <w:bCs/>
-        </w:rPr>
-        <w:t>}</w:t>
+        <w:t>{Info.ProgramName}</w:t>
       </w:r>
       <w:r>
         <w:rPr>
@@ -6035,10 +5679,18 @@
     <w:p/>
     <w:p>
       <w:r>
-        <w:t>{/}</w:t>
-      </w:r>
-      <w:r>
-        <w:t>{#Distribution.has</w:t>
+        <w:t>{</w:t>
+      </w:r>
+      <w:proofErr w:type="gramStart"/>
+      <w:r>
+        <w:t>/}</w:t>
+      </w:r>
+      <w:r>
+        <w:t>{</w:t>
+      </w:r>
+      <w:proofErr w:type="gramEnd"/>
+      <w:r>
+        <w:t>#Distribution.has</w:t>
       </w:r>
       <w:r>
         <w:t>Outside</w:t>
@@ -6049,21 +5701,8 @@
       <w:r>
         <w:t xml:space="preserve"> &amp;&amp; (</w:t>
       </w:r>
-      <w:proofErr w:type="spellStart"/>
-      <w:r>
-        <w:t>TechnicalOrders.NumPaper</w:t>
-      </w:r>
-      <w:proofErr w:type="spellEnd"/>
-      <w:r>
-        <w:t xml:space="preserve"> &gt; 0 || </w:t>
-      </w:r>
-      <w:proofErr w:type="spellStart"/>
-      <w:r>
-        <w:t>TechnicalOrders.NumCDDVD</w:t>
-      </w:r>
-      <w:proofErr w:type="spellEnd"/>
-      <w:r>
-        <w:t xml:space="preserve"> &gt; 0</w:t>
+      <w:r>
+        <w:t>TechnicalOrders.NumPaper &gt; 0 || TechnicalOrders.NumCDDVD &gt; 0</w:t>
       </w:r>
       <w:r>
         <w:t>)</w:t>
@@ -6089,21 +5728,7 @@
         <w:rPr>
           <w:rStyle w:val="Heading2Char"/>
         </w:rPr>
-        <w:t>{</w:t>
-      </w:r>
-      <w:proofErr w:type="spellStart"/>
-      <w:r>
-        <w:rPr>
-          <w:rStyle w:val="Heading2Char"/>
-        </w:rPr>
-        <w:t>Info.ProgramName</w:t>
-      </w:r>
-      <w:proofErr w:type="spellEnd"/>
-      <w:r>
-        <w:rPr>
-          <w:rStyle w:val="Heading2Char"/>
-        </w:rPr>
-        <w:t>}</w:t>
+        <w:t>{Info.ProgramName}</w:t>
       </w:r>
       <w:r>
         <w:rPr>
@@ -6346,75 +5971,69 @@
         <w:rPr>
           <w:bCs/>
         </w:rPr>
+        <w:t>{Info.ProgramName}</w:t>
+      </w:r>
+      <w:r>
+        <w:rPr>
+          <w:b/>
+        </w:rPr>
+        <w:t xml:space="preserve"> </w:t>
+      </w:r>
+      <w:r>
+        <w:t xml:space="preserve">cannot support the users in the field with updated </w:t>
+      </w:r>
+      <w:r>
+        <w:t>TOs</w:t>
+      </w:r>
+      <w:r>
+        <w:t xml:space="preserve">, which could result in safety and operational capabilities of various aircraft because the field and depot generated </w:t>
+      </w:r>
+      <w:r>
+        <w:t>recommended change (RCs</w:t>
+      </w:r>
+      <w:r>
+        <w:t xml:space="preserve">) </w:t>
+      </w:r>
+      <w:r>
+        <w:t>cannot</w:t>
+      </w:r>
+      <w:r>
+        <w:t xml:space="preserve"> be processed into TO change packages.</w:t>
+      </w:r>
+      <w:r>
+        <w:t xml:space="preserve"> W</w:t>
+      </w:r>
+      <w:r>
+        <w:t>ithout current TOs</w:t>
+      </w:r>
+      <w:r>
+        <w:t>,</w:t>
+      </w:r>
+      <w:r>
+        <w:t xml:space="preserve"> it could jeopardize the safety of personnel, potential equipment damage</w:t>
+      </w:r>
+      <w:r>
+        <w:t>, training</w:t>
+      </w:r>
+      <w:r>
+        <w:t>,</w:t>
+      </w:r>
+      <w:r>
+        <w:t xml:space="preserve"> </w:t>
+      </w:r>
+      <w:r>
+        <w:t xml:space="preserve">or work </w:t>
+      </w:r>
+      <w:proofErr w:type="gramStart"/>
+      <w:r>
+        <w:t>stoppage.</w:t>
+      </w:r>
+      <w:r>
         <w:t>{</w:t>
       </w:r>
-      <w:proofErr w:type="spellStart"/>
-      <w:r>
-        <w:rPr>
-          <w:bCs/>
-        </w:rPr>
-        <w:t>Info.ProgramName</w:t>
-      </w:r>
-      <w:proofErr w:type="spellEnd"/>
-      <w:r>
-        <w:rPr>
-          <w:bCs/>
-        </w:rPr>
-        <w:t>}</w:t>
-      </w:r>
-      <w:r>
-        <w:rPr>
-          <w:b/>
-        </w:rPr>
-        <w:t xml:space="preserve"> </w:t>
-      </w:r>
-      <w:r>
-        <w:t xml:space="preserve">cannot support the users in the field with updated </w:t>
-      </w:r>
-      <w:r>
-        <w:t>TOs</w:t>
-      </w:r>
-      <w:r>
-        <w:t xml:space="preserve">, which could result in safety and operational capabilities of various aircraft because the field and depot generated </w:t>
-      </w:r>
-      <w:r>
-        <w:t>recommended change (RCs</w:t>
-      </w:r>
-      <w:r>
-        <w:t xml:space="preserve">) </w:t>
-      </w:r>
-      <w:r>
-        <w:t>cannot</w:t>
-      </w:r>
-      <w:r>
-        <w:t xml:space="preserve"> be processed into TO change packages.</w:t>
-      </w:r>
-      <w:r>
-        <w:t xml:space="preserve"> W</w:t>
-      </w:r>
-      <w:r>
-        <w:t>ithout current TOs</w:t>
-      </w:r>
-      <w:r>
-        <w:t>,</w:t>
-      </w:r>
-      <w:r>
-        <w:t xml:space="preserve"> it could jeopardize the safety of personnel, potential equipment damage</w:t>
-      </w:r>
-      <w:r>
-        <w:t>, training</w:t>
-      </w:r>
-      <w:r>
-        <w:t>,</w:t>
-      </w:r>
-      <w:r>
-        <w:t xml:space="preserve"> </w:t>
-      </w:r>
-      <w:r>
-        <w:t>or work stoppage.</w:t>
-      </w:r>
-      <w:r>
-        <w:t>{#Distribution.</w:t>
+      <w:proofErr w:type="gramEnd"/>
+      <w:r>
+        <w:t>#Distribution.</w:t>
       </w:r>
       <w:r>
         <w:t>ODSO</w:t>
@@ -6469,72 +6088,58 @@
         <w:rPr>
           <w:rStyle w:val="Heading1Char"/>
         </w:rPr>
+        <w:t>{Info.ProgramName}</w:t>
+      </w:r>
+      <w:r>
+        <w:rPr>
+          <w:rStyle w:val="Heading1Char"/>
+        </w:rPr>
+        <w:t xml:space="preserve"> </w:t>
+      </w:r>
+      <w:r>
+        <w:rPr>
+          <w:rStyle w:val="Heading1Char"/>
+        </w:rPr>
+        <w:t>Improvements</w:t>
+      </w:r>
+      <w:bookmarkEnd w:id="20"/>
+      <w:r>
+        <w:rPr>
+          <w:b/>
+        </w:rPr>
+        <w:t>:</w:t>
+      </w:r>
+      <w:r>
+        <w:rPr>
+          <w:b/>
+        </w:rPr>
+        <w:t xml:space="preserve"> </w:t>
+      </w:r>
+      <w:r>
+        <w:rPr>
+          <w:b/>
+        </w:rPr>
         <w:t>{</w:t>
       </w:r>
-      <w:proofErr w:type="spellStart"/>
-      <w:r>
-        <w:rPr>
-          <w:rStyle w:val="Heading1Char"/>
-        </w:rPr>
-        <w:t>Info.ProgramName</w:t>
-      </w:r>
-      <w:proofErr w:type="spellEnd"/>
-      <w:r>
-        <w:rPr>
-          <w:rStyle w:val="Heading1Char"/>
-        </w:rPr>
-        <w:t>}</w:t>
-      </w:r>
-      <w:r>
-        <w:rPr>
-          <w:rStyle w:val="Heading1Char"/>
-        </w:rPr>
+      <w:r>
+        <w:rPr>
+          <w:bCs/>
+        </w:rPr>
+        <w:t>#Improvements.HasImprovements === “no”}</w:t>
+      </w:r>
+      <w:r>
         <w:t xml:space="preserve"> </w:t>
       </w:r>
       <w:r>
-        <w:rPr>
-          <w:rStyle w:val="Heading1Char"/>
-        </w:rPr>
-        <w:t>Improvements</w:t>
-      </w:r>
-      <w:bookmarkEnd w:id="20"/>
-      <w:r>
-        <w:rPr>
-          <w:b/>
-        </w:rPr>
-        <w:t>:</w:t>
-      </w:r>
-      <w:r>
-        <w:rPr>
-          <w:b/>
-        </w:rPr>
-        <w:t xml:space="preserve"> </w:t>
-      </w:r>
-      <w:r>
-        <w:rPr>
-          <w:b/>
-        </w:rPr>
-        <w:t>{</w:t>
-      </w:r>
-      <w:r>
-        <w:rPr>
-          <w:bCs/>
-        </w:rPr>
-        <w:t>#Improvements.HasImprovements === “no”}</w:t>
-      </w:r>
-      <w:r>
-        <w:t xml:space="preserve"> </w:t>
-      </w:r>
-      <w:r>
-        <w:t>There are currently no improvement requirements for {</w:t>
-      </w:r>
-      <w:proofErr w:type="spellStart"/>
-      <w:r>
-        <w:t>Info.ProgramName</w:t>
-      </w:r>
-      <w:proofErr w:type="spellEnd"/>
-      <w:r>
-        <w:t>}.{/}</w:t>
+        <w:t>There are currently no improvement requirements for {Info.ProgramName</w:t>
+      </w:r>
+      <w:proofErr w:type="gramStart"/>
+      <w:r>
+        <w:t>}.{</w:t>
+      </w:r>
+      <w:proofErr w:type="gramEnd"/>
+      <w:r>
+        <w:t>/}</w:t>
       </w:r>
     </w:p>
     <w:p>
@@ -6598,6 +6203,7 @@
         <w:pStyle w:val="ListParagraph"/>
         <w:ind w:left="360"/>
       </w:pPr>
+      <w:proofErr w:type="gramStart"/>
       <w:r>
         <w:rPr>
           <w:b/>
@@ -6606,7 +6212,11 @@
         <w:t>Impact:</w:t>
       </w:r>
       <w:r>
-        <w:t>{Impact}</w:t>
+        <w:t>{</w:t>
+      </w:r>
+      <w:proofErr w:type="gramEnd"/>
+      <w:r>
+        <w:t>Impact}</w:t>
       </w:r>
     </w:p>
     <w:p>
@@ -6672,6 +6282,7 @@
       <w:r>
         <w:t xml:space="preserve"> </w:t>
       </w:r>
+      <w:proofErr w:type="gramStart"/>
       <w:r>
         <w:t>twoDigit</w:t>
       </w:r>
@@ -6681,6 +6292,7 @@
       <w:r>
         <w:t>_</w:t>
       </w:r>
+      <w:proofErr w:type="gramEnd"/>
       <w:r>
         <w:t>{Info.LeadCommand}_{Info.Center}_{Info.ProgramElementCode}</w:t>
       </w:r>
@@ -6720,14 +6332,25 @@
         <w:rPr>
           <w:rStyle w:val="Heading1Char"/>
         </w:rPr>
-        <w:t>Task Prioritization</w:t>
+        <w:t xml:space="preserve">Task </w:t>
+      </w:r>
+      <w:proofErr w:type="gramStart"/>
+      <w:r>
+        <w:rPr>
+          <w:rStyle w:val="Heading1Char"/>
+        </w:rPr>
+        <w:t>Prioritization</w:t>
       </w:r>
       <w:bookmarkEnd w:id="23"/>
       <w:r>
         <w:t>:</w:t>
       </w:r>
       <w:r>
-        <w:t>{#LRDP.LRDP}</w:t>
+        <w:t>{</w:t>
+      </w:r>
+      <w:proofErr w:type="gramEnd"/>
+      <w:r>
+        <w:t>#LRDP.LRDP}</w:t>
       </w:r>
     </w:p>
     <w:p>
@@ -6754,15 +6377,15 @@
         <w:t xml:space="preserve"> </w:t>
       </w:r>
       <w:r>
-        <w:t>{</w:t>
-      </w:r>
-      <w:proofErr w:type="spellStart"/>
-      <w:r>
-        <w:t>SeqNum</w:t>
-      </w:r>
-      <w:proofErr w:type="spellEnd"/>
-      <w:r>
-        <w:t>}{/}</w:t>
+        <w:t>{SeqNum</w:t>
+      </w:r>
+      <w:proofErr w:type="gramStart"/>
+      <w:r>
+        <w:t>}{</w:t>
+      </w:r>
+      <w:proofErr w:type="gramEnd"/>
+      <w:r>
+        <w:t>/}</w:t>
       </w:r>
     </w:p>
     <w:p>
@@ -6772,6 +6395,7 @@
       <w:r>
         <w:t>{#LRDP.hasLRDP === “no</w:t>
       </w:r>
+      <w:proofErr w:type="gramStart"/>
       <w:r>
         <w:t>”</w:t>
       </w:r>
@@ -6779,7 +6403,11 @@
         <w:t>}</w:t>
       </w:r>
       <w:r>
-        <w:t>There are no LRDP tasks.</w:t>
+        <w:t>There</w:t>
+      </w:r>
+      <w:proofErr w:type="gramEnd"/>
+      <w:r>
+        <w:t xml:space="preserve"> are no LRDP tasks.</w:t>
       </w:r>
       <w:r>
         <w:t>{/}</w:t>
@@ -6883,7 +6511,7 @@
         </w:rPr>
         <w:pict w14:anchorId="42250BA7">
           <v:shape id="_x0000_i1026" type="#_x0000_t75" alt="Microsoft Office Signature Line..." style="width:192pt;height:96pt">
-            <v:imagedata r:id="rId11" o:title=""/>
+            <v:imagedata r:id="rId12" o:title=""/>
             <o:lock v:ext="edit" ungrouping="t" rotation="t" cropping="t" verticies="t" text="t" grouping="t"/>
             <o:signatureline v:ext="edit" id="{2FE24A7F-4C02-4D0D-AA34-3B237805A0F9}" provid="{00000000-0000-0000-0000-000000000000}" o:suggestedsigner="FirstName LastName" o:suggestedsigner2="Program Manager" o:suggestedsigneremail="Email" issignatureline="t"/>
           </v:shape>
@@ -6909,7 +6537,7 @@
         </w:rPr>
         <w:pict w14:anchorId="13D035FB">
           <v:shape id="_x0000_i1027" type="#_x0000_t75" alt="Microsoft Office Signature Line..." style="width:192pt;height:96pt">
-            <v:imagedata r:id="rId11" o:title=""/>
+            <v:imagedata r:id="rId12" o:title=""/>
             <o:lock v:ext="edit" ungrouping="t" rotation="t" cropping="t" verticies="t" text="t" grouping="t"/>
             <o:signatureline v:ext="edit" id="{BD27A615-C575-40DE-9949-C2672517FB96}" provid="{00000000-0000-0000-0000-000000000000}" o:suggestedsigner="FirstName LastName" o:suggestedsigner2="Program Manager" o:suggestedsigneremail="Email" issignatureline="t"/>
           </v:shape>
@@ -6935,7 +6563,7 @@
         </w:rPr>
         <w:pict w14:anchorId="451E6F9C">
           <v:shape id="_x0000_i1028" type="#_x0000_t75" alt="Microsoft Office Signature Line..." style="width:192pt;height:96pt">
-            <v:imagedata r:id="rId11" o:title=""/>
+            <v:imagedata r:id="rId12" o:title=""/>
             <o:lock v:ext="edit" ungrouping="t" rotation="t" cropping="t" verticies="t" text="t" grouping="t"/>
             <o:signatureline v:ext="edit" id="{F79E3C56-4B48-4B56-8DB7-0185E17BF1E8}" provid="{00000000-0000-0000-0000-000000000000}" o:suggestedsigner="FirstName LastName" o:suggestedsigner2="Program Manager" o:suggestedsigneremail="Email" issignatureline="t"/>
           </v:shape>
@@ -6953,7 +6581,7 @@
       <w:r>
         <w:pict w14:anchorId="659CAB45">
           <v:shape id="_x0000_i1029" type="#_x0000_t75" alt="Microsoft Office Signature Line..." style="width:192pt;height:96pt">
-            <v:imagedata r:id="rId11" o:title=""/>
+            <v:imagedata r:id="rId12" o:title=""/>
             <o:lock v:ext="edit" ungrouping="t" rotation="t" cropping="t" verticies="t" text="t" grouping="t"/>
             <o:signatureline v:ext="edit" id="{28339033-8C39-4735-ACC2-D8807DFF0DD9}" provid="{00000000-0000-0000-0000-000000000000}" o:suggestedsigner="FirstName LastName" o:suggestedsigner2="Program Manager" o:suggestedsigneremail="Email" issignatureline="t"/>
           </v:shape>
@@ -6971,7 +6599,7 @@
       <w:r>
         <w:pict w14:anchorId="6F72759C">
           <v:shape id="_x0000_i1030" type="#_x0000_t75" alt="Microsoft Office Signature Line..." style="width:192pt;height:96pt">
-            <v:imagedata r:id="rId11" o:title=""/>
+            <v:imagedata r:id="rId13" o:title=""/>
             <o:lock v:ext="edit" ungrouping="t" rotation="t" cropping="t" verticies="t" text="t" grouping="t"/>
             <o:signatureline v:ext="edit" id="{78E9923A-2250-41BC-9212-73A6B8F35EFC}" provid="{00000000-0000-0000-0000-000000000000}" o:suggestedsigner="FirstName LastName" o:suggestedsigner2="Program Manager" o:suggestedsigneremail="Email" issignatureline="t"/>
           </v:shape>
@@ -6990,7 +6618,7 @@
       <w:r>
         <w:pict w14:anchorId="261B6BC8">
           <v:shape id="_x0000_i1031" type="#_x0000_t75" alt="Microsoft Office Signature Line..." style="width:192pt;height:96pt">
-            <v:imagedata r:id="rId11" o:title=""/>
+            <v:imagedata r:id="rId13" o:title=""/>
             <o:lock v:ext="edit" ungrouping="t" rotation="t" cropping="t" verticies="t" text="t" grouping="t"/>
             <o:signatureline v:ext="edit" id="{A6CECDB8-5BFD-4C06-9C95-4A9E30C691EB}" provid="{00000000-0000-0000-0000-000000000000}" o:suggestedsigner="FirstName LastName" o:suggestedsigner2="Program Manager" o:suggestedsigneremail="Email" issignatureline="t"/>
           </v:shape>
@@ -7008,7 +6636,7 @@
       <w:r>
         <w:pict w14:anchorId="50CDE46C">
           <v:shape id="_x0000_i1032" type="#_x0000_t75" alt="Microsoft Office Signature Line..." style="width:192pt;height:96pt">
-            <v:imagedata r:id="rId11" o:title=""/>
+            <v:imagedata r:id="rId14" o:title=""/>
             <o:lock v:ext="edit" ungrouping="t" rotation="t" cropping="t" verticies="t" text="t" grouping="t"/>
             <o:signatureline v:ext="edit" id="{738798CE-9880-4897-9C74-5D50139E818C}" provid="{00000000-0000-0000-0000-000000000000}" o:suggestedsigner="FirstName LastName" o:suggestedsigner2="Program Manager" o:suggestedsigneremail="Email" issignatureline="t"/>
           </v:shape>
@@ -7041,18 +6669,26 @@
     </w:p>
     <w:p>
       <w:r>
-        <w:t>{#Info.</w:t>
+        <w:t>{#</w:t>
+      </w:r>
+      <w:proofErr w:type="gramStart"/>
+      <w:r>
+        <w:t>Info.</w:t>
       </w:r>
       <w:r>
         <w:t>TechOrderManagers</w:t>
       </w:r>
       <w:r>
-        <w:t>.length &gt;=1}</w:t>
+        <w:t>.length</w:t>
+      </w:r>
+      <w:proofErr w:type="gramEnd"/>
+      <w:r>
+        <w:t xml:space="preserve"> &gt;=1}</w:t>
       </w:r>
       <w:r>
         <w:pict w14:anchorId="0EB326D8">
           <v:shape id="_x0000_i1033" type="#_x0000_t75" alt="Microsoft Office Signature Line..." style="width:192pt;height:96pt">
-            <v:imagedata r:id="rId12" o:title=""/>
+            <v:imagedata r:id="rId15" o:title=""/>
             <o:lock v:ext="edit" ungrouping="t" rotation="t" cropping="t" verticies="t" text="t" grouping="t"/>
             <o:signatureline v:ext="edit" id="{F0D72538-6F55-4837-920F-9520253F9B5F}" provid="{00000000-0000-0000-0000-000000000000}" o:suggestedsigner="TO FirstName LastName" o:suggestedsigner2="Technical Order Manager" o:suggestedsigneremail="TO Email" issignatureline="t"/>
           </v:shape>
@@ -7067,7 +6703,7 @@
       <w:r>
         <w:pict w14:anchorId="3C8CAD91">
           <v:shape id="_x0000_i1034" type="#_x0000_t75" alt="Microsoft Office Signature Line..." style="width:192pt;height:96pt">
-            <v:imagedata r:id="rId12" o:title=""/>
+            <v:imagedata r:id="rId16" o:title=""/>
             <o:lock v:ext="edit" ungrouping="t" rotation="t" cropping="t" verticies="t" text="t" grouping="t"/>
             <o:signatureline v:ext="edit" id="{8664F99E-BCC5-41F2-8956-EB21F8C91E79}" provid="{00000000-0000-0000-0000-000000000000}" o:suggestedsigner="TO FirstName LastName" o:suggestedsigner2="Technical Order Manager" o:suggestedsigneremail="TO Email" issignatureline="t"/>
           </v:shape>
@@ -7079,7 +6715,7 @@
       <w:r>
         <w:pict w14:anchorId="1073A289">
           <v:shape id="_x0000_i1035" type="#_x0000_t75" alt="Microsoft Office Signature Line..." style="width:192pt;height:96pt">
-            <v:imagedata r:id="rId12" o:title=""/>
+            <v:imagedata r:id="rId17" o:title=""/>
             <o:lock v:ext="edit" ungrouping="t" rotation="t" cropping="t" verticies="t" text="t" grouping="t"/>
             <o:signatureline v:ext="edit" id="{FEB257D3-9AC1-49DF-930B-18FDA7B7B0C5}" provid="{00000000-0000-0000-0000-000000000000}" o:suggestedsigner="TO FirstName LastName" o:suggestedsigner2="Technical Order Manager" o:suggestedsigneremail="TO Email" issignatureline="t"/>
           </v:shape>
@@ -7091,12 +6727,20 @@
     </w:p>
     <w:p>
       <w:r>
-        <w:t xml:space="preserve">  {#Info.TechOrderManagers.length &gt;=4}</w:t>
+        <w:t xml:space="preserve">  {#</w:t>
+      </w:r>
+      <w:proofErr w:type="gramStart"/>
+      <w:r>
+        <w:t>Info.TechOrderManagers.length</w:t>
+      </w:r>
+      <w:proofErr w:type="gramEnd"/>
+      <w:r>
+        <w:t xml:space="preserve"> &gt;=4}</w:t>
       </w:r>
       <w:r>
         <w:pict w14:anchorId="0D79D61D">
           <v:shape id="_x0000_i1036" type="#_x0000_t75" alt="Microsoft Office Signature Line..." style="width:192pt;height:96pt">
-            <v:imagedata r:id="rId12" o:title=""/>
+            <v:imagedata r:id="rId17" o:title=""/>
             <o:lock v:ext="edit" ungrouping="t" rotation="t" cropping="t" verticies="t" text="t" grouping="t"/>
             <o:signatureline v:ext="edit" id="{6C4D4D72-FD9C-4DBE-AF52-7CF8E787BE36}" provid="{00000000-0000-0000-0000-000000000000}" o:suggestedsigner="TO FirstName LastName" o:suggestedsigner2="Technical Order Manager" o:suggestedsigneremail="TO Email" issignatureline="t"/>
           </v:shape>
@@ -7109,12 +6753,20 @@
     <w:p>
       <w:r>
         <w:lastRenderedPageBreak/>
-        <w:t xml:space="preserve">  {#Info.TechOrderManagers.length &gt;=5}</w:t>
+        <w:t xml:space="preserve">  {#</w:t>
+      </w:r>
+      <w:proofErr w:type="gramStart"/>
+      <w:r>
+        <w:t>Info.TechOrderManagers.length</w:t>
+      </w:r>
+      <w:proofErr w:type="gramEnd"/>
+      <w:r>
+        <w:t xml:space="preserve"> &gt;=5}</w:t>
       </w:r>
       <w:r>
         <w:pict w14:anchorId="289F72EC">
           <v:shape id="_x0000_i1037" type="#_x0000_t75" alt="Microsoft Office Signature Line..." style="width:192pt;height:96pt">
-            <v:imagedata r:id="rId12" o:title=""/>
+            <v:imagedata r:id="rId18" o:title=""/>
             <o:lock v:ext="edit" ungrouping="t" rotation="t" cropping="t" verticies="t" text="t" grouping="t"/>
             <o:signatureline v:ext="edit" id="{01218CBD-1AC9-4D24-91F0-21C1AAD49B2A}" provid="{00000000-0000-0000-0000-000000000000}" o:suggestedsigner="TO FirstName LastName" o:suggestedsigner2="Technical Order Manager" o:suggestedsigneremail="TO Email" issignatureline="t"/>
           </v:shape>
@@ -7126,12 +6778,20 @@
     </w:p>
     <w:p>
       <w:r>
-        <w:t xml:space="preserve">  {#Info.TechOrderManagers.length &gt;=6}</w:t>
+        <w:t xml:space="preserve">  {#</w:t>
+      </w:r>
+      <w:proofErr w:type="gramStart"/>
+      <w:r>
+        <w:t>Info.TechOrderManagers.length</w:t>
+      </w:r>
+      <w:proofErr w:type="gramEnd"/>
+      <w:r>
+        <w:t xml:space="preserve"> &gt;=6}</w:t>
       </w:r>
       <w:r>
         <w:pict w14:anchorId="48EA1299">
           <v:shape id="_x0000_i1038" type="#_x0000_t75" alt="Microsoft Office Signature Line..." style="width:192pt;height:96pt">
-            <v:imagedata r:id="rId12" o:title=""/>
+            <v:imagedata r:id="rId19" o:title=""/>
             <o:lock v:ext="edit" ungrouping="t" rotation="t" cropping="t" verticies="t" text="t" grouping="t"/>
             <o:signatureline v:ext="edit" id="{FCBE8BA4-D3AD-4BC3-8449-72C754272415}" provid="{00000000-0000-0000-0000-000000000000}" o:suggestedsigner="TO FirstName LastName" o:suggestedsigner2="Technical Order Manager" o:suggestedsigneremail="TO Email" issignatureline="t"/>
           </v:shape>
@@ -7143,12 +6803,20 @@
     </w:p>
     <w:p>
       <w:r>
-        <w:t xml:space="preserve">  {#Info.TechOrderManagers.length &gt;=7}</w:t>
+        <w:t xml:space="preserve">  {#</w:t>
+      </w:r>
+      <w:proofErr w:type="gramStart"/>
+      <w:r>
+        <w:t>Info.TechOrderManagers.length</w:t>
+      </w:r>
+      <w:proofErr w:type="gramEnd"/>
+      <w:r>
+        <w:t xml:space="preserve"> &gt;=7}</w:t>
       </w:r>
       <w:r>
         <w:pict w14:anchorId="45399C94">
           <v:shape id="_x0000_i1039" type="#_x0000_t75" alt="Microsoft Office Signature Line..." style="width:192pt;height:96pt">
-            <v:imagedata r:id="rId12" o:title=""/>
+            <v:imagedata r:id="rId17" o:title=""/>
             <o:lock v:ext="edit" ungrouping="t" rotation="t" cropping="t" verticies="t" text="t" grouping="t"/>
             <o:signatureline v:ext="edit" id="{12E432A9-E904-404C-BBD0-AF8260FD6E04}" provid="{00000000-0000-0000-0000-000000000000}" o:suggestedsigner="TO FirstName LastName" o:suggestedsigner2="Technical Order Manager" o:suggestedsigneremail="TO Email" issignatureline="t"/>
           </v:shape>
@@ -7160,12 +6828,20 @@
     </w:p>
     <w:p>
       <w:r>
-        <w:t xml:space="preserve">  {#Info.TechOrderManagers.length &gt;=8}</w:t>
+        <w:t xml:space="preserve">  {#</w:t>
+      </w:r>
+      <w:proofErr w:type="gramStart"/>
+      <w:r>
+        <w:t>Info.TechOrderManagers.length</w:t>
+      </w:r>
+      <w:proofErr w:type="gramEnd"/>
+      <w:r>
+        <w:t xml:space="preserve"> &gt;=8}</w:t>
       </w:r>
       <w:r>
         <w:pict w14:anchorId="6DF92DE1">
           <v:shape id="_x0000_i1040" type="#_x0000_t75" alt="Microsoft Office Signature Line..." style="width:192pt;height:96pt">
-            <v:imagedata r:id="rId12" o:title=""/>
+            <v:imagedata r:id="rId17" o:title=""/>
             <o:lock v:ext="edit" ungrouping="t" rotation="t" cropping="t" verticies="t" text="t" grouping="t"/>
             <o:signatureline v:ext="edit" id="{00F933D7-8294-4244-95B5-379E40936944}" provid="{00000000-0000-0000-0000-000000000000}" o:suggestedsigner="TO FirstName LastName" o:suggestedsigner2="Technical Order Manager" o:suggestedsigneremail="TO Email" issignatureline="t"/>
           </v:shape>
@@ -7177,7 +6853,7 @@
     </w:p>
     <w:p/>
     <w:sectPr>
-      <w:footerReference w:type="default" r:id="rId13"/>
+      <w:footerReference w:type="default" r:id="rId20"/>
       <w:pgSz w:w="12240" w:h="15840"/>
       <w:pgMar w:top="1440" w:right="1440" w:bottom="1440" w:left="1440" w:header="720" w:footer="720" w:gutter="0"/>
       <w:cols w:space="720"/>
@@ -12716,19 +12392,12 @@
 </file>
 
 <file path=customXml/item1.xml><?xml version="1.0" encoding="utf-8"?>
-<b:Sources xmlns:b="http://schemas.openxmlformats.org/officeDocument/2006/bibliography" xmlns="http://schemas.openxmlformats.org/officeDocument/2006/bibliography" SelectedStyle="\APA.XSL" StyleName="APA"/>
+<p:properties xmlns:p="http://schemas.microsoft.com/office/2006/metadata/properties" xmlns:xsi="http://www.w3.org/2001/XMLSchema-instance">
+  <documentManagement/>
+</p:properties>
 </file>
 
 <file path=customXml/item2.xml><?xml version="1.0" encoding="utf-8"?>
-<?mso-contentType ?>
-<FormTemplates xmlns="http://schemas.microsoft.com/sharepoint/v3/contenttype/forms">
-  <Display>DocumentLibraryForm</Display>
-  <Edit>DocumentLibraryForm</Edit>
-  <New>DocumentLibraryForm</New>
-</FormTemplates>
-</file>
-
-<file path=customXml/item3.xml><?xml version="1.0" encoding="utf-8"?>
 <ct:contentTypeSchema xmlns:ct="http://schemas.microsoft.com/office/2006/metadata/contentType" xmlns:ma="http://schemas.microsoft.com/office/2006/metadata/properties/metaAttributes" ct:_="" ma:_="" ma:contentTypeName="Document" ma:contentTypeID="0x010100A253B644FCFAD7409EBAFCD290AA2418" ma:contentTypeVersion="8" ma:contentTypeDescription="Create a new document." ma:contentTypeScope="" ma:versionID="5be701be97b5a7d030840f97951bd63f">
   <xsd:schema xmlns:xsd="http://www.w3.org/2001/XMLSchema" xmlns:xs="http://www.w3.org/2001/XMLSchema" xmlns:p="http://schemas.microsoft.com/office/2006/metadata/properties" xmlns:ns2="92ee4270-9d09-435c-8163-9480e84d542c" targetNamespace="http://schemas.microsoft.com/office/2006/metadata/properties" ma:root="true" ma:fieldsID="e754431ea33e719513553115a5b5b6cf" ns2:_="">
     <xsd:import namespace="92ee4270-9d09-435c-8163-9480e84d542c"/>
@@ -12896,29 +12565,28 @@
 </ct:contentTypeSchema>
 </file>
 
+<file path=customXml/item3.xml><?xml version="1.0" encoding="utf-8"?>
+<?mso-contentType ?>
+<FormTemplates xmlns="http://schemas.microsoft.com/sharepoint/v3/contenttype/forms">
+  <Display>DocumentLibraryForm</Display>
+  <Edit>DocumentLibraryForm</Edit>
+  <New>DocumentLibraryForm</New>
+</FormTemplates>
+</file>
+
 <file path=customXml/item4.xml><?xml version="1.0" encoding="utf-8"?>
-<p:properties xmlns:p="http://schemas.microsoft.com/office/2006/metadata/properties" xmlns:xsi="http://www.w3.org/2001/XMLSchema-instance">
-  <documentManagement/>
-</p:properties>
+<b:Sources xmlns:b="http://schemas.openxmlformats.org/officeDocument/2006/bibliography" xmlns="http://schemas.openxmlformats.org/officeDocument/2006/bibliography" SelectedStyle="\APA.XSL" StyleName="APA"/>
 </file>
 
 <file path=customXml/itemProps1.xml><?xml version="1.0" encoding="utf-8"?>
-<ds:datastoreItem xmlns:ds="http://schemas.openxmlformats.org/officeDocument/2006/customXml" ds:itemID="{A976FBD8-E2B1-46C0-ACBB-B920108BE5B2}">
+<ds:datastoreItem xmlns:ds="http://schemas.openxmlformats.org/officeDocument/2006/customXml" ds:itemID="{F19E182A-E278-49AC-A58D-A3181FBB2975}">
   <ds:schemaRefs>
-    <ds:schemaRef ds:uri="http://schemas.openxmlformats.org/officeDocument/2006/bibliography"/>
+    <ds:schemaRef ds:uri="http://schemas.microsoft.com/office/2006/metadata/properties"/>
   </ds:schemaRefs>
 </ds:datastoreItem>
 </file>
 
 <file path=customXml/itemProps2.xml><?xml version="1.0" encoding="utf-8"?>
-<ds:datastoreItem xmlns:ds="http://schemas.openxmlformats.org/officeDocument/2006/customXml" ds:itemID="{ABE91D9D-E230-4D73-BAA6-EE83D801CFC1}">
-  <ds:schemaRefs>
-    <ds:schemaRef ds:uri="http://schemas.microsoft.com/sharepoint/v3/contenttype/forms"/>
-  </ds:schemaRefs>
-</ds:datastoreItem>
-</file>
-
-<file path=customXml/itemProps3.xml><?xml version="1.0" encoding="utf-8"?>
 <ds:datastoreItem xmlns:ds="http://schemas.openxmlformats.org/officeDocument/2006/customXml" ds:itemID="{604E41F5-B545-4AA3-AFA7-16798CC9766F}">
   <ds:schemaRefs>
     <ds:schemaRef ds:uri="http://schemas.microsoft.com/office/2006/metadata/contentType"/>
@@ -12936,10 +12604,18 @@
 </ds:datastoreItem>
 </file>
 
+<file path=customXml/itemProps3.xml><?xml version="1.0" encoding="utf-8"?>
+<ds:datastoreItem xmlns:ds="http://schemas.openxmlformats.org/officeDocument/2006/customXml" ds:itemID="{ABE91D9D-E230-4D73-BAA6-EE83D801CFC1}">
+  <ds:schemaRefs>
+    <ds:schemaRef ds:uri="http://schemas.microsoft.com/sharepoint/v3/contenttype/forms"/>
+  </ds:schemaRefs>
+</ds:datastoreItem>
+</file>
+
 <file path=customXml/itemProps4.xml><?xml version="1.0" encoding="utf-8"?>
-<ds:datastoreItem xmlns:ds="http://schemas.openxmlformats.org/officeDocument/2006/customXml" ds:itemID="{F19E182A-E278-49AC-A58D-A3181FBB2975}">
+<ds:datastoreItem xmlns:ds="http://schemas.openxmlformats.org/officeDocument/2006/customXml" ds:itemID="{A976FBD8-E2B1-46C0-ACBB-B920108BE5B2}">
   <ds:schemaRefs>
-    <ds:schemaRef ds:uri="http://schemas.microsoft.com/office/2006/metadata/properties"/>
+    <ds:schemaRef ds:uri="http://schemas.openxmlformats.org/officeDocument/2006/bibliography"/>
   </ds:schemaRefs>
 </ds:datastoreItem>
 </file>

</xml_diff>

<commit_message>
Catch word doc up to UAT and update word doc handling of CTR
</commit_message>
<xml_diff>
--- a/public/CAFTOP_Template.docx
+++ b/public/CAFTOP_Template.docx
@@ -2,801 +2,636 @@
 <file path=word/document.xml><?xml version="1.0" encoding="utf-8"?>
 <w:document xmlns:wpc="http://schemas.microsoft.com/office/word/2010/wordprocessingCanvas" xmlns:cx="http://schemas.microsoft.com/office/drawing/2014/chartex" xmlns:cx1="http://schemas.microsoft.com/office/drawing/2015/9/8/chartex" xmlns:cx2="http://schemas.microsoft.com/office/drawing/2015/10/21/chartex" xmlns:cx3="http://schemas.microsoft.com/office/drawing/2016/5/9/chartex" xmlns:cx4="http://schemas.microsoft.com/office/drawing/2016/5/10/chartex" xmlns:cx5="http://schemas.microsoft.com/office/drawing/2016/5/11/chartex" xmlns:cx6="http://schemas.microsoft.com/office/drawing/2016/5/12/chartex" xmlns:cx7="http://schemas.microsoft.com/office/drawing/2016/5/13/chartex" xmlns:cx8="http://schemas.microsoft.com/office/drawing/2016/5/14/chartex" xmlns:mc="http://schemas.openxmlformats.org/markup-compatibility/2006" xmlns:aink="http://schemas.microsoft.com/office/drawing/2016/ink" xmlns:am3d="http://schemas.microsoft.com/office/drawing/2017/model3d" xmlns:o="urn:schemas-microsoft-com:office:office" xmlns:oel="http://schemas.microsoft.com/office/2019/extlst" xmlns:r="http://schemas.openxmlformats.org/officeDocument/2006/relationships" xmlns:m="http://schemas.openxmlformats.org/officeDocument/2006/math" xmlns:v="urn:schemas-microsoft-com:vml" xmlns:wp14="http://schemas.microsoft.com/office/word/2010/wordprocessingDrawing" xmlns:wp="http://schemas.openxmlformats.org/drawingml/2006/wordprocessingDrawing" xmlns:w10="urn:schemas-microsoft-com:office:word" xmlns:w="http://schemas.openxmlformats.org/wordprocessingml/2006/main" xmlns:w14="http://schemas.microsoft.com/office/word/2010/wordml" xmlns:w15="http://schemas.microsoft.com/office/word/2012/wordml" xmlns:w16cex="http://schemas.microsoft.com/office/word/2018/wordml/cex" xmlns:w16cid="http://schemas.microsoft.com/office/word/2016/wordml/cid" xmlns:w16="http://schemas.microsoft.com/office/word/2018/wordml" xmlns:w16sdtdh="http://schemas.microsoft.com/office/word/2020/wordml/sdtdatahash" xmlns:w16se="http://schemas.microsoft.com/office/word/2015/wordml/symex" xmlns:wpg="http://schemas.microsoft.com/office/word/2010/wordprocessingGroup" xmlns:wpi="http://schemas.microsoft.com/office/word/2010/wordprocessingInk" xmlns:wne="http://schemas.microsoft.com/office/word/2006/wordml" xmlns:wps="http://schemas.microsoft.com/office/word/2010/wordprocessingShape" mc:Ignorable="w14 w15 w16se w16cid w16 w16cex w16sdtdh wp14">
   <w:body>
-    <w:tbl>
-      <w:tblPr>
-        <w:tblW w:w="5000" w:type="pct"/>
+    <w:p>
+      <w:pPr>
+        <w:pStyle w:val="NoSpacing"/>
         <w:jc w:val="center"/>
-        <w:tblLook w:val="04A0" w:firstRow="1" w:lastRow="0" w:firstColumn="1" w:lastColumn="0" w:noHBand="0" w:noVBand="1"/>
-      </w:tblPr>
-      <w:tblGrid>
-        <w:gridCol w:w="9360"/>
-      </w:tblGrid>
-      <w:tr>
-        <w:trPr>
-          <w:trHeight w:val="1440"/>
-          <w:jc w:val="center"/>
-        </w:trPr>
-        <w:tc>
-          <w:tcPr>
-            <w:tcW w:w="5000" w:type="pct"/>
-            <w:vAlign w:val="center"/>
-          </w:tcPr>
-          <w:p>
-            <w:pPr>
-              <w:pStyle w:val="NoSpacing"/>
-              <w:jc w:val="center"/>
-              <w:rPr>
-                <w:rFonts w:ascii="Times New Roman" w:eastAsiaTheme="majorEastAsia" w:hAnsi="Times New Roman"/>
-                <w:b/>
-                <w:sz w:val="44"/>
-                <w:szCs w:val="44"/>
-              </w:rPr>
-            </w:pPr>
-            <w:r>
-              <w:rPr>
-                <w:rFonts w:ascii="Times New Roman" w:eastAsiaTheme="majorEastAsia" w:hAnsi="Times New Roman"/>
-                <w:b/>
-                <w:sz w:val="44"/>
-                <w:szCs w:val="44"/>
-              </w:rPr>
-              <w:t>Technical Order</w:t>
-            </w:r>
-            <w:r>
-              <w:rPr>
-                <w:rFonts w:ascii="Times New Roman" w:eastAsiaTheme="majorEastAsia" w:hAnsi="Times New Roman"/>
-                <w:b/>
-                <w:sz w:val="44"/>
-                <w:szCs w:val="44"/>
-              </w:rPr>
-              <w:t xml:space="preserve"> </w:t>
-            </w:r>
-            <w:r>
-              <w:rPr>
-                <w:rFonts w:ascii="Times New Roman" w:eastAsiaTheme="majorEastAsia" w:hAnsi="Times New Roman"/>
-                <w:b/>
-                <w:sz w:val="44"/>
-                <w:szCs w:val="44"/>
-              </w:rPr>
-              <w:t>Requirements Narrative</w:t>
-            </w:r>
-          </w:p>
-          <w:p>
-            <w:pPr>
-              <w:pStyle w:val="NoSpacing"/>
-              <w:jc w:val="center"/>
-              <w:rPr>
-                <w:rFonts w:ascii="Times New Roman" w:eastAsiaTheme="majorEastAsia" w:hAnsi="Times New Roman"/>
-                <w:b/>
-                <w:sz w:val="44"/>
-                <w:szCs w:val="44"/>
-              </w:rPr>
-            </w:pPr>
-          </w:p>
-          <w:p>
-            <w:pPr>
-              <w:pStyle w:val="NoSpacing"/>
-              <w:jc w:val="center"/>
-              <w:rPr>
-                <w:rFonts w:ascii="Times New Roman" w:eastAsiaTheme="majorEastAsia" w:hAnsi="Times New Roman"/>
-                <w:sz w:val="28"/>
-                <w:szCs w:val="28"/>
-              </w:rPr>
-            </w:pPr>
-          </w:p>
-          <w:p>
-            <w:pPr>
-              <w:pStyle w:val="NoSpacing"/>
-              <w:jc w:val="center"/>
-              <w:rPr>
-                <w:rFonts w:ascii="Times New Roman" w:eastAsiaTheme="majorEastAsia" w:hAnsi="Times New Roman"/>
-                <w:sz w:val="28"/>
-                <w:szCs w:val="28"/>
-              </w:rPr>
-            </w:pPr>
-          </w:p>
-          <w:p>
-            <w:pPr>
-              <w:pStyle w:val="NoSpacing"/>
-              <w:jc w:val="center"/>
-              <w:rPr>
-                <w:rFonts w:ascii="Times New Roman" w:eastAsiaTheme="majorEastAsia" w:hAnsi="Times New Roman"/>
-                <w:sz w:val="56"/>
-                <w:szCs w:val="56"/>
-              </w:rPr>
-            </w:pPr>
-            <w:r>
-              <w:rPr>
-                <w:rFonts w:ascii="Times New Roman" w:eastAsiaTheme="majorEastAsia" w:hAnsi="Times New Roman"/>
-                <w:sz w:val="28"/>
-                <w:szCs w:val="28"/>
-              </w:rPr>
-              <w:t xml:space="preserve">Program </w:t>
-            </w:r>
-            <w:r>
-              <w:rPr>
-                <w:rFonts w:ascii="Times New Roman" w:eastAsiaTheme="majorEastAsia" w:hAnsi="Times New Roman"/>
-                <w:sz w:val="28"/>
-                <w:szCs w:val="28"/>
-              </w:rPr>
-              <w:t>Group:</w:t>
-            </w:r>
-            <w:r>
-              <w:rPr>
-                <w:rFonts w:ascii="Times New Roman" w:eastAsiaTheme="majorEastAsia" w:hAnsi="Times New Roman"/>
-                <w:sz w:val="44"/>
-                <w:szCs w:val="44"/>
-              </w:rPr>
-              <w:t xml:space="preserve"> </w:t>
-            </w:r>
-            <w:r>
-              <w:rPr>
-                <w:rFonts w:ascii="Times New Roman" w:eastAsiaTheme="majorEastAsia" w:hAnsi="Times New Roman"/>
-                <w:sz w:val="32"/>
-                <w:szCs w:val="32"/>
-              </w:rPr>
-              <w:t>{</w:t>
-            </w:r>
-            <w:r>
-              <w:rPr>
-                <w:rFonts w:ascii="Times New Roman" w:eastAsiaTheme="majorEastAsia" w:hAnsi="Times New Roman"/>
-                <w:sz w:val="32"/>
-                <w:szCs w:val="32"/>
-              </w:rPr>
-              <w:t>Info.</w:t>
-            </w:r>
-            <w:r>
-              <w:rPr>
-                <w:rFonts w:ascii="Times New Roman" w:eastAsiaTheme="majorEastAsia" w:hAnsi="Times New Roman"/>
-                <w:sz w:val="32"/>
-                <w:szCs w:val="32"/>
-              </w:rPr>
-              <w:t>ProgramGroup}</w:t>
-            </w:r>
-          </w:p>
-          <w:p>
-            <w:pPr>
-              <w:pStyle w:val="NoSpacing"/>
-              <w:jc w:val="center"/>
-              <w:rPr>
-                <w:rFonts w:ascii="Times New Roman" w:eastAsiaTheme="majorEastAsia" w:hAnsi="Times New Roman"/>
-                <w:sz w:val="32"/>
-                <w:szCs w:val="32"/>
-              </w:rPr>
-            </w:pPr>
-            <w:r>
-              <w:rPr>
-                <w:rFonts w:ascii="Times New Roman" w:eastAsiaTheme="majorEastAsia" w:hAnsi="Times New Roman"/>
-                <w:sz w:val="28"/>
-                <w:szCs w:val="28"/>
-              </w:rPr>
-              <w:t>Program</w:t>
-            </w:r>
-            <w:r>
-              <w:rPr>
-                <w:rFonts w:ascii="Times New Roman" w:eastAsiaTheme="majorEastAsia" w:hAnsi="Times New Roman"/>
-                <w:sz w:val="28"/>
-                <w:szCs w:val="28"/>
-              </w:rPr>
-              <w:t xml:space="preserve"> Name</w:t>
-            </w:r>
-            <w:r>
-              <w:rPr>
-                <w:rFonts w:ascii="Times New Roman" w:eastAsiaTheme="majorEastAsia" w:hAnsi="Times New Roman"/>
-                <w:sz w:val="28"/>
-                <w:szCs w:val="28"/>
-              </w:rPr>
-              <w:t>:</w:t>
-            </w:r>
-            <w:r>
-              <w:rPr>
-                <w:rFonts w:ascii="Times New Roman" w:eastAsiaTheme="majorEastAsia" w:hAnsi="Times New Roman"/>
-                <w:sz w:val="32"/>
-                <w:szCs w:val="32"/>
-              </w:rPr>
-              <w:t xml:space="preserve"> </w:t>
-            </w:r>
-            <w:r>
-              <w:rPr>
-                <w:rFonts w:ascii="Times New Roman" w:eastAsiaTheme="majorEastAsia" w:hAnsi="Times New Roman"/>
-                <w:sz w:val="32"/>
-                <w:szCs w:val="32"/>
-              </w:rPr>
-              <w:t>{Info.ProgramName}</w:t>
-            </w:r>
-          </w:p>
-          <w:p>
-            <w:pPr>
-              <w:pStyle w:val="NoSpacing"/>
-              <w:jc w:val="center"/>
-              <w:rPr>
-                <w:rFonts w:ascii="Times New Roman" w:eastAsiaTheme="majorEastAsia" w:hAnsi="Times New Roman"/>
-                <w:sz w:val="32"/>
-                <w:szCs w:val="32"/>
-              </w:rPr>
-            </w:pPr>
-            <w:r>
-              <w:rPr>
-                <w:rFonts w:ascii="Times New Roman" w:eastAsiaTheme="majorEastAsia" w:hAnsi="Times New Roman"/>
-                <w:sz w:val="28"/>
-                <w:szCs w:val="28"/>
-              </w:rPr>
-              <w:t>Program Element Code:</w:t>
-            </w:r>
-            <w:r>
-              <w:rPr>
-                <w:rFonts w:ascii="Times New Roman" w:eastAsiaTheme="majorEastAsia" w:hAnsi="Times New Roman"/>
-                <w:sz w:val="32"/>
-                <w:szCs w:val="32"/>
-              </w:rPr>
-              <w:t xml:space="preserve"> </w:t>
-            </w:r>
-            <w:r>
-              <w:rPr>
-                <w:rFonts w:ascii="Times New Roman" w:eastAsiaTheme="majorEastAsia" w:hAnsi="Times New Roman"/>
-                <w:sz w:val="32"/>
-                <w:szCs w:val="32"/>
-              </w:rPr>
-              <w:t>{</w:t>
-            </w:r>
-            <w:r>
-              <w:rPr>
-                <w:rFonts w:ascii="Times New Roman" w:eastAsiaTheme="majorEastAsia" w:hAnsi="Times New Roman"/>
-                <w:sz w:val="32"/>
-                <w:szCs w:val="32"/>
-              </w:rPr>
-              <w:t>Info.</w:t>
-            </w:r>
-            <w:r>
-              <w:rPr>
-                <w:rFonts w:ascii="Times New Roman" w:eastAsiaTheme="majorEastAsia" w:hAnsi="Times New Roman"/>
-                <w:sz w:val="32"/>
-                <w:szCs w:val="32"/>
-              </w:rPr>
-              <w:t>ProgramElementCode}</w:t>
-            </w:r>
-            <w:r>
-              <w:rPr>
-                <w:rFonts w:ascii="Times New Roman" w:eastAsiaTheme="majorEastAsia" w:hAnsi="Times New Roman"/>
-                <w:sz w:val="32"/>
-                <w:szCs w:val="32"/>
-              </w:rPr>
-              <w:t xml:space="preserve"> </w:t>
-            </w:r>
-          </w:p>
-          <w:p>
-            <w:pPr>
-              <w:pStyle w:val="NoSpacing"/>
-              <w:jc w:val="center"/>
-              <w:rPr>
-                <w:rFonts w:ascii="Times New Roman" w:eastAsiaTheme="majorEastAsia" w:hAnsi="Times New Roman"/>
-                <w:b/>
-                <w:sz w:val="56"/>
-                <w:szCs w:val="56"/>
-              </w:rPr>
-            </w:pPr>
-          </w:p>
-          <w:p>
-            <w:pPr>
-              <w:pStyle w:val="NoSpacing"/>
-              <w:jc w:val="center"/>
-              <w:rPr>
-                <w:rFonts w:ascii="Times New Roman" w:eastAsiaTheme="majorEastAsia" w:hAnsi="Times New Roman"/>
-                <w:sz w:val="32"/>
-                <w:szCs w:val="32"/>
-              </w:rPr>
-            </w:pPr>
-          </w:p>
-          <w:p>
-            <w:pPr>
-              <w:pStyle w:val="NoSpacing"/>
-              <w:jc w:val="center"/>
-              <w:rPr>
-                <w:rFonts w:ascii="Times New Roman" w:eastAsiaTheme="majorEastAsia" w:hAnsi="Times New Roman"/>
-                <w:sz w:val="32"/>
-                <w:szCs w:val="32"/>
-              </w:rPr>
-            </w:pPr>
-          </w:p>
-          <w:p>
-            <w:pPr>
-              <w:pStyle w:val="NoSpacing"/>
-              <w:jc w:val="center"/>
-              <w:rPr>
-                <w:rFonts w:ascii="Times New Roman" w:eastAsiaTheme="majorEastAsia" w:hAnsi="Times New Roman"/>
-                <w:sz w:val="32"/>
-                <w:szCs w:val="32"/>
-              </w:rPr>
-            </w:pPr>
-          </w:p>
-          <w:p>
-            <w:pPr>
-              <w:pStyle w:val="NoSpacing"/>
-              <w:jc w:val="center"/>
-              <w:rPr>
-                <w:rFonts w:ascii="Times New Roman" w:eastAsiaTheme="majorEastAsia" w:hAnsi="Times New Roman"/>
-                <w:sz w:val="32"/>
-                <w:szCs w:val="32"/>
-              </w:rPr>
-            </w:pPr>
-            <w:r>
-              <w:rPr>
-                <w:rFonts w:ascii="Times New Roman" w:eastAsiaTheme="majorEastAsia" w:hAnsi="Times New Roman"/>
-                <w:sz w:val="32"/>
-                <w:szCs w:val="32"/>
-              </w:rPr>
-              <w:t>{Created}</w:t>
-            </w:r>
-          </w:p>
-        </w:tc>
-      </w:tr>
-      <w:tr>
-        <w:trPr>
-          <w:trHeight w:val="720"/>
-          <w:jc w:val="center"/>
-        </w:trPr>
-        <w:tc>
-          <w:tcPr>
-            <w:tcW w:w="5000" w:type="pct"/>
-            <w:vAlign w:val="center"/>
-          </w:tcPr>
-          <w:p>
-            <w:pPr>
-              <w:pStyle w:val="NoSpacing"/>
-              <w:jc w:val="center"/>
-              <w:rPr>
-                <w:rFonts w:ascii="Times New Roman" w:eastAsiaTheme="majorEastAsia" w:hAnsi="Times New Roman"/>
-                <w:sz w:val="56"/>
-                <w:szCs w:val="56"/>
-              </w:rPr>
-            </w:pPr>
-          </w:p>
-          <w:p>
-            <w:pPr>
-              <w:pStyle w:val="NoSpacing"/>
-              <w:jc w:val="center"/>
-              <w:rPr>
-                <w:rFonts w:ascii="Times New Roman" w:eastAsiaTheme="majorEastAsia" w:hAnsi="Times New Roman"/>
-                <w:sz w:val="56"/>
-                <w:szCs w:val="56"/>
-              </w:rPr>
-            </w:pPr>
-          </w:p>
-          <w:p>
-            <w:pPr>
-              <w:pStyle w:val="NoSpacing"/>
-              <w:jc w:val="center"/>
-              <w:rPr>
-                <w:rFonts w:ascii="Times New Roman" w:eastAsiaTheme="majorEastAsia" w:hAnsi="Times New Roman"/>
-                <w:sz w:val="28"/>
-                <w:szCs w:val="28"/>
-              </w:rPr>
-            </w:pPr>
-            <w:r>
-              <w:rPr>
-                <w:rFonts w:ascii="Times New Roman" w:eastAsiaTheme="majorEastAsia" w:hAnsi="Times New Roman"/>
-                <w:sz w:val="28"/>
-                <w:szCs w:val="28"/>
-              </w:rPr>
-              <w:t>Prepared by:</w:t>
-            </w:r>
-          </w:p>
-          <w:p>
-            <w:pPr>
-              <w:pStyle w:val="NoSpacing"/>
-              <w:jc w:val="center"/>
-              <w:rPr>
-                <w:rFonts w:ascii="Times New Roman" w:eastAsiaTheme="majorEastAsia" w:hAnsi="Times New Roman"/>
-                <w:sz w:val="28"/>
-                <w:szCs w:val="28"/>
-              </w:rPr>
-            </w:pPr>
-            <w:r>
-              <w:rPr>
-                <w:rFonts w:ascii="Times New Roman" w:eastAsiaTheme="majorEastAsia" w:hAnsi="Times New Roman"/>
-                <w:sz w:val="28"/>
-                <w:szCs w:val="28"/>
-              </w:rPr>
-              <w:t>{Info.PreparingOffice}</w:t>
-            </w:r>
-          </w:p>
-          <w:p>
-            <w:pPr>
-              <w:pStyle w:val="NoSpacing"/>
-              <w:jc w:val="center"/>
-              <w:rPr>
-                <w:rFonts w:ascii="Times New Roman" w:eastAsiaTheme="majorEastAsia" w:hAnsi="Times New Roman"/>
-                <w:sz w:val="28"/>
-                <w:szCs w:val="28"/>
-              </w:rPr>
-            </w:pPr>
-            <w:r>
-              <w:rPr>
-                <w:rFonts w:ascii="Times New Roman" w:eastAsiaTheme="majorEastAsia" w:hAnsi="Times New Roman"/>
-                <w:sz w:val="28"/>
-                <w:szCs w:val="28"/>
-              </w:rPr>
-              <w:t>{Info.PreparingBase}</w:t>
-            </w:r>
-          </w:p>
-          <w:p>
-            <w:pPr>
-              <w:pStyle w:val="NoSpacing"/>
-              <w:jc w:val="center"/>
-              <w:rPr>
-                <w:rFonts w:ascii="Times New Roman" w:eastAsiaTheme="majorEastAsia" w:hAnsi="Times New Roman"/>
-                <w:sz w:val="28"/>
-                <w:szCs w:val="28"/>
-              </w:rPr>
-            </w:pPr>
-          </w:p>
-          <w:p>
-            <w:pPr>
-              <w:pStyle w:val="NoSpacing"/>
-              <w:jc w:val="center"/>
-              <w:rPr>
-                <w:rFonts w:ascii="Times New Roman" w:eastAsiaTheme="majorEastAsia" w:hAnsi="Times New Roman"/>
-                <w:sz w:val="28"/>
-                <w:szCs w:val="28"/>
-              </w:rPr>
-            </w:pPr>
-          </w:p>
-          <w:p>
-            <w:pPr>
-              <w:pStyle w:val="NoSpacing"/>
-              <w:jc w:val="center"/>
-              <w:rPr>
-                <w:rFonts w:ascii="Times New Roman" w:eastAsiaTheme="majorEastAsia" w:hAnsi="Times New Roman"/>
-                <w:sz w:val="28"/>
-                <w:szCs w:val="28"/>
-              </w:rPr>
-            </w:pPr>
-          </w:p>
-          <w:p>
-            <w:pPr>
-              <w:pStyle w:val="NoSpacing"/>
-              <w:jc w:val="center"/>
-              <w:rPr>
-                <w:rFonts w:ascii="Times New Roman" w:eastAsiaTheme="majorEastAsia" w:hAnsi="Times New Roman"/>
-                <w:sz w:val="28"/>
-                <w:szCs w:val="28"/>
-              </w:rPr>
-            </w:pPr>
-          </w:p>
-          <w:p>
-            <w:pPr>
-              <w:pStyle w:val="NoSpacing"/>
-              <w:keepLines/>
-              <w:jc w:val="center"/>
-              <w:rPr>
-                <w:rFonts w:ascii="Times New Roman" w:eastAsiaTheme="majorEastAsia" w:hAnsi="Times New Roman"/>
-                <w:sz w:val="28"/>
-                <w:szCs w:val="28"/>
-              </w:rPr>
-            </w:pPr>
-            <w:r>
-              <w:rPr>
-                <w:rFonts w:ascii="Times New Roman" w:eastAsiaTheme="majorEastAsia" w:hAnsi="Times New Roman"/>
-                <w:sz w:val="28"/>
-                <w:szCs w:val="28"/>
-              </w:rPr>
-              <w:t>{#Info.ProgramManagers}</w:t>
-            </w:r>
-          </w:p>
-          <w:p>
-            <w:pPr>
-              <w:pStyle w:val="NoSpacing"/>
-              <w:keepNext/>
-              <w:keepLines/>
-              <w:jc w:val="center"/>
-              <w:rPr>
-                <w:rFonts w:ascii="Times New Roman" w:eastAsiaTheme="majorEastAsia" w:hAnsi="Times New Roman"/>
-                <w:sz w:val="28"/>
-                <w:szCs w:val="28"/>
-              </w:rPr>
-            </w:pPr>
-            <w:r>
-              <w:rPr>
-                <w:rFonts w:ascii="Times New Roman" w:eastAsiaTheme="majorEastAsia" w:hAnsi="Times New Roman"/>
-                <w:sz w:val="28"/>
-                <w:szCs w:val="28"/>
-              </w:rPr>
-              <w:t>Program Manager:</w:t>
-            </w:r>
-            <w:r>
-              <w:rPr>
-                <w:rFonts w:ascii="Times New Roman" w:eastAsiaTheme="majorEastAsia" w:hAnsi="Times New Roman"/>
-                <w:sz w:val="28"/>
-                <w:szCs w:val="28"/>
-              </w:rPr>
-              <w:t xml:space="preserve"> {FirstName} {LastName}</w:t>
-            </w:r>
-          </w:p>
-          <w:p>
-            <w:pPr>
-              <w:pStyle w:val="NoSpacing"/>
-              <w:keepNext/>
-              <w:keepLines/>
-              <w:jc w:val="center"/>
-              <w:rPr>
-                <w:rFonts w:ascii="Times New Roman" w:eastAsiaTheme="majorEastAsia" w:hAnsi="Times New Roman"/>
-                <w:sz w:val="28"/>
-                <w:szCs w:val="28"/>
-              </w:rPr>
-            </w:pPr>
-            <w:r>
-              <w:rPr>
-                <w:rFonts w:ascii="Times New Roman" w:eastAsiaTheme="majorEastAsia" w:hAnsi="Times New Roman"/>
-                <w:sz w:val="28"/>
-                <w:szCs w:val="28"/>
-              </w:rPr>
-              <w:t>Phone</w:t>
-            </w:r>
-            <w:r>
-              <w:rPr>
-                <w:rFonts w:ascii="Times New Roman" w:eastAsiaTheme="majorEastAsia" w:hAnsi="Times New Roman"/>
-                <w:sz w:val="28"/>
-                <w:szCs w:val="28"/>
-              </w:rPr>
-              <w:t>:</w:t>
-            </w:r>
-            <w:r>
-              <w:rPr>
-                <w:rFonts w:ascii="Times New Roman" w:eastAsiaTheme="majorEastAsia" w:hAnsi="Times New Roman"/>
-                <w:sz w:val="28"/>
-                <w:szCs w:val="28"/>
-              </w:rPr>
-              <w:t xml:space="preserve"> {</w:t>
-            </w:r>
-            <w:r>
-              <w:rPr>
-                <w:rFonts w:ascii="Times New Roman" w:eastAsiaTheme="majorEastAsia" w:hAnsi="Times New Roman"/>
-                <w:sz w:val="28"/>
-                <w:szCs w:val="28"/>
-              </w:rPr>
-              <w:t>Phone</w:t>
-            </w:r>
-            <w:r>
-              <w:rPr>
-                <w:rFonts w:ascii="Times New Roman" w:eastAsiaTheme="majorEastAsia" w:hAnsi="Times New Roman"/>
-                <w:sz w:val="28"/>
-                <w:szCs w:val="28"/>
-              </w:rPr>
-              <w:t>}</w:t>
-            </w:r>
-          </w:p>
-          <w:p>
-            <w:pPr>
-              <w:pStyle w:val="NoSpacing"/>
-              <w:keepNext/>
-              <w:keepLines/>
-              <w:jc w:val="center"/>
-              <w:rPr>
-                <w:rFonts w:ascii="Times New Roman" w:eastAsiaTheme="majorEastAsia" w:hAnsi="Times New Roman"/>
-                <w:sz w:val="28"/>
-                <w:szCs w:val="28"/>
-              </w:rPr>
-            </w:pPr>
-            <w:r>
-              <w:rPr>
-                <w:rFonts w:ascii="Times New Roman" w:eastAsiaTheme="majorEastAsia" w:hAnsi="Times New Roman"/>
-                <w:sz w:val="28"/>
-                <w:szCs w:val="28"/>
-              </w:rPr>
-              <w:t>Email:</w:t>
-            </w:r>
-            <w:r>
-              <w:rPr>
-                <w:rFonts w:ascii="Times New Roman" w:eastAsiaTheme="majorEastAsia" w:hAnsi="Times New Roman"/>
-                <w:sz w:val="28"/>
-                <w:szCs w:val="28"/>
-              </w:rPr>
-              <w:t xml:space="preserve"> {Email}</w:t>
-            </w:r>
-          </w:p>
-          <w:p>
-            <w:pPr>
-              <w:pStyle w:val="NoSpacing"/>
-              <w:keepLines/>
-              <w:jc w:val="center"/>
-              <w:rPr>
-                <w:rFonts w:ascii="Times New Roman" w:eastAsiaTheme="majorEastAsia" w:hAnsi="Times New Roman"/>
-                <w:sz w:val="28"/>
-                <w:szCs w:val="28"/>
-              </w:rPr>
-            </w:pPr>
-          </w:p>
-          <w:p>
-            <w:pPr>
-              <w:pStyle w:val="NoSpacing"/>
-              <w:keepLines/>
-              <w:jc w:val="center"/>
-              <w:rPr>
-                <w:rFonts w:ascii="Times New Roman" w:eastAsiaTheme="majorEastAsia" w:hAnsi="Times New Roman"/>
-                <w:sz w:val="28"/>
-                <w:szCs w:val="28"/>
-              </w:rPr>
-            </w:pPr>
-            <w:r>
-              <w:rPr>
-                <w:rFonts w:ascii="Times New Roman" w:eastAsiaTheme="majorEastAsia" w:hAnsi="Times New Roman"/>
-                <w:sz w:val="28"/>
-                <w:szCs w:val="28"/>
-              </w:rPr>
-              <w:t>{</w:t>
-            </w:r>
-            <w:proofErr w:type="gramStart"/>
-            <w:r>
-              <w:rPr>
-                <w:rFonts w:ascii="Times New Roman" w:eastAsiaTheme="majorEastAsia" w:hAnsi="Times New Roman"/>
-                <w:sz w:val="28"/>
-                <w:szCs w:val="28"/>
-              </w:rPr>
-              <w:t>/}</w:t>
-            </w:r>
-            <w:r>
-              <w:rPr>
-                <w:rFonts w:ascii="Times New Roman" w:eastAsiaTheme="majorEastAsia" w:hAnsi="Times New Roman"/>
-                <w:sz w:val="28"/>
-                <w:szCs w:val="28"/>
-              </w:rPr>
-              <w:t>{</w:t>
-            </w:r>
-            <w:proofErr w:type="gramEnd"/>
-            <w:r>
-              <w:rPr>
-                <w:rFonts w:ascii="Times New Roman" w:eastAsiaTheme="majorEastAsia" w:hAnsi="Times New Roman"/>
-                <w:sz w:val="28"/>
-                <w:szCs w:val="28"/>
-              </w:rPr>
-              <w:t>#Info.TechOrderManagers}</w:t>
-            </w:r>
-          </w:p>
-          <w:p>
-            <w:pPr>
-              <w:pStyle w:val="NoSpacing"/>
-              <w:keepNext/>
-              <w:keepLines/>
-              <w:jc w:val="center"/>
-              <w:rPr>
-                <w:rFonts w:ascii="Times New Roman" w:eastAsiaTheme="majorEastAsia" w:hAnsi="Times New Roman"/>
-                <w:sz w:val="28"/>
-                <w:szCs w:val="28"/>
-              </w:rPr>
-            </w:pPr>
-            <w:r>
-              <w:rPr>
-                <w:rFonts w:ascii="Times New Roman" w:eastAsiaTheme="majorEastAsia" w:hAnsi="Times New Roman"/>
-                <w:sz w:val="28"/>
-                <w:szCs w:val="28"/>
-              </w:rPr>
-              <w:t>TO Manager:</w:t>
-            </w:r>
-            <w:r>
-              <w:rPr>
-                <w:rFonts w:ascii="Times New Roman" w:eastAsiaTheme="majorEastAsia" w:hAnsi="Times New Roman"/>
-                <w:sz w:val="28"/>
-                <w:szCs w:val="28"/>
-              </w:rPr>
-              <w:t xml:space="preserve"> {FirstName} {LastName}</w:t>
-            </w:r>
-          </w:p>
-          <w:p>
-            <w:pPr>
-              <w:pStyle w:val="NoSpacing"/>
-              <w:keepNext/>
-              <w:keepLines/>
-              <w:jc w:val="center"/>
-              <w:rPr>
-                <w:rFonts w:ascii="Times New Roman" w:eastAsiaTheme="majorEastAsia" w:hAnsi="Times New Roman"/>
-                <w:sz w:val="28"/>
-                <w:szCs w:val="28"/>
-              </w:rPr>
-            </w:pPr>
-            <w:r>
-              <w:rPr>
-                <w:rFonts w:ascii="Times New Roman" w:eastAsiaTheme="majorEastAsia" w:hAnsi="Times New Roman"/>
-                <w:sz w:val="28"/>
-                <w:szCs w:val="28"/>
-              </w:rPr>
-              <w:t>Phone</w:t>
-            </w:r>
-            <w:r>
-              <w:rPr>
-                <w:rFonts w:ascii="Times New Roman" w:eastAsiaTheme="majorEastAsia" w:hAnsi="Times New Roman"/>
-                <w:sz w:val="28"/>
-                <w:szCs w:val="28"/>
-              </w:rPr>
-              <w:t>:</w:t>
-            </w:r>
-            <w:r>
-              <w:rPr>
-                <w:rFonts w:ascii="Times New Roman" w:eastAsiaTheme="majorEastAsia" w:hAnsi="Times New Roman"/>
-                <w:sz w:val="28"/>
-                <w:szCs w:val="28"/>
-              </w:rPr>
-              <w:t xml:space="preserve"> {</w:t>
-            </w:r>
-            <w:r>
-              <w:rPr>
-                <w:rFonts w:ascii="Times New Roman" w:eastAsiaTheme="majorEastAsia" w:hAnsi="Times New Roman"/>
-                <w:sz w:val="28"/>
-                <w:szCs w:val="28"/>
-              </w:rPr>
-              <w:t>Phone</w:t>
-            </w:r>
-            <w:r>
-              <w:rPr>
-                <w:rFonts w:ascii="Times New Roman" w:eastAsiaTheme="majorEastAsia" w:hAnsi="Times New Roman"/>
-                <w:sz w:val="28"/>
-                <w:szCs w:val="28"/>
-              </w:rPr>
-              <w:t>}</w:t>
-            </w:r>
-          </w:p>
-          <w:p>
-            <w:pPr>
-              <w:pStyle w:val="NoSpacing"/>
-              <w:keepLines/>
-              <w:jc w:val="center"/>
-              <w:rPr>
-                <w:rFonts w:ascii="Times New Roman" w:eastAsiaTheme="majorEastAsia" w:hAnsi="Times New Roman"/>
-                <w:sz w:val="28"/>
-                <w:szCs w:val="28"/>
-              </w:rPr>
-            </w:pPr>
-            <w:r>
-              <w:rPr>
-                <w:rFonts w:ascii="Times New Roman" w:eastAsiaTheme="majorEastAsia" w:hAnsi="Times New Roman"/>
-                <w:sz w:val="28"/>
-                <w:szCs w:val="28"/>
-              </w:rPr>
-              <w:t>Email:</w:t>
-            </w:r>
-            <w:r>
-              <w:rPr>
-                <w:rFonts w:ascii="Times New Roman" w:eastAsiaTheme="majorEastAsia" w:hAnsi="Times New Roman"/>
-                <w:sz w:val="28"/>
-                <w:szCs w:val="28"/>
-              </w:rPr>
-              <w:t xml:space="preserve"> {Email}</w:t>
-            </w:r>
-          </w:p>
-          <w:p>
-            <w:pPr>
-              <w:pStyle w:val="NoSpacing"/>
-              <w:keepLines/>
-              <w:jc w:val="center"/>
-              <w:rPr>
-                <w:rFonts w:ascii="Times New Roman" w:eastAsiaTheme="majorEastAsia" w:hAnsi="Times New Roman"/>
-                <w:sz w:val="28"/>
-                <w:szCs w:val="28"/>
-              </w:rPr>
-            </w:pPr>
-          </w:p>
-          <w:p>
-            <w:pPr>
-              <w:pStyle w:val="NoSpacing"/>
-              <w:keepLines/>
-              <w:jc w:val="center"/>
-              <w:rPr>
-                <w:rFonts w:ascii="Times New Roman" w:eastAsiaTheme="majorEastAsia" w:hAnsi="Times New Roman"/>
-                <w:sz w:val="28"/>
-                <w:szCs w:val="28"/>
-              </w:rPr>
-            </w:pPr>
-            <w:r>
-              <w:rPr>
-                <w:rFonts w:ascii="Times New Roman" w:eastAsiaTheme="majorEastAsia" w:hAnsi="Times New Roman"/>
-                <w:sz w:val="28"/>
-                <w:szCs w:val="28"/>
-              </w:rPr>
-              <w:t>{/}</w:t>
-            </w:r>
-          </w:p>
-        </w:tc>
-      </w:tr>
-    </w:tbl>
-    <w:p>
+        <w:rPr>
+          <w:rFonts w:ascii="Times New Roman" w:eastAsiaTheme="majorEastAsia" w:hAnsi="Times New Roman"/>
+          <w:b/>
+          <w:sz w:val="44"/>
+          <w:szCs w:val="44"/>
+        </w:rPr>
+      </w:pPr>
+      <w:r>
+        <w:rPr>
+          <w:rFonts w:ascii="Times New Roman" w:eastAsiaTheme="majorEastAsia" w:hAnsi="Times New Roman"/>
+          <w:b/>
+          <w:sz w:val="44"/>
+          <w:szCs w:val="44"/>
+        </w:rPr>
+        <w:t>Technical Order</w:t>
+      </w:r>
+      <w:r>
+        <w:rPr>
+          <w:rFonts w:ascii="Times New Roman" w:eastAsiaTheme="majorEastAsia" w:hAnsi="Times New Roman"/>
+          <w:b/>
+          <w:sz w:val="44"/>
+          <w:szCs w:val="44"/>
+        </w:rPr>
+        <w:t xml:space="preserve"> </w:t>
+      </w:r>
+      <w:r>
+        <w:rPr>
+          <w:rFonts w:ascii="Times New Roman" w:eastAsiaTheme="majorEastAsia" w:hAnsi="Times New Roman"/>
+          <w:b/>
+          <w:sz w:val="44"/>
+          <w:szCs w:val="44"/>
+        </w:rPr>
+        <w:t>Requirements Narrative</w:t>
+      </w:r>
+    </w:p>
+    <w:p>
+      <w:pPr>
+        <w:pStyle w:val="NoSpacing"/>
+        <w:jc w:val="center"/>
+        <w:rPr>
+          <w:rFonts w:ascii="Times New Roman" w:eastAsiaTheme="majorEastAsia" w:hAnsi="Times New Roman"/>
+          <w:sz w:val="28"/>
+          <w:szCs w:val="28"/>
+        </w:rPr>
+      </w:pPr>
+    </w:p>
+    <w:p>
+      <w:pPr>
+        <w:pStyle w:val="NoSpacing"/>
+        <w:jc w:val="center"/>
+        <w:rPr>
+          <w:rFonts w:ascii="Times New Roman" w:eastAsiaTheme="majorEastAsia" w:hAnsi="Times New Roman"/>
+          <w:sz w:val="28"/>
+          <w:szCs w:val="28"/>
+        </w:rPr>
+      </w:pPr>
+    </w:p>
+    <w:p>
+      <w:pPr>
+        <w:pStyle w:val="NoSpacing"/>
+        <w:jc w:val="center"/>
+        <w:rPr>
+          <w:rFonts w:ascii="Times New Roman" w:eastAsiaTheme="majorEastAsia" w:hAnsi="Times New Roman"/>
+          <w:sz w:val="28"/>
+          <w:szCs w:val="28"/>
+        </w:rPr>
+      </w:pPr>
+    </w:p>
+    <w:p>
+      <w:pPr>
+        <w:pStyle w:val="NoSpacing"/>
+        <w:jc w:val="center"/>
+        <w:rPr>
+          <w:rFonts w:ascii="Times New Roman" w:eastAsiaTheme="majorEastAsia" w:hAnsi="Times New Roman"/>
+          <w:sz w:val="28"/>
+          <w:szCs w:val="28"/>
+        </w:rPr>
+      </w:pPr>
+    </w:p>
+    <w:p>
+      <w:pPr>
+        <w:pStyle w:val="NoSpacing"/>
+        <w:jc w:val="center"/>
+        <w:rPr>
+          <w:rFonts w:ascii="Times New Roman" w:eastAsiaTheme="majorEastAsia" w:hAnsi="Times New Roman"/>
+          <w:sz w:val="28"/>
+          <w:szCs w:val="28"/>
+        </w:rPr>
+      </w:pPr>
+      <w:r>
+        <w:rPr>
+          <w:rFonts w:ascii="Times New Roman" w:eastAsiaTheme="majorEastAsia" w:hAnsi="Times New Roman"/>
+          <w:sz w:val="28"/>
+          <w:szCs w:val="28"/>
+        </w:rPr>
+        <w:t>Program Group: {</w:t>
+      </w:r>
+      <w:proofErr w:type="spellStart"/>
+      <w:r>
+        <w:rPr>
+          <w:rFonts w:ascii="Times New Roman" w:eastAsiaTheme="majorEastAsia" w:hAnsi="Times New Roman"/>
+          <w:sz w:val="28"/>
+          <w:szCs w:val="28"/>
+        </w:rPr>
+        <w:t>Info.ProgramGroup</w:t>
+      </w:r>
+      <w:proofErr w:type="spellEnd"/>
+      <w:r>
+        <w:rPr>
+          <w:rFonts w:ascii="Times New Roman" w:eastAsiaTheme="majorEastAsia" w:hAnsi="Times New Roman"/>
+          <w:sz w:val="28"/>
+          <w:szCs w:val="28"/>
+        </w:rPr>
+        <w:t>}</w:t>
+      </w:r>
+    </w:p>
+    <w:p>
+      <w:pPr>
+        <w:pStyle w:val="NoSpacing"/>
+        <w:jc w:val="center"/>
+        <w:rPr>
+          <w:rFonts w:ascii="Times New Roman" w:eastAsiaTheme="majorEastAsia" w:hAnsi="Times New Roman"/>
+          <w:sz w:val="28"/>
+          <w:szCs w:val="28"/>
+        </w:rPr>
+      </w:pPr>
+      <w:r>
+        <w:rPr>
+          <w:rFonts w:ascii="Times New Roman" w:eastAsiaTheme="majorEastAsia" w:hAnsi="Times New Roman"/>
+          <w:sz w:val="28"/>
+          <w:szCs w:val="28"/>
+        </w:rPr>
+        <w:t>Program Name: {</w:t>
+      </w:r>
+      <w:proofErr w:type="spellStart"/>
+      <w:r>
+        <w:rPr>
+          <w:rFonts w:ascii="Times New Roman" w:eastAsiaTheme="majorEastAsia" w:hAnsi="Times New Roman"/>
+          <w:sz w:val="28"/>
+          <w:szCs w:val="28"/>
+        </w:rPr>
+        <w:t>Info.ProgramName</w:t>
+      </w:r>
+      <w:proofErr w:type="spellEnd"/>
+      <w:r>
+        <w:rPr>
+          <w:rFonts w:ascii="Times New Roman" w:eastAsiaTheme="majorEastAsia" w:hAnsi="Times New Roman"/>
+          <w:sz w:val="28"/>
+          <w:szCs w:val="28"/>
+        </w:rPr>
+        <w:t>}</w:t>
+      </w:r>
+    </w:p>
+    <w:p>
+      <w:pPr>
+        <w:pStyle w:val="NoSpacing"/>
+        <w:jc w:val="center"/>
+        <w:rPr>
+          <w:rFonts w:ascii="Times New Roman" w:eastAsiaTheme="majorEastAsia" w:hAnsi="Times New Roman"/>
+          <w:sz w:val="28"/>
+          <w:szCs w:val="28"/>
+        </w:rPr>
+      </w:pPr>
+      <w:r>
+        <w:rPr>
+          <w:rFonts w:ascii="Times New Roman" w:eastAsiaTheme="majorEastAsia" w:hAnsi="Times New Roman"/>
+          <w:sz w:val="28"/>
+          <w:szCs w:val="28"/>
+        </w:rPr>
+        <w:t>Program Element Code: {</w:t>
+      </w:r>
+      <w:proofErr w:type="spellStart"/>
+      <w:r>
+        <w:rPr>
+          <w:rFonts w:ascii="Times New Roman" w:eastAsiaTheme="majorEastAsia" w:hAnsi="Times New Roman"/>
+          <w:sz w:val="28"/>
+          <w:szCs w:val="28"/>
+        </w:rPr>
+        <w:t>Info.ProgramElementCode</w:t>
+      </w:r>
+      <w:proofErr w:type="spellEnd"/>
+      <w:r>
+        <w:rPr>
+          <w:rFonts w:ascii="Times New Roman" w:eastAsiaTheme="majorEastAsia" w:hAnsi="Times New Roman"/>
+          <w:sz w:val="28"/>
+          <w:szCs w:val="28"/>
+        </w:rPr>
+        <w:t xml:space="preserve">} </w:t>
+      </w:r>
+    </w:p>
+    <w:p>
+      <w:pPr>
+        <w:pStyle w:val="NoSpacing"/>
+        <w:jc w:val="center"/>
+        <w:rPr>
+          <w:rFonts w:ascii="Times New Roman" w:eastAsiaTheme="majorEastAsia" w:hAnsi="Times New Roman"/>
+          <w:bCs/>
+          <w:sz w:val="28"/>
+          <w:szCs w:val="28"/>
+        </w:rPr>
+      </w:pPr>
+    </w:p>
+    <w:p>
+      <w:pPr>
+        <w:pStyle w:val="NoSpacing"/>
+        <w:jc w:val="center"/>
+        <w:rPr>
+          <w:rFonts w:ascii="Times New Roman" w:eastAsiaTheme="majorEastAsia" w:hAnsi="Times New Roman"/>
+          <w:bCs/>
+          <w:sz w:val="28"/>
+          <w:szCs w:val="28"/>
+        </w:rPr>
+      </w:pPr>
+    </w:p>
+    <w:p>
+      <w:pPr>
+        <w:pStyle w:val="NoSpacing"/>
+        <w:jc w:val="center"/>
+        <w:rPr>
+          <w:rFonts w:ascii="Times New Roman" w:eastAsiaTheme="majorEastAsia" w:hAnsi="Times New Roman"/>
+          <w:bCs/>
+          <w:sz w:val="28"/>
+          <w:szCs w:val="28"/>
+        </w:rPr>
+      </w:pPr>
+    </w:p>
+    <w:p>
+      <w:pPr>
+        <w:pStyle w:val="NoSpacing"/>
+        <w:jc w:val="center"/>
+        <w:rPr>
+          <w:rFonts w:ascii="Times New Roman" w:eastAsiaTheme="majorEastAsia" w:hAnsi="Times New Roman"/>
+          <w:bCs/>
+          <w:sz w:val="32"/>
+          <w:szCs w:val="32"/>
+        </w:rPr>
+      </w:pPr>
+    </w:p>
+    <w:p>
+      <w:pPr>
+        <w:pStyle w:val="NoSpacing"/>
+        <w:jc w:val="center"/>
+        <w:rPr>
+          <w:rFonts w:ascii="Times New Roman" w:eastAsiaTheme="majorEastAsia" w:hAnsi="Times New Roman"/>
+          <w:sz w:val="28"/>
+          <w:szCs w:val="28"/>
+        </w:rPr>
+      </w:pPr>
+      <w:r>
+        <w:rPr>
+          <w:rFonts w:ascii="Times New Roman" w:eastAsiaTheme="majorEastAsia" w:hAnsi="Times New Roman"/>
+          <w:sz w:val="28"/>
+          <w:szCs w:val="28"/>
+        </w:rPr>
+        <w:t>{Created}</w:t>
+      </w:r>
+    </w:p>
+    <w:p>
+      <w:pPr>
+        <w:pStyle w:val="NoSpacing"/>
+        <w:jc w:val="center"/>
+        <w:rPr>
+          <w:rFonts w:ascii="Times New Roman" w:eastAsiaTheme="majorEastAsia" w:hAnsi="Times New Roman"/>
+          <w:sz w:val="28"/>
+          <w:szCs w:val="28"/>
+        </w:rPr>
+      </w:pPr>
+    </w:p>
+    <w:p>
+      <w:pPr>
+        <w:pStyle w:val="NoSpacing"/>
+        <w:jc w:val="center"/>
+        <w:rPr>
+          <w:rFonts w:ascii="Times New Roman" w:eastAsiaTheme="majorEastAsia" w:hAnsi="Times New Roman"/>
+          <w:sz w:val="28"/>
+          <w:szCs w:val="28"/>
+        </w:rPr>
+      </w:pPr>
+    </w:p>
+    <w:p>
+      <w:pPr>
+        <w:pStyle w:val="NoSpacing"/>
+        <w:jc w:val="center"/>
+        <w:rPr>
+          <w:rFonts w:ascii="Times New Roman" w:eastAsiaTheme="majorEastAsia" w:hAnsi="Times New Roman"/>
+          <w:sz w:val="28"/>
+          <w:szCs w:val="28"/>
+        </w:rPr>
+      </w:pPr>
+      <w:r>
+        <w:rPr>
+          <w:rFonts w:ascii="Times New Roman" w:eastAsiaTheme="majorEastAsia" w:hAnsi="Times New Roman"/>
+          <w:sz w:val="28"/>
+          <w:szCs w:val="28"/>
+        </w:rPr>
+        <w:t>Prepared by:</w:t>
+      </w:r>
+    </w:p>
+    <w:p>
+      <w:pPr>
+        <w:pStyle w:val="NoSpacing"/>
+        <w:jc w:val="center"/>
+        <w:rPr>
+          <w:rFonts w:ascii="Times New Roman" w:eastAsiaTheme="majorEastAsia" w:hAnsi="Times New Roman"/>
+          <w:sz w:val="28"/>
+          <w:szCs w:val="28"/>
+        </w:rPr>
+      </w:pPr>
+      <w:r>
+        <w:rPr>
+          <w:rFonts w:ascii="Times New Roman" w:eastAsiaTheme="majorEastAsia" w:hAnsi="Times New Roman"/>
+          <w:sz w:val="28"/>
+          <w:szCs w:val="28"/>
+        </w:rPr>
+        <w:t>{</w:t>
+      </w:r>
+      <w:proofErr w:type="spellStart"/>
+      <w:r>
+        <w:rPr>
+          <w:rFonts w:ascii="Times New Roman" w:eastAsiaTheme="majorEastAsia" w:hAnsi="Times New Roman"/>
+          <w:sz w:val="28"/>
+          <w:szCs w:val="28"/>
+        </w:rPr>
+        <w:t>Info.PreparingOffice</w:t>
+      </w:r>
+      <w:proofErr w:type="spellEnd"/>
+      <w:r>
+        <w:rPr>
+          <w:rFonts w:ascii="Times New Roman" w:eastAsiaTheme="majorEastAsia" w:hAnsi="Times New Roman"/>
+          <w:sz w:val="28"/>
+          <w:szCs w:val="28"/>
+        </w:rPr>
+        <w:t>}</w:t>
+      </w:r>
+    </w:p>
+    <w:p>
+      <w:pPr>
+        <w:pStyle w:val="NoSpacing"/>
+        <w:jc w:val="center"/>
+        <w:rPr>
+          <w:rFonts w:ascii="Times New Roman" w:eastAsiaTheme="majorEastAsia" w:hAnsi="Times New Roman"/>
+          <w:sz w:val="28"/>
+          <w:szCs w:val="28"/>
+        </w:rPr>
+      </w:pPr>
+      <w:r>
+        <w:rPr>
+          <w:rFonts w:ascii="Times New Roman" w:eastAsiaTheme="majorEastAsia" w:hAnsi="Times New Roman"/>
+          <w:sz w:val="28"/>
+          <w:szCs w:val="28"/>
+        </w:rPr>
+        <w:t>{</w:t>
+      </w:r>
+      <w:proofErr w:type="spellStart"/>
+      <w:r>
+        <w:rPr>
+          <w:rFonts w:ascii="Times New Roman" w:eastAsiaTheme="majorEastAsia" w:hAnsi="Times New Roman"/>
+          <w:sz w:val="28"/>
+          <w:szCs w:val="28"/>
+        </w:rPr>
+        <w:t>Info.PreparingBase</w:t>
+      </w:r>
+      <w:proofErr w:type="spellEnd"/>
+      <w:r>
+        <w:rPr>
+          <w:rFonts w:ascii="Times New Roman" w:eastAsiaTheme="majorEastAsia" w:hAnsi="Times New Roman"/>
+          <w:sz w:val="28"/>
+          <w:szCs w:val="28"/>
+        </w:rPr>
+        <w:t>}</w:t>
+      </w:r>
+    </w:p>
+    <w:p>
+      <w:pPr>
+        <w:pStyle w:val="NoSpacing"/>
+        <w:jc w:val="center"/>
+        <w:rPr>
+          <w:rFonts w:ascii="Times New Roman" w:eastAsiaTheme="majorEastAsia" w:hAnsi="Times New Roman"/>
+          <w:sz w:val="28"/>
+          <w:szCs w:val="28"/>
+        </w:rPr>
+      </w:pPr>
+    </w:p>
+    <w:p>
+      <w:pPr>
+        <w:pStyle w:val="NoSpacing"/>
+        <w:jc w:val="center"/>
+        <w:rPr>
+          <w:rFonts w:ascii="Times New Roman" w:eastAsiaTheme="majorEastAsia" w:hAnsi="Times New Roman"/>
+          <w:sz w:val="28"/>
+          <w:szCs w:val="28"/>
+        </w:rPr>
+      </w:pPr>
+    </w:p>
+    <w:p>
+      <w:pPr>
+        <w:pStyle w:val="NoSpacing"/>
+        <w:jc w:val="center"/>
+        <w:rPr>
+          <w:rFonts w:ascii="Times New Roman" w:eastAsiaTheme="majorEastAsia" w:hAnsi="Times New Roman"/>
+          <w:sz w:val="28"/>
+          <w:szCs w:val="28"/>
+        </w:rPr>
+      </w:pPr>
+    </w:p>
+    <w:p>
+      <w:pPr>
+        <w:pStyle w:val="NoSpacing"/>
+        <w:jc w:val="center"/>
+        <w:rPr>
+          <w:rFonts w:ascii="Times New Roman" w:eastAsiaTheme="majorEastAsia" w:hAnsi="Times New Roman"/>
+          <w:sz w:val="28"/>
+          <w:szCs w:val="28"/>
+        </w:rPr>
+      </w:pPr>
+      <w:r>
+        <w:rPr>
+          <w:rFonts w:ascii="Times New Roman" w:eastAsiaTheme="majorEastAsia" w:hAnsi="Times New Roman"/>
+          <w:sz w:val="28"/>
+          <w:szCs w:val="28"/>
+        </w:rPr>
+        <w:t>{#Info.ProgramManagers}</w:t>
+      </w:r>
+    </w:p>
+    <w:p>
+      <w:pPr>
+        <w:pStyle w:val="NoSpacing"/>
+        <w:keepNext/>
+        <w:keepLines/>
+        <w:jc w:val="center"/>
+        <w:rPr>
+          <w:rFonts w:ascii="Times New Roman" w:eastAsiaTheme="majorEastAsia" w:hAnsi="Times New Roman"/>
+          <w:sz w:val="28"/>
+          <w:szCs w:val="28"/>
+        </w:rPr>
+      </w:pPr>
+    </w:p>
+    <w:p>
+      <w:pPr>
+        <w:pStyle w:val="NoSpacing"/>
+        <w:keepNext/>
+        <w:keepLines/>
+        <w:jc w:val="center"/>
+        <w:rPr>
+          <w:rFonts w:ascii="Times New Roman" w:eastAsiaTheme="majorEastAsia" w:hAnsi="Times New Roman"/>
+          <w:sz w:val="28"/>
+          <w:szCs w:val="28"/>
+        </w:rPr>
+      </w:pPr>
+      <w:r>
+        <w:rPr>
+          <w:rFonts w:ascii="Times New Roman" w:eastAsiaTheme="majorEastAsia" w:hAnsi="Times New Roman"/>
+          <w:sz w:val="28"/>
+          <w:szCs w:val="28"/>
+        </w:rPr>
+        <w:t>Program Manager: {FirstName} {LastName}</w:t>
+      </w:r>
+    </w:p>
+    <w:p>
+      <w:pPr>
+        <w:pStyle w:val="NoSpacing"/>
+        <w:keepNext/>
+        <w:keepLines/>
+        <w:jc w:val="center"/>
+        <w:rPr>
+          <w:rFonts w:ascii="Times New Roman" w:eastAsiaTheme="majorEastAsia" w:hAnsi="Times New Roman"/>
+          <w:sz w:val="28"/>
+          <w:szCs w:val="28"/>
+        </w:rPr>
+      </w:pPr>
+      <w:r>
+        <w:rPr>
+          <w:rFonts w:ascii="Times New Roman" w:eastAsiaTheme="majorEastAsia" w:hAnsi="Times New Roman"/>
+          <w:sz w:val="28"/>
+          <w:szCs w:val="28"/>
+        </w:rPr>
+        <w:t>Phone: {Phone}</w:t>
+      </w:r>
+    </w:p>
+    <w:p>
+      <w:pPr>
+        <w:pStyle w:val="NoSpacing"/>
+        <w:keepLines/>
+        <w:jc w:val="center"/>
+        <w:rPr>
+          <w:rFonts w:ascii="Times New Roman" w:eastAsiaTheme="majorEastAsia" w:hAnsi="Times New Roman"/>
+          <w:sz w:val="28"/>
+          <w:szCs w:val="28"/>
+        </w:rPr>
+      </w:pPr>
+      <w:r>
+        <w:rPr>
+          <w:rFonts w:ascii="Times New Roman" w:eastAsiaTheme="majorEastAsia" w:hAnsi="Times New Roman"/>
+          <w:sz w:val="28"/>
+          <w:szCs w:val="28"/>
+        </w:rPr>
+        <w:t>Email: {Email</w:t>
+      </w:r>
+      <w:proofErr w:type="gramStart"/>
+      <w:r>
+        <w:rPr>
+          <w:rFonts w:ascii="Times New Roman" w:eastAsiaTheme="majorEastAsia" w:hAnsi="Times New Roman"/>
+          <w:sz w:val="28"/>
+          <w:szCs w:val="28"/>
+        </w:rPr>
+        <w:t>}</w:t>
+      </w:r>
+      <w:r>
+        <w:rPr>
+          <w:rFonts w:ascii="Times New Roman" w:eastAsiaTheme="majorEastAsia" w:hAnsi="Times New Roman"/>
+          <w:sz w:val="28"/>
+          <w:szCs w:val="28"/>
+        </w:rPr>
+        <w:t>{</w:t>
+      </w:r>
+      <w:proofErr w:type="gramEnd"/>
+      <w:r>
+        <w:rPr>
+          <w:rFonts w:ascii="Times New Roman" w:eastAsiaTheme="majorEastAsia" w:hAnsi="Times New Roman"/>
+          <w:sz w:val="28"/>
+          <w:szCs w:val="28"/>
+        </w:rPr>
+        <w:t>/}</w:t>
+      </w:r>
+      <w:r>
+        <w:rPr>
+          <w:rFonts w:ascii="Times New Roman" w:eastAsiaTheme="majorEastAsia" w:hAnsi="Times New Roman"/>
+          <w:sz w:val="28"/>
+          <w:szCs w:val="28"/>
+        </w:rPr>
+        <w:t>{#Info.TechOrderManagers}</w:t>
+      </w:r>
+    </w:p>
+    <w:p>
+      <w:pPr>
+        <w:pStyle w:val="NoSpacing"/>
+        <w:jc w:val="center"/>
+        <w:rPr>
+          <w:rFonts w:ascii="Times New Roman" w:eastAsiaTheme="majorEastAsia" w:hAnsi="Times New Roman"/>
+          <w:sz w:val="28"/>
+          <w:szCs w:val="28"/>
+        </w:rPr>
+      </w:pPr>
+    </w:p>
+    <w:p>
+      <w:pPr>
+        <w:pStyle w:val="NoSpacing"/>
+        <w:keepNext/>
+        <w:keepLines/>
+        <w:jc w:val="center"/>
+        <w:rPr>
+          <w:rFonts w:ascii="Times New Roman" w:eastAsiaTheme="majorEastAsia" w:hAnsi="Times New Roman"/>
+          <w:sz w:val="28"/>
+          <w:szCs w:val="28"/>
+        </w:rPr>
+      </w:pPr>
+      <w:r>
+        <w:rPr>
+          <w:rFonts w:ascii="Times New Roman" w:eastAsiaTheme="majorEastAsia" w:hAnsi="Times New Roman"/>
+          <w:sz w:val="28"/>
+          <w:szCs w:val="28"/>
+        </w:rPr>
+        <w:t>TO Manager: {FirstName} {LastName}</w:t>
+      </w:r>
+    </w:p>
+    <w:p>
+      <w:pPr>
+        <w:pStyle w:val="NoSpacing"/>
+        <w:keepNext/>
+        <w:keepLines/>
+        <w:jc w:val="center"/>
+        <w:rPr>
+          <w:rFonts w:ascii="Times New Roman" w:eastAsiaTheme="majorEastAsia" w:hAnsi="Times New Roman"/>
+          <w:sz w:val="28"/>
+          <w:szCs w:val="28"/>
+        </w:rPr>
+      </w:pPr>
+      <w:r>
+        <w:rPr>
+          <w:rFonts w:ascii="Times New Roman" w:eastAsiaTheme="majorEastAsia" w:hAnsi="Times New Roman"/>
+          <w:sz w:val="28"/>
+          <w:szCs w:val="28"/>
+        </w:rPr>
+        <w:t>Phone: {Phone}</w:t>
+      </w:r>
+    </w:p>
+    <w:p>
+      <w:pPr>
+        <w:pStyle w:val="NoSpacing"/>
+        <w:keepLines/>
+        <w:jc w:val="center"/>
+      </w:pPr>
+      <w:r>
+        <w:rPr>
+          <w:rFonts w:ascii="Times New Roman" w:eastAsiaTheme="majorEastAsia" w:hAnsi="Times New Roman"/>
+          <w:sz w:val="28"/>
+          <w:szCs w:val="28"/>
+        </w:rPr>
+        <w:t>Email: {Email</w:t>
+      </w:r>
+      <w:proofErr w:type="gramStart"/>
+      <w:r>
+        <w:rPr>
+          <w:rFonts w:ascii="Times New Roman" w:eastAsiaTheme="majorEastAsia" w:hAnsi="Times New Roman"/>
+          <w:sz w:val="28"/>
+          <w:szCs w:val="28"/>
+        </w:rPr>
+        <w:t>}</w:t>
+      </w:r>
+      <w:r>
+        <w:rPr>
+          <w:rFonts w:ascii="Times New Roman" w:eastAsiaTheme="majorEastAsia" w:hAnsi="Times New Roman"/>
+          <w:sz w:val="28"/>
+          <w:szCs w:val="28"/>
+        </w:rPr>
+        <w:t>{</w:t>
+      </w:r>
+      <w:proofErr w:type="gramEnd"/>
+      <w:r>
+        <w:rPr>
+          <w:rFonts w:ascii="Times New Roman" w:eastAsiaTheme="majorEastAsia" w:hAnsi="Times New Roman"/>
+          <w:sz w:val="28"/>
+          <w:szCs w:val="28"/>
+        </w:rPr>
+        <w:t>/}</w:t>
+      </w:r>
       <w:r>
         <w:br w:type="page"/>
       </w:r>
@@ -2931,7 +2766,21 @@
         <w:rPr>
           <w:rStyle w:val="Heading1Char"/>
         </w:rPr>
-        <w:t>{Info.ProgramName}</w:t>
+        <w:t>{</w:t>
+      </w:r>
+      <w:proofErr w:type="spellStart"/>
+      <w:r>
+        <w:rPr>
+          <w:rStyle w:val="Heading1Char"/>
+        </w:rPr>
+        <w:t>Info.ProgramName</w:t>
+      </w:r>
+      <w:proofErr w:type="spellEnd"/>
+      <w:r>
+        <w:rPr>
+          <w:rStyle w:val="Heading1Char"/>
+        </w:rPr>
+        <w:t>}</w:t>
       </w:r>
       <w:r>
         <w:rPr>
@@ -2966,7 +2815,15 @@
         <w:t xml:space="preserve"> </w:t>
       </w:r>
       <w:r>
-        <w:t>{Description.Description}</w:t>
+        <w:t>{</w:t>
+      </w:r>
+      <w:proofErr w:type="spellStart"/>
+      <w:r>
+        <w:t>Description.Description</w:t>
+      </w:r>
+      <w:proofErr w:type="spellEnd"/>
+      <w:r>
+        <w:t>}</w:t>
       </w:r>
     </w:p>
     <w:p/>
@@ -2990,7 +2847,15 @@
         <w:t xml:space="preserve"> </w:t>
       </w:r>
       <w:r>
-        <w:t>{Description.Introduction}</w:t>
+        <w:t>{</w:t>
+      </w:r>
+      <w:proofErr w:type="spellStart"/>
+      <w:r>
+        <w:t>Description.Introduction</w:t>
+      </w:r>
+      <w:proofErr w:type="spellEnd"/>
+      <w:r>
+        <w:t>}</w:t>
       </w:r>
     </w:p>
     <w:p/>
@@ -3014,159 +2879,97 @@
         <w:t xml:space="preserve"> </w:t>
       </w:r>
       <w:r>
-        <w:t xml:space="preserve">The {Info.ProgramName} TO sustainment support is provided by </w:t>
-      </w:r>
-      <w:r>
-        <w:t>{#</w:t>
-      </w:r>
-      <w:r>
-        <w:t>Labor</w:t>
-      </w:r>
-      <w:r>
-        <w:t>.LaborType===”organic”}{</w:t>
-      </w:r>
-      <w:r>
-        <w:t>Labor</w:t>
-      </w:r>
-      <w:r>
-        <w:t>.OrganicSupport.Office}{/}{#</w:t>
-      </w:r>
-      <w:r>
-        <w:t>Labor</w:t>
-      </w:r>
-      <w:r>
-        <w:t>.LaborType === “contractor”}{</w:t>
-      </w:r>
-      <w:r>
-        <w:t>Labor</w:t>
-      </w:r>
-      <w:r>
-        <w:t>.ContractorSupport.ContractorName}{/}.</w:t>
-      </w:r>
-      <w:r>
-        <w:t>{#</w:t>
-      </w:r>
-      <w:r>
-        <w:t>Labor</w:t>
-      </w:r>
-      <w:r>
-        <w:t>.LaborType === “contractor”}</w:t>
-      </w:r>
-      <w:r>
-        <w:t xml:space="preserve"> </w:t>
-      </w:r>
-      <w:r>
-        <w:t xml:space="preserve">Estimated Labor Cost is </w:t>
-      </w:r>
-      <w:r>
-        <w:t>$</w:t>
-      </w:r>
-      <w:r>
-        <w:t>{</w:t>
-      </w:r>
-      <w:r>
-        <w:t>Labor</w:t>
-      </w:r>
-      <w:r>
-        <w:t>.</w:t>
-      </w:r>
-      <w:r>
-        <w:t>ContractorSupport.</w:t>
-      </w:r>
+        <w:t>The {</w:t>
+      </w:r>
+      <w:proofErr w:type="spellStart"/>
+      <w:r>
+        <w:t>Info.ProgramName</w:t>
+      </w:r>
+      <w:proofErr w:type="spellEnd"/>
+      <w:r>
+        <w:t>} TO sustainment support is {#Labor.LaborType === “organic</w:t>
+      </w:r>
+      <w:proofErr w:type="gramStart"/>
+      <w:r>
+        <w:t>”}organically</w:t>
+      </w:r>
+      <w:proofErr w:type="gramEnd"/>
+      <w:r>
+        <w:t xml:space="preserve"> sustained by {</w:t>
+      </w:r>
+      <w:proofErr w:type="spellStart"/>
+      <w:r>
+        <w:t>Labor.OrganicSupport.Office</w:t>
+      </w:r>
+      <w:proofErr w:type="spellEnd"/>
+      <w:r>
+        <w:t>}{/}{#Labor.LaborType === “contractor”}provided by contractor support{/}{#Labor.LaborType === “both”}comprised of organic and contract support. Organic support is provided by {</w:t>
+      </w:r>
+      <w:proofErr w:type="spellStart"/>
+      <w:proofErr w:type="gramStart"/>
+      <w:r>
+        <w:t>Labor.OrganicSupport.Office</w:t>
+      </w:r>
+      <w:proofErr w:type="spellEnd"/>
+      <w:proofErr w:type="gramEnd"/>
+      <w:r>
+        <w:t xml:space="preserve">}{/}.{#Labor.LaborType === “contractor” || </w:t>
+      </w:r>
+      <w:proofErr w:type="spellStart"/>
+      <w:r>
+        <w:t>Labor.LaborType</w:t>
+      </w:r>
+      <w:proofErr w:type="spellEnd"/>
+      <w:r>
+        <w:t xml:space="preserve"> === “both”}{#Labor.ContractorSupport} Estimated Labor Cost for {</w:t>
+      </w:r>
+      <w:proofErr w:type="spellStart"/>
+      <w:r>
+        <w:t>ContractorName</w:t>
+      </w:r>
+      <w:proofErr w:type="spellEnd"/>
+      <w:r>
+        <w:t>} is ${</w:t>
+      </w:r>
+      <w:proofErr w:type="spellStart"/>
       <w:r>
         <w:t>LaborCost</w:t>
       </w:r>
-      <w:r>
-        <w:t xml:space="preserve"> | comma</w:t>
-      </w:r>
-      <w:r>
-        <w:t>}, Contract #{</w:t>
-      </w:r>
-      <w:r>
-        <w:t>Labor</w:t>
-      </w:r>
-      <w:r>
-        <w:t>.</w:t>
-      </w:r>
-      <w:r>
-        <w:t>ContractorSupport.</w:t>
-      </w:r>
-      <w:r>
-        <w:t>ContractNumber} for the TO labor/sustainment. This contract will expire on {</w:t>
-      </w:r>
-      <w:proofErr w:type="gramStart"/>
-      <w:r>
-        <w:t>Labor</w:t>
-      </w:r>
-      <w:r>
-        <w:t>.</w:t>
-      </w:r>
-      <w:r>
-        <w:t>ContractorSupport.</w:t>
-      </w:r>
+      <w:proofErr w:type="spellEnd"/>
+      <w:r>
+        <w:t xml:space="preserve"> | comma}, Contract #{ContractNumber} for the TO labor/sustainment. This contract will expire on {</w:t>
+      </w:r>
+      <w:proofErr w:type="spellStart"/>
       <w:r>
         <w:t>ContractExpiration</w:t>
       </w:r>
-      <w:proofErr w:type="gramEnd"/>
-      <w:r>
-        <w:t>}.{/}{#Distribution.</w:t>
-      </w:r>
-      <w:r>
-        <w:t>hasDistCost</w:t>
-      </w:r>
-      <w:r>
-        <w:t xml:space="preserve"> === “no”</w:t>
-      </w:r>
-      <w:r>
-        <w:t xml:space="preserve"> || Distribution.hasDistCost === “”</w:t>
-      </w:r>
-      <w:r>
-        <w:t>}</w:t>
-      </w:r>
-      <w:r>
-        <w:t xml:space="preserve"> </w:t>
-      </w:r>
-      <w:r>
-        <w:t>There are no requirements for distribution all TOs are in digital format and available in ETIMS.</w:t>
-      </w:r>
-      <w:r>
-        <w:t>{/}{#Distribution.</w:t>
-      </w:r>
-      <w:r>
-        <w:t>hasDistCost</w:t>
-      </w:r>
-      <w:r>
-        <w:t xml:space="preserve"> === “yes”} </w:t>
-      </w:r>
-      <w:r>
-        <w:t xml:space="preserve">The total distribution cost is </w:t>
-      </w:r>
-      <w:r>
-        <w:t>$</w:t>
-      </w:r>
-      <w:r>
-        <w:t>{</w:t>
-      </w:r>
-      <w:r>
-        <w:t>Distribution</w:t>
-      </w:r>
-      <w:r>
-        <w:t>.Dist</w:t>
-      </w:r>
-      <w:r>
-        <w:t>Cost</w:t>
-      </w:r>
-      <w:r>
-        <w:t xml:space="preserve"> | comma </w:t>
-      </w:r>
-      <w:r>
-        <w:t>}</w:t>
-      </w:r>
-      <w:r>
-        <w:t>.</w:t>
-      </w:r>
-      <w:r>
-        <w:t>{/}</w:t>
+      <w:proofErr w:type="spellEnd"/>
+      <w:r>
+        <w:t>}.{/}{/}{#Labor.TotalContractSupport !== “”} Total contract support is estimated at ${</w:t>
+      </w:r>
+      <w:proofErr w:type="spellStart"/>
+      <w:r>
+        <w:t>Labor.TotalContractSupport</w:t>
+      </w:r>
+      <w:proofErr w:type="spellEnd"/>
+      <w:r>
+        <w:t xml:space="preserve"> | comma}.{/}{#Distribution.hasDistCost === “no” || </w:t>
+      </w:r>
+      <w:proofErr w:type="spellStart"/>
+      <w:r>
+        <w:t>Distribution.hasDistCost</w:t>
+      </w:r>
+      <w:proofErr w:type="spellEnd"/>
+      <w:r>
+        <w:t xml:space="preserve"> === “”} There are no requirements for distribution all TOs are in digital format and available in ETIMS.{/}{#Distribution.hasDistCost === “yes”} The total distribution cost is ${</w:t>
+      </w:r>
+      <w:proofErr w:type="spellStart"/>
+      <w:r>
+        <w:t>Distribution.DistCost</w:t>
+      </w:r>
+      <w:proofErr w:type="spellEnd"/>
+      <w:r>
+        <w:t xml:space="preserve"> | comma }.{/}</w:t>
       </w:r>
     </w:p>
     <w:p/>
@@ -3237,8 +3040,6 @@
       <w:r>
         <w:t xml:space="preserve"> </w:t>
       </w:r>
-    </w:p>
-    <w:p>
       <w:r>
         <w:t>{#TechnicalOrders.</w:t>
       </w:r>
@@ -3263,7 +3064,15 @@
         <w:t xml:space="preserve"> </w:t>
       </w:r>
       <w:r>
-        <w:t xml:space="preserve">{Info.ProgramName} </w:t>
+        <w:t>{</w:t>
+      </w:r>
+      <w:proofErr w:type="spellStart"/>
+      <w:r>
+        <w:t>Info.ProgramName</w:t>
+      </w:r>
+      <w:proofErr w:type="spellEnd"/>
+      <w:r>
+        <w:t xml:space="preserve">} </w:t>
       </w:r>
       <w:r>
         <w:t xml:space="preserve">TOs are authored and sustained in TOAP. All future TOs to include modification or newly developed TOs will be developed in TOAP. TOs moving from acquisition to sustainment will be authored and sustained in </w:t>
@@ -3295,60 +3104,181 @@
         <w:t>AuthoredInTOAPType</w:t>
       </w:r>
       <w:r>
-        <w:t xml:space="preserve"> === “partially”}{Info.ProgramName} </w:t>
+        <w:t xml:space="preserve"> === “partially”}{</w:t>
+      </w:r>
+      <w:proofErr w:type="spellStart"/>
+      <w:r>
+        <w:t>Info.ProgramName</w:t>
+      </w:r>
+      <w:proofErr w:type="spellEnd"/>
+      <w:r>
+        <w:t xml:space="preserve">} </w:t>
       </w:r>
       <w:r>
         <w:t>consisting of</w:t>
       </w:r>
       <w:r>
-        <w:t xml:space="preserve"> {TechnicalOrders.TotalCount} </w:t>
-      </w:r>
-      <w:r>
-        <w:t>TOs. Of the</w:t>
-      </w:r>
-      <w:r>
-        <w:t xml:space="preserve"> {TechnicalOrders.TotalCount} </w:t>
-      </w:r>
-      <w:r>
-        <w:t xml:space="preserve">TOs, </w:t>
-      </w:r>
-      <w:r>
-        <w:t>{TechnicalOrders.</w:t>
+        <w:t xml:space="preserve"> </w:t>
+      </w:r>
+      <w:r>
+        <w:t xml:space="preserve">{#TechnicalOrders.TotalCount === 1}1 </w:t>
+      </w:r>
+      <w:r>
+        <w:t>TO</w:t>
+      </w:r>
+      <w:r>
+        <w:t>{/}{#TechnicalOrders.TotalCount &gt; 1}</w:t>
+      </w:r>
+      <w:r>
+        <w:t>{</w:t>
+      </w:r>
+      <w:proofErr w:type="spellStart"/>
+      <w:r>
+        <w:t>TechnicalOrders.TotalCount</w:t>
+      </w:r>
+      <w:proofErr w:type="spellEnd"/>
+      <w:r>
+        <w:t xml:space="preserve">} </w:t>
+      </w:r>
+      <w:r>
+        <w:t>TOs</w:t>
+      </w:r>
+      <w:r>
+        <w:t>{/}</w:t>
+      </w:r>
+      <w:r>
+        <w:t>. Of the</w:t>
+      </w:r>
+      <w:r>
+        <w:t xml:space="preserve">{#TechnicalOrders.TotalCount === 1}1 </w:t>
+      </w:r>
+      <w:r>
+        <w:t>TO</w:t>
+      </w:r>
+      <w:r>
+        <w:t>{/}{#TechnicalOrders.TotalCount &gt; 1}{</w:t>
+      </w:r>
+      <w:proofErr w:type="spellStart"/>
+      <w:r>
+        <w:t>TechnicalOrders.TotalCount</w:t>
+      </w:r>
+      <w:proofErr w:type="spellEnd"/>
+      <w:r>
+        <w:t xml:space="preserve">} </w:t>
+      </w:r>
+      <w:r>
+        <w:t>TOs</w:t>
+      </w:r>
+      <w:r>
+        <w:t>{/}</w:t>
+      </w:r>
+      <w:r>
+        <w:t xml:space="preserve">, </w:t>
+      </w:r>
+      <w:r>
+        <w:t>{</w:t>
+      </w:r>
+      <w:proofErr w:type="spellStart"/>
+      <w:r>
+        <w:t>TechnicalOrders.</w:t>
       </w:r>
       <w:r>
         <w:t>NumAuthoredInTOAP</w:t>
       </w:r>
+      <w:proofErr w:type="spellEnd"/>
       <w:r>
         <w:t>}</w:t>
       </w:r>
       <w:r>
-        <w:t xml:space="preserve"> migrated into TOAP staging area and were authored to the latest Technical Manuals Specification and Standards (TMSS) Digital Support Suite (DSS) and published as revisions.</w:t>
+        <w:t xml:space="preserve"> migrated into TOAP and </w:t>
       </w:r>
       <w:r>
         <w:t>{#TechnicalOrders.</w:t>
       </w:r>
       <w:r>
+        <w:t>NumAuthoredInTOAP</w:t>
+      </w:r>
+      <w:r>
+        <w:t xml:space="preserve"> &gt; 1}</w:t>
+      </w:r>
+      <w:r>
+        <w:t>were</w:t>
+      </w:r>
+      <w:r>
+        <w:t>{/}{#TechnicalOrders.</w:t>
+      </w:r>
+      <w:r>
+        <w:t>NumAuthoredInTOAP</w:t>
+      </w:r>
+      <w:r>
+        <w:t xml:space="preserve"> === 1}was{/}</w:t>
+      </w:r>
+      <w:r>
+        <w:t xml:space="preserve"> authored to the latest Technical Manuals Specification and Standards (TMSS) Digital Support Suite (DSS) and published as revisions.</w:t>
+      </w:r>
+      <w:r>
+        <w:t>{#TechnicalOrders.</w:t>
+      </w:r>
+      <w:r>
         <w:t>NumNotAuthoredInTOAP</w:t>
       </w:r>
       <w:r>
-        <w:t xml:space="preserve"> &gt; 0</w:t>
-      </w:r>
-      <w:r>
         <w:t xml:space="preserve"> </w:t>
       </w:r>
       <w:r>
+        <w:t>=== 1</w:t>
+      </w:r>
+      <w:r>
         <w:t>}</w:t>
       </w:r>
       <w:r>
-        <w:t xml:space="preserve"> Additional </w:t>
-      </w:r>
-      <w:r>
-        <w:t>{TechnicalOrders.</w:t>
+        <w:t xml:space="preserve"> Additional</w:t>
+      </w:r>
+      <w:r>
+        <w:t xml:space="preserve"> </w:t>
+      </w:r>
+      <w:r>
+        <w:t>1</w:t>
+      </w:r>
+      <w:r>
+        <w:t xml:space="preserve"> </w:t>
+      </w:r>
+      <w:r>
+        <w:t>TO will be authored through attrition and remain within the TOAP staging area.</w:t>
+      </w:r>
+      <w:r>
+        <w:t>{/}</w:t>
+      </w:r>
+      <w:r>
+        <w:t>{#TechnicalOrders.</w:t>
       </w:r>
       <w:r>
         <w:t>NumNotAuthoredInTOAP</w:t>
       </w:r>
       <w:r>
+        <w:t xml:space="preserve"> &gt; 1</w:t>
+      </w:r>
+      <w:r>
+        <w:t xml:space="preserve"> </w:t>
+      </w:r>
+      <w:r>
+        <w:t>}</w:t>
+      </w:r>
+      <w:r>
+        <w:t xml:space="preserve"> Additional</w:t>
+      </w:r>
+      <w:r>
+        <w:t xml:space="preserve"> {</w:t>
+      </w:r>
+      <w:proofErr w:type="spellStart"/>
+      <w:r>
+        <w:t>TechnicalOrders.</w:t>
+      </w:r>
+      <w:r>
+        <w:t>NumNotAuthoredInTOAP</w:t>
+      </w:r>
+      <w:proofErr w:type="spellEnd"/>
+      <w:r>
         <w:t xml:space="preserve">} </w:t>
       </w:r>
       <w:r>
@@ -3364,7 +3294,19 @@
         <w:t>NumUnpublished</w:t>
       </w:r>
       <w:r>
-        <w:t xml:space="preserve"> &gt; 0}</w:t>
+        <w:t xml:space="preserve"> </w:t>
+      </w:r>
+      <w:r>
+        <w:t>===</w:t>
+      </w:r>
+      <w:r>
+        <w:t xml:space="preserve"> </w:t>
+      </w:r>
+      <w:r>
+        <w:t>1</w:t>
+      </w:r>
+      <w:r>
+        <w:t>}</w:t>
       </w:r>
       <w:r>
         <w:rPr>
@@ -3377,39 +3319,28 @@
         <w:t xml:space="preserve"> </w:t>
       </w:r>
       <w:r>
-        <w:t>Currently there are </w:t>
-      </w:r>
-      <w:r>
-        <w:t>{TechnicalOrders.</w:t>
-      </w:r>
-      <w:r>
-        <w:t xml:space="preserve"> NumUnpublished</w:t>
-      </w:r>
-      <w:r>
-        <w:t>}</w:t>
-      </w:r>
-      <w:r>
-        <w:t xml:space="preserve"> unpublished TOs that will be authored in </w:t>
-      </w:r>
-      <w:proofErr w:type="gramStart"/>
-      <w:r>
-        <w:t>TOAP.</w:t>
-      </w:r>
-      <w:r>
-        <w:t>{</w:t>
-      </w:r>
-      <w:proofErr w:type="gramEnd"/>
-      <w:r>
-        <w:t>/}</w:t>
+        <w:t xml:space="preserve">Currently there </w:t>
+      </w:r>
+      <w:r>
+        <w:t>is 1</w:t>
+      </w:r>
+      <w:r>
+        <w:t xml:space="preserve"> </w:t>
+      </w:r>
+      <w:r>
+        <w:t>unpublished TO that will be authored in TOAP.</w:t>
+      </w:r>
+      <w:r>
+        <w:t>{/}</w:t>
       </w:r>
       <w:r>
         <w:t>{#TechnicalOrders.</w:t>
       </w:r>
       <w:r>
-        <w:t>NumWillNotBeAuthoredInTOAP</w:t>
-      </w:r>
-      <w:r>
-        <w:t xml:space="preserve"> &gt; 0}</w:t>
+        <w:t>NumUnpublished</w:t>
+      </w:r>
+      <w:r>
+        <w:t xml:space="preserve"> &gt; 1}</w:t>
       </w:r>
       <w:r>
         <w:rPr>
@@ -3422,60 +3353,165 @@
         <w:t xml:space="preserve"> </w:t>
       </w:r>
       <w:r>
-        <w:t>The remaining </w:t>
-      </w:r>
-      <w:r>
+        <w:t>Currently there are</w:t>
+      </w:r>
+      <w:r>
+        <w:t xml:space="preserve"> {</w:t>
+      </w:r>
+      <w:proofErr w:type="spellStart"/>
+      <w:r>
+        <w:t>TechnicalOrders</w:t>
+      </w:r>
+      <w:proofErr w:type="spellEnd"/>
+      <w:r>
+        <w:t>.</w:t>
+      </w:r>
+      <w:r>
+        <w:t xml:space="preserve"> </w:t>
+      </w:r>
+      <w:proofErr w:type="spellStart"/>
+      <w:r>
+        <w:t>NumUnpublished</w:t>
+      </w:r>
+      <w:proofErr w:type="spellEnd"/>
+      <w:r>
+        <w:t xml:space="preserve">} </w:t>
+      </w:r>
+      <w:r>
+        <w:t>unpublished TOs that will be authored in TOAP.</w:t>
+      </w:r>
+      <w:r>
+        <w:t>{/}</w:t>
+      </w:r>
+      <w:r>
+        <w:t>{#TechnicalOrders.</w:t>
+      </w:r>
+      <w:r>
+        <w:t>NumWillNotBeAuthoredInTOAP</w:t>
+      </w:r>
+      <w:r>
+        <w:t xml:space="preserve"> &gt; 0}</w:t>
+      </w:r>
+      <w:r>
+        <w:t>{#TechnicalOrders.</w:t>
+      </w:r>
+      <w:r>
+        <w:t>NumWillNotBeAuthoredInTOAP</w:t>
+      </w:r>
+      <w:r>
+        <w:t xml:space="preserve"> === 1}</w:t>
+      </w:r>
+      <w:r>
+        <w:rPr>
+          <w:rFonts w:ascii="Segoe UI" w:hAnsi="Segoe UI" w:cs="Segoe UI"/>
+          <w:color w:val="172B4D"/>
+          <w:sz w:val="21"/>
+          <w:szCs w:val="21"/>
+          <w:shd w:val="clear" w:color="auto" w:fill="FFFFFF"/>
+        </w:rPr>
+        <w:t xml:space="preserve"> </w:t>
+      </w:r>
+      <w:r>
+        <w:t>The remaining</w:t>
+      </w:r>
+      <w:r>
+        <w:t xml:space="preserve"> </w:t>
+      </w:r>
+      <w:r>
+        <w:t>1</w:t>
+      </w:r>
+      <w:r>
+        <w:t xml:space="preserve"> </w:t>
+      </w:r>
+      <w:r>
+        <w:t>TO will not be authored in TOAP.</w:t>
+      </w:r>
+      <w:r>
+        <w:t>{/}{#TechnicalOrders.</w:t>
+      </w:r>
+      <w:r>
+        <w:t>NumWillNotBeAuthoredInTOAP</w:t>
+      </w:r>
+      <w:r>
+        <w:t xml:space="preserve"> &gt; 1}</w:t>
+      </w:r>
+      <w:r>
+        <w:rPr>
+          <w:rFonts w:ascii="Segoe UI" w:hAnsi="Segoe UI" w:cs="Segoe UI"/>
+          <w:color w:val="172B4D"/>
+          <w:sz w:val="21"/>
+          <w:szCs w:val="21"/>
+          <w:shd w:val="clear" w:color="auto" w:fill="FFFFFF"/>
+        </w:rPr>
+        <w:t xml:space="preserve"> </w:t>
+      </w:r>
+      <w:r>
+        <w:t>The remaining</w:t>
+      </w:r>
+      <w:r>
+        <w:t xml:space="preserve"> {</w:t>
+      </w:r>
+      <w:proofErr w:type="spellStart"/>
+      <w:r>
+        <w:t>TechnicalOrders.</w:t>
+      </w:r>
+      <w:r>
+        <w:t>NumWillNotBeAuthoredInTOAP</w:t>
+      </w:r>
+      <w:proofErr w:type="spellEnd"/>
+      <w:r>
+        <w:t xml:space="preserve">} </w:t>
+      </w:r>
+      <w:r>
+        <w:t xml:space="preserve">TOs will not be authored in </w:t>
+      </w:r>
+      <w:proofErr w:type="gramStart"/>
+      <w:r>
+        <w:t>TOAP</w:t>
+      </w:r>
+      <w:r>
+        <w:t>.{</w:t>
+      </w:r>
+      <w:proofErr w:type="gramEnd"/>
+      <w:r>
+        <w:t>/}</w:t>
+      </w:r>
+      <w:r>
+        <w:t xml:space="preserve"> </w:t>
+      </w:r>
+      <w:r>
+        <w:t>{TechnicalOrders.Explanation}</w:t>
+      </w:r>
+      <w:r>
+        <w:t>{/}{/}</w:t>
+      </w:r>
+      <w:r>
+        <w:t>{#TechnicalOrders.</w:t>
+      </w:r>
+      <w:r>
+        <w:t>AuthoredInTOAPType</w:t>
+      </w:r>
+      <w:r>
+        <w:t xml:space="preserve"> === “no”}{TechnicalOrders.PlanToConvert}{/}</w:t>
+      </w:r>
+      <w:r>
+        <w:t>{#TechnicalOrders.</w:t>
+      </w:r>
+      <w:r>
+        <w:t>TO</w:t>
+      </w:r>
+      <w:r>
+        <w:t>ApprovedWaiver === “yes”}</w:t>
+      </w:r>
+      <w:r>
+        <w:t xml:space="preserve"> </w:t>
+      </w:r>
+      <w:r>
+        <w:t xml:space="preserve"> Date waiver approved: </w:t>
+      </w:r>
+      <w:r>
+        <w:lastRenderedPageBreak/>
         <w:t>{TechnicalOrders.</w:t>
-      </w:r>
-      <w:r>
-        <w:t>NumWillNotBeAuthoredInTOAP</w:t>
-      </w:r>
-      <w:r>
-        <w:t>}</w:t>
-      </w:r>
-      <w:r>
-        <w:t> TOs will not be authored in TOAP.</w:t>
-      </w:r>
-      <w:r>
-        <w:t xml:space="preserve"> </w:t>
-      </w:r>
-      <w:r>
-        <w:t>{</w:t>
-      </w:r>
-      <w:proofErr w:type="gramStart"/>
-      <w:r>
-        <w:t>TechnicalOrders.Explanation}</w:t>
-      </w:r>
-      <w:r>
-        <w:t>{</w:t>
-      </w:r>
-      <w:proofErr w:type="gramEnd"/>
-      <w:r>
-        <w:t>/}{/}</w:t>
-      </w:r>
-      <w:r>
-        <w:t>{#TechnicalOrders.</w:t>
-      </w:r>
-      <w:r>
-        <w:t>AuthoredInTOAPType</w:t>
-      </w:r>
-      <w:r>
-        <w:t xml:space="preserve"> === “no”}{TechnicalOrders.PlanToConvert}{/}</w:t>
-      </w:r>
-      <w:r>
-        <w:t>{#TechnicalOrders.</w:t>
-      </w:r>
-      <w:r>
-        <w:t>TO</w:t>
-      </w:r>
-      <w:r>
-        <w:t>ApprovedWaiver === “yes”}</w:t>
-      </w:r>
-      <w:r>
-        <w:t xml:space="preserve"> </w:t>
-      </w:r>
-      <w:r>
-        <w:t xml:space="preserve"> Date waiver approved: {TechnicalOrders.</w:t>
       </w:r>
       <w:r>
         <w:t>TO</w:t>
@@ -3532,11 +3568,16 @@
         <w:t>”}</w:t>
       </w:r>
       <w:r>
-        <w:t>{Info.</w:t>
+        <w:t>{</w:t>
+      </w:r>
+      <w:proofErr w:type="spellStart"/>
+      <w:r>
+        <w:t>Info.</w:t>
       </w:r>
       <w:r>
         <w:t>ProgramName</w:t>
       </w:r>
+      <w:proofErr w:type="spellEnd"/>
       <w:r>
         <w:t xml:space="preserve">} </w:t>
       </w:r>
@@ -3592,7 +3633,15 @@
         <w:t>”}</w:t>
       </w:r>
       <w:r>
-        <w:t>{Info.ProgramName}</w:t>
+        <w:t>{</w:t>
+      </w:r>
+      <w:proofErr w:type="spellStart"/>
+      <w:r>
+        <w:t>Info.ProgramName</w:t>
+      </w:r>
+      <w:proofErr w:type="spellEnd"/>
+      <w:r>
+        <w:t>}</w:t>
       </w:r>
       <w:r>
         <w:t xml:space="preserve"> is currently in the process of converting Tech Data to MIL-STD-3048 (S1000D) utilizing</w:t>
@@ -3604,13 +3653,32 @@
         <w:t>contract, data will be sustained in TOAP</w:t>
       </w:r>
       <w:r>
+        <w:t>.</w:t>
+      </w:r>
+      <w:r>
         <w:t>{/}</w:t>
       </w:r>
       <w:r>
-        <w:t>{#Labor.MILSTD3048Status === “noplan”} There are no plans to convert</w:t>
-      </w:r>
-      <w:r>
-        <w:t xml:space="preserve"> {Info.ProgramName} </w:t>
+        <w:t>{#Labor.MILSTD3048Status === “</w:t>
+      </w:r>
+      <w:proofErr w:type="spellStart"/>
+      <w:r>
+        <w:t>noplan</w:t>
+      </w:r>
+      <w:proofErr w:type="spellEnd"/>
+      <w:r>
+        <w:t>”}There are no plans to convert</w:t>
+      </w:r>
+      <w:r>
+        <w:t xml:space="preserve"> {</w:t>
+      </w:r>
+      <w:proofErr w:type="spellStart"/>
+      <w:r>
+        <w:t>Info.ProgramName</w:t>
+      </w:r>
+      <w:proofErr w:type="spellEnd"/>
+      <w:r>
+        <w:t xml:space="preserve">} </w:t>
       </w:r>
       <w:r>
         <w:t>TOs to MIL-STD-3048 (S1000D).{/}</w:t>
@@ -3623,7 +3691,6 @@
         <w:rPr>
           <w:rStyle w:val="Heading2Char"/>
         </w:rPr>
-        <w:lastRenderedPageBreak/>
         <w:t>1.5</w:t>
       </w:r>
       <w:r>
@@ -3681,21 +3748,13 @@
         <w:t>NumInAcquisition</w:t>
       </w:r>
       <w:r>
-        <w:t xml:space="preserve"> === </w:t>
-      </w:r>
-      <w:proofErr w:type="gramStart"/>
-      <w:r>
-        <w:t>0</w:t>
+        <w:t xml:space="preserve"> === 0</w:t>
       </w:r>
       <w:r>
         <w:t>}</w:t>
       </w:r>
       <w:r>
-        <w:t>There</w:t>
-      </w:r>
-      <w:proofErr w:type="gramEnd"/>
-      <w:r>
-        <w:t xml:space="preserve"> are no TOs currently in Acquisition.</w:t>
+        <w:t>There are no TOs currently in Acquisition.</w:t>
       </w:r>
       <w:r>
         <w:t>{/}</w:t>
@@ -3710,30 +3769,66 @@
         <w:t xml:space="preserve"> &gt; 0}</w:t>
       </w:r>
       <w:r>
+        <w:t>{#TechnicalOrders.</w:t>
+      </w:r>
+      <w:r>
+        <w:t>NumInAcquisition</w:t>
+      </w:r>
+      <w:r>
+        <w:t xml:space="preserve"> === 1}</w:t>
+      </w:r>
+      <w:r>
+        <w:t xml:space="preserve">There </w:t>
+      </w:r>
+      <w:r>
+        <w:t>is</w:t>
+      </w:r>
+      <w:r>
+        <w:t xml:space="preserve"> currently </w:t>
+      </w:r>
+      <w:r>
+        <w:t>1</w:t>
+      </w:r>
+      <w:r>
+        <w:t xml:space="preserve"> TO in the acquisition process.</w:t>
+      </w:r>
+      <w:r>
+        <w:t>{/}{#TechnicalOrders.</w:t>
+      </w:r>
+      <w:r>
+        <w:t>NumInAcquisition</w:t>
+      </w:r>
+      <w:r>
+        <w:t xml:space="preserve"> &gt; 1}</w:t>
+      </w:r>
+      <w:r>
         <w:t xml:space="preserve">There are currently </w:t>
       </w:r>
       <w:r>
-        <w:t>{TechnicalOrders.</w:t>
+        <w:t>{</w:t>
+      </w:r>
+      <w:proofErr w:type="spellStart"/>
+      <w:r>
+        <w:t>TechnicalOrders.</w:t>
       </w:r>
       <w:r>
         <w:t>NumInAcquisition</w:t>
       </w:r>
+      <w:proofErr w:type="spellEnd"/>
       <w:r>
         <w:t>}</w:t>
       </w:r>
       <w:r>
-        <w:t xml:space="preserve"> TOs in the acquisition process. Effort will be made to ensure that all future TOs acquired will be delivered in digital </w:t>
-      </w:r>
-      <w:proofErr w:type="gramStart"/>
-      <w:r>
-        <w:t>format.</w:t>
-      </w:r>
-      <w:r>
-        <w:t>{</w:t>
-      </w:r>
-      <w:proofErr w:type="gramEnd"/>
-      <w:r>
-        <w:t>/}</w:t>
+        <w:t xml:space="preserve"> TOs in the acquisition process.</w:t>
+      </w:r>
+      <w:r>
+        <w:t xml:space="preserve">{/} </w:t>
+      </w:r>
+      <w:r>
+        <w:t>Effort will be made to ensure that all future TOs acquired will be delivered in digital format.</w:t>
+      </w:r>
+      <w:r>
+        <w:t>{/}</w:t>
       </w:r>
     </w:p>
     <w:p/>
@@ -3773,7 +3868,15 @@
         <w:t xml:space="preserve"> </w:t>
       </w:r>
       <w:r>
-        <w:t>{Description.ConfigurationPlan}</w:t>
+        <w:t>{</w:t>
+      </w:r>
+      <w:proofErr w:type="spellStart"/>
+      <w:r>
+        <w:t>Description.ConfigurationPlan</w:t>
+      </w:r>
+      <w:proofErr w:type="spellEnd"/>
+      <w:r>
+        <w:t>}</w:t>
       </w:r>
       <w:r>
         <w:t xml:space="preserve"> </w:t>
@@ -3812,7 +3915,15 @@
         <w:t xml:space="preserve">The </w:t>
       </w:r>
       <w:r>
-        <w:t>{Info.ProgramName}</w:t>
+        <w:t>{</w:t>
+      </w:r>
+      <w:proofErr w:type="spellStart"/>
+      <w:r>
+        <w:t>Info.ProgramName</w:t>
+      </w:r>
+      <w:proofErr w:type="spellEnd"/>
+      <w:r>
+        <w:t>}</w:t>
       </w:r>
       <w:r>
         <w:t xml:space="preserve"> program</w:t>
@@ -3824,7 +3935,15 @@
         <w:t xml:space="preserve">maintains </w:t>
       </w:r>
       <w:r>
-        <w:t>{TechnicalOrders.TotalTypeCount}</w:t>
+        <w:t>{</w:t>
+      </w:r>
+      <w:proofErr w:type="spellStart"/>
+      <w:r>
+        <w:t>TechnicalOrders.TotalTypeCount</w:t>
+      </w:r>
+      <w:proofErr w:type="spellEnd"/>
+      <w:r>
+        <w:t>}</w:t>
       </w:r>
       <w:r>
         <w:t xml:space="preserve"> </w:t>
@@ -3839,7 +3958,15 @@
         <w:t xml:space="preserve">Os; </w:t>
       </w:r>
       <w:r>
-        <w:t>{TechnicalOrders.NumPaper}</w:t>
+        <w:t>{</w:t>
+      </w:r>
+      <w:proofErr w:type="spellStart"/>
+      <w:r>
+        <w:t>TechnicalOrders.NumPaper</w:t>
+      </w:r>
+      <w:proofErr w:type="spellEnd"/>
+      <w:r>
+        <w:t>}</w:t>
       </w:r>
       <w:r>
         <w:t xml:space="preserve"> </w:t>
@@ -3848,7 +3975,15 @@
         <w:t xml:space="preserve">paper, </w:t>
       </w:r>
       <w:r>
-        <w:t>{TechnicalOrders.NumElectronic}</w:t>
+        <w:t>{</w:t>
+      </w:r>
+      <w:proofErr w:type="spellStart"/>
+      <w:r>
+        <w:t>TechnicalOrders.NumElectronic</w:t>
+      </w:r>
+      <w:proofErr w:type="spellEnd"/>
+      <w:r>
+        <w:t>}</w:t>
       </w:r>
       <w:r>
         <w:t xml:space="preserve"> </w:t>
@@ -3863,62 +3998,87 @@
         <w:t xml:space="preserve">, </w:t>
       </w:r>
       <w:r>
-        <w:t>{TechnicalOrders.NumCDDVD}</w:t>
+        <w:t>{</w:t>
+      </w:r>
+      <w:proofErr w:type="spellStart"/>
+      <w:r>
+        <w:t>TechnicalOrders.NumCDDVD</w:t>
+      </w:r>
+      <w:proofErr w:type="spellEnd"/>
+      <w:r>
+        <w:t>}</w:t>
       </w:r>
       <w:r>
         <w:t xml:space="preserve"> </w:t>
       </w:r>
       <w:r>
-        <w:t xml:space="preserve">CD/DVD. All </w:t>
-      </w:r>
-      <w:r>
-        <w:t>WA</w:t>
-      </w:r>
-      <w:r>
-        <w:t xml:space="preserve"> TOs are PDF, availa</w:t>
-      </w:r>
-      <w:r>
-        <w:rPr>
-          <w:spacing w:val="-1"/>
-        </w:rPr>
-        <w:t>b</w:t>
-      </w:r>
-      <w:r>
-        <w:rPr>
-          <w:spacing w:val="1"/>
-        </w:rPr>
-        <w:t>l</w:t>
-      </w:r>
-      <w:r>
-        <w:t>e for distribution via ETIMS</w:t>
-      </w:r>
-      <w:r>
-        <w:t xml:space="preserve">, </w:t>
-      </w:r>
-      <w:r>
-        <w:t xml:space="preserve">there are no plans to convert to Standard Generalized Markup Language (SGML). </w:t>
+        <w:t xml:space="preserve">CD/DVD. </w:t>
+      </w:r>
+      <w:r>
+        <w:t xml:space="preserve">The </w:t>
+      </w:r>
+      <w:r>
+        <w:t>current source file format is</w:t>
+      </w:r>
+      <w:r>
+        <w:t xml:space="preserve"> Standard Generalized Markup Language (SGML)</w:t>
+      </w:r>
+      <w:r>
+        <w:t xml:space="preserve"> </w:t>
+      </w:r>
+      <w:r>
+        <w:t xml:space="preserve">all TOs are PDF, available for distribution via </w:t>
+      </w:r>
+      <w:proofErr w:type="gramStart"/>
+      <w:r>
+        <w:t>ETIMS</w:t>
+      </w:r>
+      <w:r>
+        <w:t>.</w:t>
+      </w:r>
+      <w:r>
+        <w:t>{</w:t>
+      </w:r>
+      <w:proofErr w:type="gramEnd"/>
+      <w:r>
+        <w:t xml:space="preserve">#TechnicalOrders.NumUnpublished === 1} Currently there is 1 unpublished </w:t>
+      </w:r>
+      <w:r>
+        <w:t>TO</w:t>
+      </w:r>
+      <w:r>
+        <w:t>.{/}</w:t>
       </w:r>
       <w:r>
         <w:t xml:space="preserve">{#TechnicalOrders.NumUnpublished &gt; </w:t>
       </w:r>
-      <w:proofErr w:type="gramStart"/>
-      <w:r>
-        <w:t>0}</w:t>
-      </w:r>
-      <w:r>
-        <w:t>Currently</w:t>
-      </w:r>
-      <w:proofErr w:type="gramEnd"/>
-      <w:r>
-        <w:t xml:space="preserve"> there are</w:t>
-      </w:r>
-      <w:r>
-        <w:t xml:space="preserve"> {TechnicalOrders.NumUnpublished}</w:t>
+      <w:r>
+        <w:t>1</w:t>
+      </w:r>
+      <w:r>
+        <w:t>}</w:t>
       </w:r>
       <w:r>
         <w:t xml:space="preserve"> </w:t>
       </w:r>
       <w:r>
+        <w:t>Currently there are</w:t>
+      </w:r>
+      <w:r>
+        <w:t xml:space="preserve"> {</w:t>
+      </w:r>
+      <w:proofErr w:type="spellStart"/>
+      <w:r>
+        <w:t>TechnicalOrders.NumUnpublished</w:t>
+      </w:r>
+      <w:proofErr w:type="spellEnd"/>
+      <w:r>
+        <w:t>}</w:t>
+      </w:r>
+      <w:r>
+        <w:t xml:space="preserve"> </w:t>
+      </w:r>
+      <w:r>
         <w:t xml:space="preserve">unpublished </w:t>
       </w:r>
       <w:r>
@@ -3930,49 +4090,54 @@
       <w:r>
         <w:t>{/}</w:t>
       </w:r>
+    </w:p>
+    <w:p/>
+    <w:p>
+      <w:bookmarkStart w:id="8" w:name="_Toc179957428"/>
+      <w:r>
+        <w:rPr>
+          <w:rStyle w:val="Heading2Char"/>
+        </w:rPr>
+        <w:t>1.</w:t>
+      </w:r>
+      <w:r>
+        <w:rPr>
+          <w:rStyle w:val="Heading2Char"/>
+        </w:rPr>
+        <w:t>8</w:t>
+      </w:r>
+      <w:r>
+        <w:rPr>
+          <w:rStyle w:val="Heading2Char"/>
+        </w:rPr>
+        <w:t>. System</w:t>
+      </w:r>
+      <w:r>
+        <w:rPr>
+          <w:rStyle w:val="Heading2Char"/>
+        </w:rPr>
+        <w:t>/Mission Description</w:t>
+      </w:r>
+      <w:bookmarkEnd w:id="8"/>
+      <w:r>
+        <w:rPr>
+          <w:b/>
+        </w:rPr>
+        <w:t>:</w:t>
+      </w:r>
       <w:r>
         <w:t xml:space="preserve"> </w:t>
       </w:r>
-    </w:p>
-    <w:p/>
-    <w:p>
-      <w:bookmarkStart w:id="8" w:name="_Toc179957428"/>
-      <w:r>
-        <w:rPr>
-          <w:rStyle w:val="Heading2Char"/>
-        </w:rPr>
-        <w:t>1.</w:t>
-      </w:r>
-      <w:r>
-        <w:rPr>
-          <w:rStyle w:val="Heading2Char"/>
-        </w:rPr>
-        <w:t>8</w:t>
-      </w:r>
-      <w:r>
-        <w:rPr>
-          <w:rStyle w:val="Heading2Char"/>
-        </w:rPr>
-        <w:t>. System</w:t>
-      </w:r>
-      <w:r>
-        <w:rPr>
-          <w:rStyle w:val="Heading2Char"/>
-        </w:rPr>
-        <w:t>/Mission Description</w:t>
-      </w:r>
-      <w:bookmarkEnd w:id="8"/>
-      <w:r>
-        <w:rPr>
-          <w:b/>
-        </w:rPr>
-        <w:t>:</w:t>
-      </w:r>
-      <w:r>
-        <w:t xml:space="preserve"> </w:t>
-      </w:r>
-      <w:r>
-        <w:t>{Description.SystemMissionDescription}</w:t>
+      <w:r>
+        <w:t>{</w:t>
+      </w:r>
+      <w:proofErr w:type="spellStart"/>
+      <w:r>
+        <w:t>Description.SystemMissionDescription</w:t>
+      </w:r>
+      <w:proofErr w:type="spellEnd"/>
+      <w:r>
+        <w:t>}</w:t>
       </w:r>
       <w:r>
         <w:t xml:space="preserve"> </w:t>
@@ -3998,16 +4163,24 @@
         </w:rPr>
         <w:t>{</w:t>
       </w:r>
+      <w:proofErr w:type="spellStart"/>
       <w:r>
         <w:rPr>
           <w:rStyle w:val="Heading1Char"/>
         </w:rPr>
-        <w:t>Info.ProgramName}</w:t>
-      </w:r>
+        <w:t>Info.ProgramName</w:t>
+      </w:r>
+      <w:proofErr w:type="spellEnd"/>
       <w:r>
         <w:rPr>
           <w:rStyle w:val="Heading1Char"/>
         </w:rPr>
+        <w:t>}</w:t>
+      </w:r>
+      <w:r>
+        <w:rPr>
+          <w:rStyle w:val="Heading1Char"/>
+        </w:rPr>
         <w:t xml:space="preserve"> </w:t>
       </w:r>
       <w:r>
@@ -4030,13 +4203,38 @@
         <w:t xml:space="preserve"> </w:t>
       </w:r>
       <w:r>
-        <w:t>All labor requirements for {Info.ProgramName}</w:t>
+        <w:t>All labor requirements for {</w:t>
+      </w:r>
+      <w:proofErr w:type="spellStart"/>
+      <w:r>
+        <w:t>Info.ProgramName</w:t>
+      </w:r>
+      <w:proofErr w:type="spellEnd"/>
+      <w:r>
+        <w:t>}</w:t>
       </w:r>
       <w:r>
         <w:t xml:space="preserve"> </w:t>
       </w:r>
       <w:r>
         <w:t>are included within task for the following efforts. Labor is associated with maintaining the currency of Technical Orders (TOs).</w:t>
+      </w:r>
+      <w:r>
+        <w:t xml:space="preserve"> Labor is provided by {</w:t>
+      </w:r>
+      <w:proofErr w:type="spellStart"/>
+      <w:r>
+        <w:t>Labor</w:t>
+      </w:r>
+      <w:r>
+        <w:t>.</w:t>
+      </w:r>
+      <w:r>
+        <w:t>SupportList</w:t>
+      </w:r>
+      <w:proofErr w:type="spellEnd"/>
+      <w:r>
+        <w:t>}.</w:t>
       </w:r>
     </w:p>
     <w:p>
@@ -4048,7 +4246,21 @@
         <w:ind w:left="0"/>
       </w:pPr>
       <w:r>
-        <w:t>{#Labor.LaborType === “contractor”}</w:t>
+        <w:t>{#Labor.LaborType === “contractor”</w:t>
+      </w:r>
+      <w:r>
+        <w:t xml:space="preserve"> || </w:t>
+      </w:r>
+      <w:proofErr w:type="spellStart"/>
+      <w:r>
+        <w:t>Labor.LaborType</w:t>
+      </w:r>
+      <w:proofErr w:type="spellEnd"/>
+      <w:r>
+        <w:t xml:space="preserve"> === “both”</w:t>
+      </w:r>
+      <w:r>
+        <w:t>}</w:t>
       </w:r>
     </w:p>
     <w:p>
@@ -4077,18 +4289,32 @@
         <w:rPr>
           <w:rStyle w:val="Heading2Char"/>
         </w:rPr>
-        <w:t>{In</w:t>
-      </w:r>
+        <w:t>{</w:t>
+      </w:r>
+      <w:proofErr w:type="spellStart"/>
       <w:r>
         <w:rPr>
           <w:rStyle w:val="Heading2Char"/>
         </w:rPr>
-        <w:t>fo.ProgramName}</w:t>
+        <w:t>In</w:t>
       </w:r>
       <w:r>
         <w:rPr>
           <w:rStyle w:val="Heading2Char"/>
         </w:rPr>
+        <w:t>fo.ProgramName</w:t>
+      </w:r>
+      <w:proofErr w:type="spellEnd"/>
+      <w:r>
+        <w:rPr>
+          <w:rStyle w:val="Heading2Char"/>
+        </w:rPr>
+        <w:t>}</w:t>
+      </w:r>
+      <w:r>
+        <w:rPr>
+          <w:rStyle w:val="Heading2Char"/>
+        </w:rPr>
         <w:t xml:space="preserve"> </w:t>
       </w:r>
       <w:r>
@@ -4147,13 +4373,25 @@
         <w:t>s</w:t>
       </w:r>
       <w:r>
-        <w:t xml:space="preserve"> (RCs). Requirement derived from the labor cost per page and the four</w:t>
+        <w:t xml:space="preserve"> (RCs). Requirement</w:t>
+      </w:r>
+      <w:r>
+        <w:t>s</w:t>
+      </w:r>
+      <w:r>
+        <w:t xml:space="preserve"> derived from the labor cost per page and the four</w:t>
       </w:r>
       <w:r>
         <w:t>-</w:t>
       </w:r>
       <w:r>
-        <w:t xml:space="preserve">year average of change pages. Data is captured in Enhanced Technical Information Management System (ETIMS). ETIMS data is populated in the Technical Order information Sheet (TOIS) which populates Labor requirement and is attached to the </w:t>
+        <w:t>year average of change pages. Data is captured in Enhanced Technical Information Management System (ETIMS). ETIMS data is populated in the Technical Order information Sheet (TOIS) which populates Labor requirement</w:t>
+      </w:r>
+      <w:r>
+        <w:t>s</w:t>
+      </w:r>
+      <w:r>
+        <w:t xml:space="preserve"> and is attached to the </w:t>
       </w:r>
       <w:r>
         <w:t>Logistics Requirement</w:t>
@@ -4171,7 +4409,7 @@
         <w:t>LRDP</w:t>
       </w:r>
       <w:r>
-        <w:t>) brochure.</w:t>
+        <w:t>).</w:t>
       </w:r>
     </w:p>
     <w:p>
@@ -4199,16 +4437,24 @@
         </w:rPr>
         <w:t>{</w:t>
       </w:r>
+      <w:proofErr w:type="spellStart"/>
       <w:r>
         <w:rPr>
           <w:rStyle w:val="Heading2Char"/>
         </w:rPr>
-        <w:t>Info.ProgramName}</w:t>
-      </w:r>
+        <w:t>Info.ProgramName</w:t>
+      </w:r>
+      <w:proofErr w:type="spellEnd"/>
       <w:r>
         <w:rPr>
           <w:rStyle w:val="Heading2Char"/>
         </w:rPr>
+        <w:t>}</w:t>
+      </w:r>
+      <w:r>
+        <w:rPr>
+          <w:rStyle w:val="Heading2Char"/>
+        </w:rPr>
         <w:t xml:space="preserve"> </w:t>
       </w:r>
       <w:r>
@@ -4231,8 +4477,13 @@
         <w:t xml:space="preserve">requirements are labor </w:t>
       </w:r>
       <w:r>
-        <w:t>cost associated with updates to TO</w:t>
-      </w:r>
+        <w:t xml:space="preserve">cost associated with updates to </w:t>
+      </w:r>
+      <w:proofErr w:type="spellStart"/>
+      <w:r>
+        <w:t>TO</w:t>
+      </w:r>
+      <w:proofErr w:type="spellEnd"/>
       <w:r>
         <w:t xml:space="preserve"> revisions supporting the field and depot users by providing </w:t>
       </w:r>
@@ -4255,17 +4506,24 @@
         <w:t xml:space="preserve">Requirements derived from the labor cost per page and historical revision cycle calculation within the TOIS, which is attached to the </w:t>
       </w:r>
       <w:r>
-        <w:t xml:space="preserve">LRDP </w:t>
-      </w:r>
-      <w:r>
-        <w:t>brochure.</w:t>
-      </w:r>
-    </w:p>
-    <w:p>
-      <w:r>
+        <w:t>LRDP</w:t>
+      </w:r>
+      <w:r>
+        <w:t>.</w:t>
+      </w:r>
+    </w:p>
+    <w:p>
+      <w:pPr>
         <w:rPr>
           <w:b/>
         </w:rPr>
+      </w:pPr>
+    </w:p>
+    <w:p>
+      <w:r>
+        <w:rPr>
+          <w:b/>
+        </w:rPr>
         <w:t>Impact Statement:</w:t>
       </w:r>
       <w:r>
@@ -4281,7 +4539,15 @@
         <w:t xml:space="preserve">of </w:t>
       </w:r>
       <w:r>
-        <w:t>{Info.ProgramName}</w:t>
+        <w:t>{</w:t>
+      </w:r>
+      <w:proofErr w:type="spellStart"/>
+      <w:r>
+        <w:t>Info.ProgramName</w:t>
+      </w:r>
+      <w:proofErr w:type="spellEnd"/>
+      <w:r>
+        <w:t>}</w:t>
       </w:r>
       <w:r>
         <w:t xml:space="preserve"> Labor</w:t>
@@ -4350,10 +4616,10 @@
     </w:p>
     <w:p>
       <w:r>
-        <w:lastRenderedPageBreak/>
         <w:t>{#Labor.MILSTD3048Status === “current” || Labor.MILSTD3048Status === “plan”}</w:t>
       </w:r>
     </w:p>
+    <w:p/>
     <w:p>
       <w:pPr>
         <w:pStyle w:val="ListParagraph"/>
@@ -4372,13 +4638,63 @@
         <w:rPr>
           <w:rStyle w:val="Heading2Char"/>
         </w:rPr>
-        <w:t>{Info.ProgramName}</w:t>
-      </w:r>
+        <w:t>{</w:t>
+      </w:r>
+      <w:proofErr w:type="spellStart"/>
       <w:r>
         <w:rPr>
           <w:rStyle w:val="Heading2Char"/>
         </w:rPr>
-        <w:t xml:space="preserve"> S1000D Interactive Electronic Technical Manual (IETM)</w:t>
+        <w:t>Info.ProgramName</w:t>
+      </w:r>
+      <w:proofErr w:type="spellEnd"/>
+      <w:r>
+        <w:rPr>
+          <w:rStyle w:val="Heading2Char"/>
+        </w:rPr>
+        <w:t>}</w:t>
+      </w:r>
+      <w:r>
+        <w:rPr>
+          <w:rStyle w:val="Heading2Char"/>
+        </w:rPr>
+        <w:t xml:space="preserve"> </w:t>
+      </w:r>
+      <w:r>
+        <w:rPr>
+          <w:rStyle w:val="Heading2Char"/>
+        </w:rPr>
+        <w:t>MIL-STD-3</w:t>
+      </w:r>
+      <w:r>
+        <w:rPr>
+          <w:rStyle w:val="Heading2Char"/>
+        </w:rPr>
+        <w:t>048</w:t>
+      </w:r>
+      <w:r>
+        <w:rPr>
+          <w:rStyle w:val="Heading2Char"/>
+        </w:rPr>
+        <w:t xml:space="preserve"> (</w:t>
+      </w:r>
+      <w:r>
+        <w:rPr>
+          <w:rStyle w:val="Heading2Char"/>
+        </w:rPr>
+        <w:t>S1000D</w:t>
+      </w:r>
+      <w:r>
+        <w:rPr>
+          <w:rStyle w:val="Heading2Char"/>
+        </w:rPr>
+        <w:t>)</w:t>
+      </w:r>
+      <w:r>
+        <w:rPr>
+          <w:rStyle w:val="Heading2Char"/>
+        </w:rPr>
+        <w:t xml:space="preserve"> Interactive Electronic Technical Manual (IETM)</w:t>
       </w:r>
       <w:bookmarkEnd w:id="12"/>
       <w:r>
@@ -4405,10 +4721,30 @@
         <w:t xml:space="preserve"> of data within an electronic database for electronic display of </w:t>
       </w:r>
       <w:r>
-        <w:t>{Info.ProgramName}</w:t>
-      </w:r>
-      <w:r>
-        <w:t xml:space="preserve"> Technical Data. The mission of S1000D IETM is to provide data in a current format to operate in the electronic environment allowing security configuration updates from any location, at any time.</w:t>
+        <w:t>{</w:t>
+      </w:r>
+      <w:proofErr w:type="spellStart"/>
+      <w:r>
+        <w:t>Info.ProgramName</w:t>
+      </w:r>
+      <w:proofErr w:type="spellEnd"/>
+      <w:r>
+        <w:t>}</w:t>
+      </w:r>
+      <w:r>
+        <w:t xml:space="preserve"> Technical Data. The mission of </w:t>
+      </w:r>
+      <w:r>
+        <w:t>MIL-STD-3048 (</w:t>
+      </w:r>
+      <w:r>
+        <w:t>S1000D</w:t>
+      </w:r>
+      <w:r>
+        <w:t>)</w:t>
+      </w:r>
+      <w:r>
+        <w:t xml:space="preserve"> IETM is to provide data in a current format to operate in the electronic environment allowing security configuration updates from any location, at any time.</w:t>
       </w:r>
       <w:r>
         <w:t xml:space="preserve"> </w:t>
@@ -4441,7 +4777,7 @@
         <w:t>D</w:t>
       </w:r>
       <w:r>
-        <w:t xml:space="preserve"> 3048B) </w:t>
+        <w:t xml:space="preserve"> 3048) </w:t>
       </w:r>
       <w:proofErr w:type="gramStart"/>
       <w:r>
@@ -4480,10 +4816,17 @@
       </w:r>
     </w:p>
     <w:p>
-      <w:r>
+      <w:pPr>
         <w:rPr>
           <w:b/>
         </w:rPr>
+      </w:pPr>
+    </w:p>
+    <w:p>
+      <w:r>
+        <w:rPr>
+          <w:b/>
+        </w:rPr>
         <w:t>Impact statement:</w:t>
       </w:r>
       <w:r>
@@ -4511,7 +4854,15 @@
         <w:t xml:space="preserve"> </w:t>
       </w:r>
       <w:r>
-        <w:t>{Info.ProgramName}</w:t>
+        <w:t>{</w:t>
+      </w:r>
+      <w:proofErr w:type="spellStart"/>
+      <w:r>
+        <w:t>Info.ProgramName</w:t>
+      </w:r>
+      <w:proofErr w:type="spellEnd"/>
+      <w:r>
+        <w:t>}</w:t>
       </w:r>
       <w:r>
         <w:rPr>
@@ -4520,7 +4871,40 @@
         <w:t xml:space="preserve"> </w:t>
       </w:r>
       <w:r>
-        <w:t>S1000D IETM Development means a corresponding delay in completion of data conversion into S1000D industry standards, and a slip to the right of the projected timeline for completion and field use of the S1000D product funded by the requirement.</w:t>
+        <w:t>MIL-STD-3048 (</w:t>
+      </w:r>
+      <w:r>
+        <w:t>S1000D</w:t>
+      </w:r>
+      <w:r>
+        <w:t>)</w:t>
+      </w:r>
+      <w:r>
+        <w:t xml:space="preserve"> IETM Development means a corresponding delay in completion of data conversion into </w:t>
+      </w:r>
+      <w:r>
+        <w:t>MIL-STD-3048 (</w:t>
+      </w:r>
+      <w:r>
+        <w:t>S1000D</w:t>
+      </w:r>
+      <w:r>
+        <w:t>)</w:t>
+      </w:r>
+      <w:r>
+        <w:t xml:space="preserve"> industry standards, and a slip to the right of the projected timeline for completion and field use of the </w:t>
+      </w:r>
+      <w:r>
+        <w:t>MIL-STD-3048 (</w:t>
+      </w:r>
+      <w:r>
+        <w:t>S1000D</w:t>
+      </w:r>
+      <w:r>
+        <w:t>)</w:t>
+      </w:r>
+      <w:r>
+        <w:t xml:space="preserve"> product funded by the requirement.</w:t>
       </w:r>
       <w:r>
         <w:t xml:space="preserve"> </w:t>
@@ -4555,37 +4939,24 @@
       <w:r>
         <w:t xml:space="preserve"> potentially cause equipment damage or work </w:t>
       </w:r>
-      <w:proofErr w:type="gramStart"/>
       <w:r>
         <w:t>stoppage</w:t>
       </w:r>
       <w:r>
         <w:t>.</w:t>
       </w:r>
-      <w:r>
-        <w:t>{</w:t>
-      </w:r>
-      <w:proofErr w:type="gramEnd"/>
-      <w:r>
-        <w:t>/}</w:t>
-      </w:r>
-      <w:r>
-        <w:t xml:space="preserve"> </w:t>
-      </w:r>
-    </w:p>
-    <w:p>
-      <w:r>
-        <w:t>{#</w:t>
-      </w:r>
-      <w:proofErr w:type="gramStart"/>
-      <w:r>
-        <w:t>Labor.ContractorSupport.TDSSe</w:t>
-      </w:r>
-      <w:proofErr w:type="gramEnd"/>
-      <w:r>
-        <w:t xml:space="preserve"> ===”yes” &amp;&amp; Labor.ContractorSupport.TDSSeRobins === “yes”}</w:t>
-      </w:r>
-    </w:p>
+    </w:p>
+    <w:p>
+      <w:r>
+        <w:t>{/}</w:t>
+      </w:r>
+    </w:p>
+    <w:p>
+      <w:r>
+        <w:t>{#Labor.HasRobinsTDSSe === true}</w:t>
+      </w:r>
+    </w:p>
+    <w:p/>
     <w:p>
       <w:pPr>
         <w:pStyle w:val="ListParagraph"/>
@@ -4603,27 +4974,73 @@
         <w:rPr>
           <w:rStyle w:val="Heading2Char"/>
         </w:rPr>
-        <w:t>{Info.ProgramName} Product Data Services (PDS) TO Sustainment Contract</w:t>
+        <w:t>{</w:t>
+      </w:r>
+      <w:proofErr w:type="spellStart"/>
+      <w:r>
+        <w:rPr>
+          <w:rStyle w:val="Heading2Char"/>
+        </w:rPr>
+        <w:t>Info.ProgramName</w:t>
+      </w:r>
+      <w:proofErr w:type="spellEnd"/>
+      <w:r>
+        <w:rPr>
+          <w:rStyle w:val="Heading2Char"/>
+        </w:rPr>
+        <w:t>} Product Data Services (PDS) TO Sustainment Contract</w:t>
       </w:r>
       <w:bookmarkEnd w:id="13"/>
       <w:r>
-        <w:t xml:space="preserve"> task provides labor associated with the sustainment of Technical Orders (TO) to ensure the most current version of TO documents are available and accurately archived. This includes conversion of engineering drawings into text searchable .PDF files, sustainment of parts configuration data extracted from Illustrated Parts Breakdown (IPB) TOs to include conversion, validation, and identification of errors to ensure data extracted from new IPB TOs is captured, sustained, and updated for the Applications, Programs, and Indentures (API/D200F) databases. Contract labor to sustain systems utilized by the AF to manage sustainment, such as Contenta, Framemaker and graphic TO source data. Effort enables the sustainment of TO publishing systems and style libraries. Sustains conversion tool utilized to convert Standard Generalized Markup Language (SGML) to Hypertext Markup Language (HTML) to allow publishing of Type I Interactive Electronic Technical Manuals (IETM) data. Provides labor to sustain user interface tools and access to electronic TO and engineering source data, and enterprise-level search linked U.S. Air Force (USAF) data sources. Effort also provides the labor to evaluate military specifications governing structure, style, and format of TO data and to assess impacts of military specification changes on TO source data. </w:t>
-      </w:r>
-    </w:p>
-    <w:p>
-      <w:r>
+        <w:t xml:space="preserve"> task provides labor associated with the sustainment of Technical Orders (TO) to ensure the most </w:t>
+      </w:r>
+      <w:r>
+        <w:lastRenderedPageBreak/>
+        <w:t xml:space="preserve">current version of TO documents are available and accurately archived. This includes conversion of engineering drawings into text searchable .PDF files, sustainment of parts configuration data extracted from Illustrated Parts Breakdown (IPB) TOs to include conversion, validation, and identification of errors to ensure data extracted from new IPB TOs is captured, sustained, and updated for the Applications, Programs, and Indentures (API/D200F) databases. Contract labor to sustain systems utilized by the AF to manage sustainment, such as </w:t>
+      </w:r>
+      <w:proofErr w:type="spellStart"/>
+      <w:r>
+        <w:t>Contenta</w:t>
+      </w:r>
+      <w:proofErr w:type="spellEnd"/>
+      <w:r>
+        <w:t xml:space="preserve">, </w:t>
+      </w:r>
+      <w:proofErr w:type="spellStart"/>
+      <w:r>
+        <w:t>Framemaker</w:t>
+      </w:r>
+      <w:proofErr w:type="spellEnd"/>
+      <w:r>
+        <w:t xml:space="preserve"> and graphic TO source data. Effort enables the sustainment of TO publishing systems and style libraries. Sustains conversion tool utilized to convert Standard Generalized Markup Language (SGML) to Hypertext Markup Language (HTML) to allow publishing of Type I Interactive Electronic Technical Manuals (IETM) data. Provides labor to sustain user interface tools and access to electronic TO and engineering source data, and enterprise-level search linked U.S. Air Force (USAF) data sources. Effort also provides the labor to evaluate military specifications governing structure, style, and format of TO data and to assess impacts of military specification changes on TO source data. </w:t>
+      </w:r>
+    </w:p>
+    <w:p>
+      <w:pPr>
         <w:rPr>
           <w:b/>
           <w:bCs/>
         </w:rPr>
+      </w:pPr>
+    </w:p>
+    <w:p>
+      <w:r>
+        <w:rPr>
+          <w:b/>
+          <w:bCs/>
+        </w:rPr>
         <w:t>Impact Statement:</w:t>
       </w:r>
       <w:r>
-        <w:t xml:space="preserve"> Without the support of Product Data Services (PDS) TO Sustainment Contract {Info.ProgramName} technical data, the Operational Safety, Suitability, and Effectiveness (OSS&amp;E) of the mission is drastically put at risk. A reduced level of support would create an unacceptable risk to life, health, property, mission capability and the environment. This support maintains the accuracy and consistency of TOs available to users. Without technically accurate data, full mission capability cannot be realized at field level. This task follows guidance provided by AFI 63-101/20-101 which requires that current, valid, </w:t>
-      </w:r>
-      <w:r>
-        <w:lastRenderedPageBreak/>
-        <w:t xml:space="preserve">verified TOs and technical data must be provided that clearly identifies procedures and requirements necessary to preserve OSS&amp;E baselines and to diagnose, repair, calibrate, operate, and test systems or end items. </w:t>
+        <w:t xml:space="preserve"> Without the support of Product Data Services (PDS) TO Sustainment Contract {</w:t>
+      </w:r>
+      <w:proofErr w:type="spellStart"/>
+      <w:r>
+        <w:t>Info.ProgramName</w:t>
+      </w:r>
+      <w:proofErr w:type="spellEnd"/>
+      <w:r>
+        <w:t xml:space="preserve">} technical data, the Operational Safety, Suitability, and Effectiveness (OSS&amp;E) of the mission is drastically put at risk. A reduced level of support would create an unacceptable risk to life, health, property, mission capability and the environment. This support maintains the accuracy and consistency of TOs available to users. Without technically accurate data, full mission capability cannot be realized at field level. This task follows guidance provided by AFI 63-101/20-101 which requires that current, valid, verified TOs and technical data must be provided that clearly identifies procedures and requirements necessary to preserve OSS&amp;E baselines and to diagnose, repair, calibrate, operate, and test systems or end items. </w:t>
       </w:r>
     </w:p>
     <w:p/>
@@ -4646,11 +5063,19 @@
         </w:rPr>
         <w:t>{</w:t>
       </w:r>
+      <w:proofErr w:type="spellStart"/>
       <w:r>
         <w:rPr>
           <w:rStyle w:val="Heading2Char"/>
         </w:rPr>
-        <w:t>Info.ProgramName} Technical Data Support Services (TDSS) CORE Contract</w:t>
+        <w:t>Info.ProgramName</w:t>
+      </w:r>
+      <w:proofErr w:type="spellEnd"/>
+      <w:r>
+        <w:rPr>
+          <w:rStyle w:val="Heading2Char"/>
+        </w:rPr>
+        <w:t>} Technical Data Support Services (TDSS) CORE Contract</w:t>
       </w:r>
       <w:bookmarkEnd w:id="14"/>
       <w:r>
@@ -4658,26 +5083,32 @@
       </w:r>
     </w:p>
     <w:p>
-      <w:r>
+      <w:pPr>
         <w:rPr>
           <w:b/>
           <w:bCs/>
         </w:rPr>
+      </w:pPr>
+    </w:p>
+    <w:p>
+      <w:r>
+        <w:rPr>
+          <w:b/>
+          <w:bCs/>
+        </w:rPr>
         <w:t>Impact Statement:</w:t>
       </w:r>
       <w:r>
-        <w:t xml:space="preserve"> This task follows guidance provided by AFI 63-101/20-101 which requires that current, valid, verified TOs and technical data must be provided that clearly identifies procedures and requirements necessary to preserve OSS&amp;E baselines and to diagnose, repair, calibrate, operate, and test systems or end items. Without full support, the technical data and the OSS&amp;E of the mission is drastically put at risk. A reduced level of support would create an unacceptable risk to life, health, property, mission capability and the environment. This support maintains the accuracy and consistency of TOs available to users. Without technically accurate data, full mission capability cannot be realized at field </w:t>
-      </w:r>
-      <w:proofErr w:type="gramStart"/>
-      <w:r>
-        <w:t>level.</w:t>
-      </w:r>
-      <w:r>
-        <w:t>{</w:t>
-      </w:r>
-      <w:proofErr w:type="gramEnd"/>
-      <w:r>
-        <w:t>/}</w:t>
+        <w:t xml:space="preserve"> This task follows guidance provided by AFI 63-101/20-101 which requires that current, valid, verified TOs and technical data must be provided that clearly identifies procedures and requirements necessary to preserve OSS&amp;E baselines and to </w:t>
+      </w:r>
+      <w:r>
+        <w:lastRenderedPageBreak/>
+        <w:t>diagnose, repair, calibrate, operate, and test systems or end items. Without full support, the technical data and the OSS&amp;E of the mission is drastically put at risk. A reduced level of support would create an unacceptable risk to life, health, property, mission capability and the environment. This support maintains the accuracy and consistency of TOs available to users. Without technically accurate data, full mission capability cannot be realized at field level.</w:t>
+      </w:r>
+    </w:p>
+    <w:p>
+      <w:r>
+        <w:t>{/}</w:t>
       </w:r>
     </w:p>
     <w:p>
@@ -4703,12 +5134,26 @@
         <w:rPr>
           <w:rStyle w:val="Heading2Char"/>
         </w:rPr>
-        <w:t>{Info.ProgramName}</w:t>
-      </w:r>
+        <w:t>{</w:t>
+      </w:r>
+      <w:proofErr w:type="spellStart"/>
       <w:r>
         <w:rPr>
           <w:rStyle w:val="Heading2Char"/>
         </w:rPr>
+        <w:t>Info.ProgramName</w:t>
+      </w:r>
+      <w:proofErr w:type="spellEnd"/>
+      <w:r>
+        <w:rPr>
+          <w:rStyle w:val="Heading2Char"/>
+        </w:rPr>
+        <w:t>}</w:t>
+      </w:r>
+      <w:r>
+        <w:rPr>
+          <w:rStyle w:val="Heading2Char"/>
+        </w:rPr>
         <w:t xml:space="preserve"> {</w:t>
       </w:r>
       <w:r>
@@ -4724,6 +5169,17 @@
       <w:r>
         <w:t>{Description}</w:t>
       </w:r>
+    </w:p>
+    <w:p>
+      <w:pPr>
+        <w:tabs>
+          <w:tab w:val="left" w:pos="360"/>
+        </w:tabs>
+        <w:rPr>
+          <w:b/>
+          <w:bCs/>
+        </w:rPr>
+      </w:pPr>
     </w:p>
     <w:p>
       <w:pPr>
@@ -4783,16 +5239,24 @@
         </w:rPr>
         <w:t>{</w:t>
       </w:r>
+      <w:proofErr w:type="spellStart"/>
       <w:r>
         <w:rPr>
           <w:rStyle w:val="Heading1Char"/>
         </w:rPr>
-        <w:t>Info.ProgramName}</w:t>
-      </w:r>
+        <w:t>Info.ProgramName</w:t>
+      </w:r>
+      <w:proofErr w:type="spellEnd"/>
       <w:r>
         <w:rPr>
           <w:rStyle w:val="Heading1Char"/>
         </w:rPr>
+        <w:t>}</w:t>
+      </w:r>
+      <w:r>
+        <w:rPr>
+          <w:rStyle w:val="Heading1Char"/>
+        </w:rPr>
         <w:t xml:space="preserve"> </w:t>
       </w:r>
       <w:r>
@@ -4860,7 +5324,15 @@
         <w:t xml:space="preserve"> </w:t>
       </w:r>
       <w:r>
-        <w:t xml:space="preserve">{#TechnicalOrders.NumPaper &gt; 0 || TechnicalOrders.NumCDDVD &gt; </w:t>
+        <w:t xml:space="preserve">{#TechnicalOrders.NumPaper &gt; 0 || </w:t>
+      </w:r>
+      <w:proofErr w:type="spellStart"/>
+      <w:r>
+        <w:t>TechnicalOrders.NumCDDVD</w:t>
+      </w:r>
+      <w:proofErr w:type="spellEnd"/>
+      <w:r>
+        <w:t xml:space="preserve"> &gt; </w:t>
       </w:r>
       <w:proofErr w:type="gramStart"/>
       <w:r>
@@ -4945,23 +5417,32 @@
       </w:r>
       <w:proofErr w:type="gramEnd"/>
       <w:r>
-        <w:t xml:space="preserve">/}{#TechnicalOrders.NumPaper === 0 &amp;&amp; TechnicalOrders.NumCDDVD </w:t>
-      </w:r>
-      <w:r>
-        <w:lastRenderedPageBreak/>
-        <w:t xml:space="preserve">=== 0}There are no distribution requirements for </w:t>
-      </w:r>
-      <w:r>
-        <w:t>{Info.</w:t>
+        <w:t xml:space="preserve">/}{#TechnicalOrders.NumPaper === 0 &amp;&amp; </w:t>
+      </w:r>
+      <w:proofErr w:type="spellStart"/>
+      <w:r>
+        <w:t>TechnicalOrders.NumCDDVD</w:t>
+      </w:r>
+      <w:proofErr w:type="spellEnd"/>
+      <w:r>
+        <w:t xml:space="preserve"> === 0}There are no distribution requirements for </w:t>
+      </w:r>
+      <w:r>
+        <w:t>{</w:t>
+      </w:r>
+      <w:proofErr w:type="spellStart"/>
+      <w:r>
+        <w:t>Info.</w:t>
       </w:r>
       <w:r>
         <w:t>ProgramName</w:t>
       </w:r>
+      <w:proofErr w:type="spellEnd"/>
       <w:r>
         <w:t>}</w:t>
       </w:r>
       <w:r>
-        <w:t xml:space="preserve"> all TOs are distributed electronically in ETIMS.</w:t>
+        <w:t xml:space="preserve"> all TOs are distributed electronically in ETIMS.{/}</w:t>
       </w:r>
     </w:p>
     <w:p>
@@ -4971,10 +5452,43 @@
           <w:tab w:val="left" w:pos="360"/>
         </w:tabs>
         <w:ind w:left="0"/>
-        <w:rPr>
-          <w:rStyle w:val="Heading1Char"/>
-        </w:rPr>
-      </w:pPr>
+      </w:pPr>
+      <w:r>
+        <w:t>{#Distribution.hasDSO==</w:t>
+      </w:r>
+      <w:proofErr w:type="gramStart"/>
+      <w:r>
+        <w:t>=”yes</w:t>
+      </w:r>
+      <w:proofErr w:type="gramEnd"/>
+      <w:r>
+        <w:t>”</w:t>
+      </w:r>
+      <w:r>
+        <w:t xml:space="preserve"> &amp;&amp; (</w:t>
+      </w:r>
+      <w:proofErr w:type="spellStart"/>
+      <w:r>
+        <w:t>TechnicalOrders.NumPaper</w:t>
+      </w:r>
+      <w:proofErr w:type="spellEnd"/>
+      <w:r>
+        <w:t xml:space="preserve"> &gt; 0 || </w:t>
+      </w:r>
+      <w:proofErr w:type="spellStart"/>
+      <w:r>
+        <w:t>TechnicalOrders.NumCDDVD</w:t>
+      </w:r>
+      <w:proofErr w:type="spellEnd"/>
+      <w:r>
+        <w:t xml:space="preserve"> &gt; 0</w:t>
+      </w:r>
+      <w:r>
+        <w:t>)</w:t>
+      </w:r>
+      <w:r>
+        <w:t>}</w:t>
+      </w:r>
     </w:p>
     <w:p>
       <w:pPr>
@@ -4984,41 +5498,6 @@
         </w:tabs>
         <w:ind w:left="0"/>
       </w:pPr>
-      <w:r>
-        <w:t>{/}</w:t>
-      </w:r>
-    </w:p>
-    <w:p>
-      <w:pPr>
-        <w:pStyle w:val="ListParagraph"/>
-        <w:tabs>
-          <w:tab w:val="left" w:pos="360"/>
-        </w:tabs>
-        <w:ind w:left="0"/>
-      </w:pPr>
-      <w:r>
-        <w:t>{#Distribution.hasDSO==</w:t>
-      </w:r>
-      <w:proofErr w:type="gramStart"/>
-      <w:r>
-        <w:t>=”yes</w:t>
-      </w:r>
-      <w:proofErr w:type="gramEnd"/>
-      <w:r>
-        <w:t>”</w:t>
-      </w:r>
-      <w:r>
-        <w:t xml:space="preserve"> &amp;&amp; (</w:t>
-      </w:r>
-      <w:r>
-        <w:t>TechnicalOrders.NumPaper &gt; 0 || TechnicalOrders.NumCDDVD &gt; 0</w:t>
-      </w:r>
-      <w:r>
-        <w:t>)</w:t>
-      </w:r>
-      <w:r>
-        <w:t>}</w:t>
-      </w:r>
     </w:p>
     <w:p>
       <w:pPr>
@@ -5043,12 +5522,26 @@
         <w:rPr>
           <w:rStyle w:val="Heading2Char"/>
         </w:rPr>
-        <w:t>{Info.ProgramName}</w:t>
-      </w:r>
+        <w:t>{</w:t>
+      </w:r>
+      <w:proofErr w:type="spellStart"/>
       <w:r>
         <w:rPr>
           <w:rStyle w:val="Heading2Char"/>
         </w:rPr>
+        <w:t>Info.ProgramName</w:t>
+      </w:r>
+      <w:proofErr w:type="spellEnd"/>
+      <w:r>
+        <w:rPr>
+          <w:rStyle w:val="Heading2Char"/>
+        </w:rPr>
+        <w:t>}</w:t>
+      </w:r>
+      <w:r>
+        <w:rPr>
+          <w:rStyle w:val="Heading2Char"/>
+        </w:rPr>
         <w:t xml:space="preserve"> </w:t>
       </w:r>
       <w:r>
@@ -5284,10 +5777,18 @@
       </w:r>
     </w:p>
     <w:p>
-      <w:r>
+      <w:pPr>
         <w:rPr>
           <w:b/>
         </w:rPr>
+      </w:pPr>
+    </w:p>
+    <w:p>
+      <w:r>
+        <w:rPr>
+          <w:b/>
+        </w:rPr>
+        <w:lastRenderedPageBreak/>
         <w:t>Impact Statement:</w:t>
       </w:r>
       <w:r>
@@ -5297,7 +5798,15 @@
         <w:t xml:space="preserve">support of </w:t>
       </w:r>
       <w:r>
-        <w:t>{Info.ProgramName}</w:t>
+        <w:t>{</w:t>
+      </w:r>
+      <w:proofErr w:type="spellStart"/>
+      <w:r>
+        <w:t>Info.ProgramName</w:t>
+      </w:r>
+      <w:proofErr w:type="spellEnd"/>
+      <w:r>
+        <w:t>}</w:t>
       </w:r>
       <w:r>
         <w:t xml:space="preserve"> </w:t>
@@ -5366,37 +5875,50 @@
         <w:t xml:space="preserve"> or work stoppage.</w:t>
       </w:r>
     </w:p>
+    <w:p>
+      <w:r>
+        <w:t>{/}</w:t>
+      </w:r>
+    </w:p>
+    <w:p>
+      <w:r>
+        <w:t>{#Distribution.hasDSO =</w:t>
+      </w:r>
+      <w:proofErr w:type="gramStart"/>
+      <w:r>
+        <w:t>=”yes</w:t>
+      </w:r>
+      <w:proofErr w:type="gramEnd"/>
+      <w:r>
+        <w:t>”</w:t>
+      </w:r>
+      <w:r>
+        <w:t xml:space="preserve"> &amp;&amp; (</w:t>
+      </w:r>
+      <w:proofErr w:type="spellStart"/>
+      <w:r>
+        <w:t>TechnicalOrders.NumPaper</w:t>
+      </w:r>
+      <w:proofErr w:type="spellEnd"/>
+      <w:r>
+        <w:t xml:space="preserve"> &gt; 0 || </w:t>
+      </w:r>
+      <w:proofErr w:type="spellStart"/>
+      <w:r>
+        <w:t>TechnicalOrders.NumCDDVD</w:t>
+      </w:r>
+      <w:proofErr w:type="spellEnd"/>
+      <w:r>
+        <w:t xml:space="preserve"> &gt; 0</w:t>
+      </w:r>
+      <w:r>
+        <w:t>)</w:t>
+      </w:r>
+      <w:r>
+        <w:t>}</w:t>
+      </w:r>
+    </w:p>
     <w:p/>
-    <w:p>
-      <w:r>
-        <w:t>{/}</w:t>
-      </w:r>
-    </w:p>
-    <w:p>
-      <w:r>
-        <w:t>{#Distribution.hasDSO =</w:t>
-      </w:r>
-      <w:proofErr w:type="gramStart"/>
-      <w:r>
-        <w:t>=”yes</w:t>
-      </w:r>
-      <w:proofErr w:type="gramEnd"/>
-      <w:r>
-        <w:t>”</w:t>
-      </w:r>
-      <w:r>
-        <w:t xml:space="preserve"> &amp;&amp; (</w:t>
-      </w:r>
-      <w:r>
-        <w:t>TechnicalOrders.NumPaper &gt; 0 || TechnicalOrders.NumCDDVD &gt; 0</w:t>
-      </w:r>
-      <w:r>
-        <w:t>)</w:t>
-      </w:r>
-      <w:r>
-        <w:t>}</w:t>
-      </w:r>
-    </w:p>
     <w:p>
       <w:pPr>
         <w:pStyle w:val="ListParagraph"/>
@@ -5414,12 +5936,26 @@
         <w:rPr>
           <w:rStyle w:val="Heading2Char"/>
         </w:rPr>
-        <w:t>{Info.ProgramName}</w:t>
-      </w:r>
+        <w:t>{</w:t>
+      </w:r>
+      <w:proofErr w:type="spellStart"/>
       <w:r>
         <w:rPr>
           <w:rStyle w:val="Heading2Char"/>
         </w:rPr>
+        <w:t>Info.ProgramName</w:t>
+      </w:r>
+      <w:proofErr w:type="spellEnd"/>
+      <w:r>
+        <w:rPr>
+          <w:rStyle w:val="Heading2Char"/>
+        </w:rPr>
+        <w:t>}</w:t>
+      </w:r>
+      <w:r>
+        <w:rPr>
+          <w:rStyle w:val="Heading2Char"/>
+        </w:rPr>
         <w:t xml:space="preserve"> </w:t>
       </w:r>
       <w:r>
@@ -5575,10 +6111,17 @@
       </w:r>
     </w:p>
     <w:p>
-      <w:r>
+      <w:pPr>
         <w:rPr>
           <w:b/>
         </w:rPr>
+      </w:pPr>
+    </w:p>
+    <w:p>
+      <w:r>
+        <w:rPr>
+          <w:b/>
+        </w:rPr>
         <w:t>Impact Statement:</w:t>
       </w:r>
       <w:r>
@@ -5624,7 +6167,21 @@
         <w:rPr>
           <w:bCs/>
         </w:rPr>
-        <w:t>{Info.ProgramName}</w:t>
+        <w:t>{</w:t>
+      </w:r>
+      <w:proofErr w:type="spellStart"/>
+      <w:r>
+        <w:rPr>
+          <w:bCs/>
+        </w:rPr>
+        <w:t>Info.ProgramName</w:t>
+      </w:r>
+      <w:proofErr w:type="spellEnd"/>
+      <w:r>
+        <w:rPr>
+          <w:bCs/>
+        </w:rPr>
+        <w:t>}</w:t>
       </w:r>
       <w:r>
         <w:rPr>
@@ -5654,7 +6211,6 @@
         <w:t xml:space="preserve">cause </w:t>
       </w:r>
       <w:r>
-        <w:lastRenderedPageBreak/>
         <w:t>potential equipment damage,</w:t>
       </w:r>
       <w:r>
@@ -5676,41 +6232,56 @@
         <w:t>work stoppage.</w:t>
       </w:r>
     </w:p>
+    <w:p>
+      <w:r>
+        <w:t>{/}</w:t>
+      </w:r>
+    </w:p>
+    <w:p>
+      <w:r>
+        <w:t>{#Distribution.has</w:t>
+      </w:r>
+      <w:r>
+        <w:t>Outside</w:t>
+      </w:r>
+      <w:r>
+        <w:t>DSO =</w:t>
+      </w:r>
+      <w:proofErr w:type="gramStart"/>
+      <w:r>
+        <w:t>=”yes</w:t>
+      </w:r>
+      <w:proofErr w:type="gramEnd"/>
+      <w:r>
+        <w:t>”</w:t>
+      </w:r>
+      <w:r>
+        <w:t xml:space="preserve"> &amp;&amp; (</w:t>
+      </w:r>
+      <w:proofErr w:type="spellStart"/>
+      <w:r>
+        <w:t>TechnicalOrders.NumPaper</w:t>
+      </w:r>
+      <w:proofErr w:type="spellEnd"/>
+      <w:r>
+        <w:t xml:space="preserve"> &gt; 0 || </w:t>
+      </w:r>
+      <w:proofErr w:type="spellStart"/>
+      <w:r>
+        <w:t>TechnicalOrders.NumCDDVD</w:t>
+      </w:r>
+      <w:proofErr w:type="spellEnd"/>
+      <w:r>
+        <w:t xml:space="preserve"> &gt; 0</w:t>
+      </w:r>
+      <w:r>
+        <w:t>)</w:t>
+      </w:r>
+      <w:r>
+        <w:t>}</w:t>
+      </w:r>
+    </w:p>
     <w:p/>
-    <w:p>
-      <w:r>
-        <w:t>{</w:t>
-      </w:r>
-      <w:proofErr w:type="gramStart"/>
-      <w:r>
-        <w:t>/}</w:t>
-      </w:r>
-      <w:r>
-        <w:t>{</w:t>
-      </w:r>
-      <w:proofErr w:type="gramEnd"/>
-      <w:r>
-        <w:t>#Distribution.has</w:t>
-      </w:r>
-      <w:r>
-        <w:t>Outside</w:t>
-      </w:r>
-      <w:r>
-        <w:t>DSO ==”yes”</w:t>
-      </w:r>
-      <w:r>
-        <w:t xml:space="preserve"> &amp;&amp; (</w:t>
-      </w:r>
-      <w:r>
-        <w:t>TechnicalOrders.NumPaper &gt; 0 || TechnicalOrders.NumCDDVD &gt; 0</w:t>
-      </w:r>
-      <w:r>
-        <w:t>)</w:t>
-      </w:r>
-      <w:r>
-        <w:t>}</w:t>
-      </w:r>
-    </w:p>
     <w:p>
       <w:pPr>
         <w:pStyle w:val="ListParagraph"/>
@@ -5728,12 +6299,26 @@
         <w:rPr>
           <w:rStyle w:val="Heading2Char"/>
         </w:rPr>
-        <w:t>{Info.ProgramName}</w:t>
-      </w:r>
+        <w:t>{</w:t>
+      </w:r>
+      <w:proofErr w:type="spellStart"/>
       <w:r>
         <w:rPr>
           <w:rStyle w:val="Heading2Char"/>
         </w:rPr>
+        <w:t>Info.ProgramName</w:t>
+      </w:r>
+      <w:proofErr w:type="spellEnd"/>
+      <w:r>
+        <w:rPr>
+          <w:rStyle w:val="Heading2Char"/>
+        </w:rPr>
+        <w:t>}</w:t>
+      </w:r>
+      <w:r>
+        <w:rPr>
+          <w:rStyle w:val="Heading2Char"/>
+        </w:rPr>
         <w:t xml:space="preserve"> </w:t>
       </w:r>
       <w:r>
@@ -5916,10 +6501,17 @@
       </w:r>
     </w:p>
     <w:p>
-      <w:r>
+      <w:pPr>
         <w:rPr>
           <w:b/>
         </w:rPr>
+      </w:pPr>
+    </w:p>
+    <w:p>
+      <w:r>
+        <w:rPr>
+          <w:b/>
+        </w:rPr>
         <w:t>Impact Statement</w:t>
       </w:r>
       <w:r>
@@ -5971,7 +6563,21 @@
         <w:rPr>
           <w:bCs/>
         </w:rPr>
-        <w:t>{Info.ProgramName}</w:t>
+        <w:t>{</w:t>
+      </w:r>
+      <w:proofErr w:type="spellStart"/>
+      <w:r>
+        <w:rPr>
+          <w:bCs/>
+        </w:rPr>
+        <w:t>Info.ProgramName</w:t>
+      </w:r>
+      <w:proofErr w:type="spellEnd"/>
+      <w:r>
+        <w:rPr>
+          <w:bCs/>
+        </w:rPr>
+        <w:t>}</w:t>
       </w:r>
       <w:r>
         <w:rPr>
@@ -6045,6 +6651,7 @@
         <w:t xml:space="preserve"> Date waiver approved: </w:t>
       </w:r>
       <w:r>
+        <w:lastRenderedPageBreak/>
         <w:t>{Distribution.</w:t>
       </w:r>
       <w:r>
@@ -6071,6 +6678,7 @@
         <w:t>{/}</w:t>
       </w:r>
     </w:p>
+    <w:p/>
     <w:p>
       <w:pPr>
         <w:pStyle w:val="ListParagraph"/>
@@ -6088,12 +6696,26 @@
         <w:rPr>
           <w:rStyle w:val="Heading1Char"/>
         </w:rPr>
-        <w:t>{Info.ProgramName}</w:t>
-      </w:r>
+        <w:t>{</w:t>
+      </w:r>
+      <w:proofErr w:type="spellStart"/>
       <w:r>
         <w:rPr>
           <w:rStyle w:val="Heading1Char"/>
         </w:rPr>
+        <w:t>Info.ProgramName</w:t>
+      </w:r>
+      <w:proofErr w:type="spellEnd"/>
+      <w:r>
+        <w:rPr>
+          <w:rStyle w:val="Heading1Char"/>
+        </w:rPr>
+        <w:t>}</w:t>
+      </w:r>
+      <w:r>
+        <w:rPr>
+          <w:rStyle w:val="Heading1Char"/>
+        </w:rPr>
         <w:t xml:space="preserve"> </w:t>
       </w:r>
       <w:r>
@@ -6131,8 +6753,13 @@
         <w:t xml:space="preserve"> </w:t>
       </w:r>
       <w:r>
-        <w:t>There are currently no improvement requirements for {Info.ProgramName</w:t>
-      </w:r>
+        <w:t>There are currently no improvement requirements for {</w:t>
+      </w:r>
+      <w:proofErr w:type="spellStart"/>
+      <w:r>
+        <w:t>Info.ProgramName</w:t>
+      </w:r>
+      <w:proofErr w:type="spellEnd"/>
       <w:proofErr w:type="gramStart"/>
       <w:r>
         <w:t>}.{</w:t>
@@ -6143,15 +6770,6 @@
       </w:r>
     </w:p>
     <w:p>
-      <w:pPr>
-        <w:pStyle w:val="ListParagraph"/>
-        <w:tabs>
-          <w:tab w:val="left" w:pos="360"/>
-        </w:tabs>
-        <w:ind w:left="0"/>
-      </w:pPr>
-    </w:p>
-    <w:p>
       <w:r>
         <w:t>{#</w:t>
       </w:r>
@@ -6168,6 +6786,7 @@
         <w:t>}</w:t>
       </w:r>
     </w:p>
+    <w:p/>
     <w:p>
       <w:pPr>
         <w:pStyle w:val="ListParagraph"/>
@@ -6201,8 +6820,13 @@
     <w:p>
       <w:pPr>
         <w:pStyle w:val="ListParagraph"/>
-        <w:ind w:left="360"/>
-      </w:pPr>
+        <w:tabs>
+          <w:tab w:val="left" w:pos="360"/>
+        </w:tabs>
+        <w:ind w:left="0"/>
+      </w:pPr>
+    </w:p>
+    <w:p>
       <w:proofErr w:type="gramStart"/>
       <w:r>
         <w:rPr>
@@ -6220,16 +6844,11 @@
       </w:r>
     </w:p>
     <w:p>
-      <w:pPr>
-        <w:pStyle w:val="ListParagraph"/>
-        <w:ind w:left="360"/>
-      </w:pPr>
-    </w:p>
-    <w:p>
       <w:r>
         <w:t>{/}</w:t>
       </w:r>
     </w:p>
+    <w:p/>
     <w:p>
       <w:pPr>
         <w:pStyle w:val="ListParagraph"/>
@@ -6237,6 +6856,10 @@
           <w:ilvl w:val="0"/>
           <w:numId w:val="23"/>
         </w:numPr>
+        <w:tabs>
+          <w:tab w:val="left" w:pos="360"/>
+        </w:tabs>
+        <w:ind w:left="0" w:firstLine="0"/>
         <w:rPr>
           <w:b/>
         </w:rPr>
@@ -6332,25 +6955,47 @@
         <w:rPr>
           <w:rStyle w:val="Heading1Char"/>
         </w:rPr>
-        <w:t xml:space="preserve">Task </w:t>
+        <w:t>Task Prioritization</w:t>
+      </w:r>
+      <w:bookmarkEnd w:id="23"/>
+      <w:r>
+        <w:t>:</w:t>
+      </w:r>
+      <w:r>
+        <w:t xml:space="preserve"> </w:t>
+      </w:r>
+      <w:r>
+        <w:t>{#LRDP.hasLRDP === “no</w:t>
       </w:r>
       <w:proofErr w:type="gramStart"/>
       <w:r>
-        <w:rPr>
-          <w:rStyle w:val="Heading1Char"/>
-        </w:rPr>
-        <w:t>Prioritization</w:t>
-      </w:r>
-      <w:bookmarkEnd w:id="23"/>
-      <w:r>
-        <w:t>:</w:t>
-      </w:r>
-      <w:r>
-        <w:t>{</w:t>
+        <w:t>”}</w:t>
+      </w:r>
+      <w:r>
+        <w:t>There</w:t>
       </w:r>
       <w:proofErr w:type="gramEnd"/>
       <w:r>
-        <w:t>#LRDP.LRDP}</w:t>
+        <w:t xml:space="preserve"> are no LRDP tasks.</w:t>
+      </w:r>
+      <w:r>
+        <w:t>{/}</w:t>
+      </w:r>
+    </w:p>
+    <w:p>
+      <w:r>
+        <w:t>{#LRDP.hasLRDP === “yes”}</w:t>
+      </w:r>
+    </w:p>
+    <w:p/>
+    <w:p>
+      <w:r>
+        <w:t>{/}</w:t>
+      </w:r>
+    </w:p>
+    <w:p>
+      <w:r>
+        <w:t>{#LRDP.LRDP}</w:t>
       </w:r>
     </w:p>
     <w:p>
@@ -6377,38 +7022,18 @@
         <w:t xml:space="preserve"> </w:t>
       </w:r>
       <w:r>
-        <w:t>{SeqNum</w:t>
-      </w:r>
-      <w:proofErr w:type="gramStart"/>
-      <w:r>
-        <w:t>}{</w:t>
-      </w:r>
-      <w:proofErr w:type="gramEnd"/>
-      <w:r>
-        <w:t>/}</w:t>
-      </w:r>
-    </w:p>
-    <w:p>
-      <w:pPr>
-        <w:ind w:left="360"/>
-      </w:pPr>
-      <w:r>
-        <w:t>{#LRDP.hasLRDP === “no</w:t>
-      </w:r>
-      <w:proofErr w:type="gramStart"/>
-      <w:r>
-        <w:t>”</w:t>
-      </w:r>
+        <w:t>{</w:t>
+      </w:r>
+      <w:proofErr w:type="spellStart"/>
+      <w:r>
+        <w:t>SeqNum</w:t>
+      </w:r>
+      <w:proofErr w:type="spellEnd"/>
       <w:r>
         <w:t>}</w:t>
       </w:r>
-      <w:r>
-        <w:t>There</w:t>
-      </w:r>
-      <w:proofErr w:type="gramEnd"/>
-      <w:r>
-        <w:t xml:space="preserve"> are no LRDP tasks.</w:t>
-      </w:r>
+    </w:p>
+    <w:p>
       <w:r>
         <w:t>{/}</w:t>
       </w:r>
@@ -6417,10 +7042,12 @@
     <w:p>
       <w:pPr>
         <w:pStyle w:val="ListParagraph"/>
+        <w:keepNext/>
         <w:numPr>
           <w:ilvl w:val="0"/>
           <w:numId w:val="42"/>
         </w:numPr>
+        <w:ind w:right="187"/>
         <w:rPr>
           <w:b/>
           <w:bCs/>
@@ -6456,7 +7083,6 @@
     </w:p>
     <w:p>
       <w:r>
-        <w:lastRenderedPageBreak/>
         <w:t>{#Info.ProgramManagers.length &gt;=1}</w:t>
       </w:r>
       <w:r>
@@ -6525,6 +7151,7 @@
         <w:t xml:space="preserve">   </w:t>
       </w:r>
       <w:r>
+        <w:lastRenderedPageBreak/>
         <w:t>{/}</w:t>
       </w:r>
       <w:r>
@@ -6537,7 +7164,7 @@
         </w:rPr>
         <w:pict w14:anchorId="13D035FB">
           <v:shape id="_x0000_i1027" type="#_x0000_t75" alt="Microsoft Office Signature Line..." style="width:192pt;height:96pt">
-            <v:imagedata r:id="rId12" o:title=""/>
+            <v:imagedata r:id="rId11" o:title=""/>
             <o:lock v:ext="edit" ungrouping="t" rotation="t" cropping="t" verticies="t" text="t" grouping="t"/>
             <o:signatureline v:ext="edit" id="{BD27A615-C575-40DE-9949-C2672517FB96}" provid="{00000000-0000-0000-0000-000000000000}" o:suggestedsigner="FirstName LastName" o:suggestedsigner2="Program Manager" o:suggestedsigneremail="Email" issignatureline="t"/>
           </v:shape>
@@ -6599,7 +7226,7 @@
       <w:r>
         <w:pict w14:anchorId="6F72759C">
           <v:shape id="_x0000_i1030" type="#_x0000_t75" alt="Microsoft Office Signature Line..." style="width:192pt;height:96pt">
-            <v:imagedata r:id="rId13" o:title=""/>
+            <v:imagedata r:id="rId12" o:title=""/>
             <o:lock v:ext="edit" ungrouping="t" rotation="t" cropping="t" verticies="t" text="t" grouping="t"/>
             <o:signatureline v:ext="edit" id="{78E9923A-2250-41BC-9212-73A6B8F35EFC}" provid="{00000000-0000-0000-0000-000000000000}" o:suggestedsigner="FirstName LastName" o:suggestedsigner2="Program Manager" o:suggestedsigneremail="Email" issignatureline="t"/>
           </v:shape>
@@ -6609,7 +7236,6 @@
         <w:t xml:space="preserve">   </w:t>
       </w:r>
       <w:r>
-        <w:lastRenderedPageBreak/>
         <w:t>{/}</w:t>
       </w:r>
       <w:r>
@@ -6618,7 +7244,7 @@
       <w:r>
         <w:pict w14:anchorId="261B6BC8">
           <v:shape id="_x0000_i1031" type="#_x0000_t75" alt="Microsoft Office Signature Line..." style="width:192pt;height:96pt">
-            <v:imagedata r:id="rId13" o:title=""/>
+            <v:imagedata r:id="rId12" o:title=""/>
             <o:lock v:ext="edit" ungrouping="t" rotation="t" cropping="t" verticies="t" text="t" grouping="t"/>
             <o:signatureline v:ext="edit" id="{A6CECDB8-5BFD-4C06-9C95-4A9E30C691EB}" provid="{00000000-0000-0000-0000-000000000000}" o:suggestedsigner="FirstName LastName" o:suggestedsigner2="Program Manager" o:suggestedsigneremail="Email" issignatureline="t"/>
           </v:shape>
@@ -6636,7 +7262,7 @@
       <w:r>
         <w:pict w14:anchorId="50CDE46C">
           <v:shape id="_x0000_i1032" type="#_x0000_t75" alt="Microsoft Office Signature Line..." style="width:192pt;height:96pt">
-            <v:imagedata r:id="rId14" o:title=""/>
+            <v:imagedata r:id="rId12" o:title=""/>
             <o:lock v:ext="edit" ungrouping="t" rotation="t" cropping="t" verticies="t" text="t" grouping="t"/>
             <o:signatureline v:ext="edit" id="{738798CE-9880-4897-9C74-5D50139E818C}" provid="{00000000-0000-0000-0000-000000000000}" o:suggestedsigner="FirstName LastName" o:suggestedsigner2="Program Manager" o:suggestedsigneremail="Email" issignatureline="t"/>
           </v:shape>
@@ -6650,16 +7276,19 @@
     <w:p>
       <w:pPr>
         <w:pStyle w:val="ListParagraph"/>
+        <w:keepNext/>
         <w:numPr>
           <w:ilvl w:val="0"/>
           <w:numId w:val="40"/>
         </w:numPr>
+        <w:ind w:right="187"/>
       </w:pPr>
       <w:bookmarkStart w:id="25" w:name="_Toc179957445"/>
       <w:r>
         <w:rPr>
           <w:rStyle w:val="Heading1Char"/>
         </w:rPr>
+        <w:lastRenderedPageBreak/>
         <w:t>Technical Order Manager Approval</w:t>
       </w:r>
       <w:bookmarkEnd w:id="25"/>
@@ -6669,26 +7298,18 @@
     </w:p>
     <w:p>
       <w:r>
-        <w:t>{#</w:t>
-      </w:r>
-      <w:proofErr w:type="gramStart"/>
-      <w:r>
-        <w:t>Info.</w:t>
+        <w:t>{#Info.</w:t>
       </w:r>
       <w:r>
         <w:t>TechOrderManagers</w:t>
       </w:r>
       <w:r>
-        <w:t>.length</w:t>
-      </w:r>
-      <w:proofErr w:type="gramEnd"/>
-      <w:r>
-        <w:t xml:space="preserve"> &gt;=1}</w:t>
+        <w:t>.length &gt;=1}</w:t>
       </w:r>
       <w:r>
         <w:pict w14:anchorId="0EB326D8">
           <v:shape id="_x0000_i1033" type="#_x0000_t75" alt="Microsoft Office Signature Line..." style="width:192pt;height:96pt">
-            <v:imagedata r:id="rId15" o:title=""/>
+            <v:imagedata r:id="rId13" o:title=""/>
             <o:lock v:ext="edit" ungrouping="t" rotation="t" cropping="t" verticies="t" text="t" grouping="t"/>
             <o:signatureline v:ext="edit" id="{F0D72538-6F55-4837-920F-9520253F9B5F}" provid="{00000000-0000-0000-0000-000000000000}" o:suggestedsigner="TO FirstName LastName" o:suggestedsigner2="Technical Order Manager" o:suggestedsigneremail="TO Email" issignatureline="t"/>
           </v:shape>
@@ -6703,7 +7324,7 @@
       <w:r>
         <w:pict w14:anchorId="3C8CAD91">
           <v:shape id="_x0000_i1034" type="#_x0000_t75" alt="Microsoft Office Signature Line..." style="width:192pt;height:96pt">
-            <v:imagedata r:id="rId16" o:title=""/>
+            <v:imagedata r:id="rId13" o:title=""/>
             <o:lock v:ext="edit" ungrouping="t" rotation="t" cropping="t" verticies="t" text="t" grouping="t"/>
             <o:signatureline v:ext="edit" id="{8664F99E-BCC5-41F2-8956-EB21F8C91E79}" provid="{00000000-0000-0000-0000-000000000000}" o:suggestedsigner="TO FirstName LastName" o:suggestedsigner2="Technical Order Manager" o:suggestedsigneremail="TO Email" issignatureline="t"/>
           </v:shape>
@@ -6715,133 +7336,71 @@
       <w:r>
         <w:pict w14:anchorId="1073A289">
           <v:shape id="_x0000_i1035" type="#_x0000_t75" alt="Microsoft Office Signature Line..." style="width:192pt;height:96pt">
-            <v:imagedata r:id="rId17" o:title=""/>
+            <v:imagedata r:id="rId13" o:title=""/>
             <o:lock v:ext="edit" ungrouping="t" rotation="t" cropping="t" verticies="t" text="t" grouping="t"/>
             <o:signatureline v:ext="edit" id="{FEB257D3-9AC1-49DF-930B-18FDA7B7B0C5}" provid="{00000000-0000-0000-0000-000000000000}" o:suggestedsigner="TO FirstName LastName" o:suggestedsigner2="Technical Order Manager" o:suggestedsigneremail="TO Email" issignatureline="t"/>
           </v:shape>
         </w:pict>
       </w:r>
       <w:r>
-        <w:t>{/}</w:t>
-      </w:r>
-    </w:p>
-    <w:p>
-      <w:r>
-        <w:t xml:space="preserve">  {#</w:t>
-      </w:r>
-      <w:proofErr w:type="gramStart"/>
-      <w:r>
-        <w:t>Info.TechOrderManagers.length</w:t>
-      </w:r>
-      <w:proofErr w:type="gramEnd"/>
-      <w:r>
-        <w:t xml:space="preserve"> &gt;=4}</w:t>
+        <w:t>{/}  {#Info.TechOrderManagers.length &gt;=4}</w:t>
       </w:r>
       <w:r>
         <w:pict w14:anchorId="0D79D61D">
           <v:shape id="_x0000_i1036" type="#_x0000_t75" alt="Microsoft Office Signature Line..." style="width:192pt;height:96pt">
-            <v:imagedata r:id="rId17" o:title=""/>
+            <v:imagedata r:id="rId14" o:title=""/>
             <o:lock v:ext="edit" ungrouping="t" rotation="t" cropping="t" verticies="t" text="t" grouping="t"/>
             <o:signatureline v:ext="edit" id="{6C4D4D72-FD9C-4DBE-AF52-7CF8E787BE36}" provid="{00000000-0000-0000-0000-000000000000}" o:suggestedsigner="TO FirstName LastName" o:suggestedsigner2="Technical Order Manager" o:suggestedsigneremail="TO Email" issignatureline="t"/>
           </v:shape>
         </w:pict>
       </w:r>
       <w:r>
-        <w:t>{/}</w:t>
-      </w:r>
-    </w:p>
-    <w:p>
-      <w:r>
-        <w:lastRenderedPageBreak/>
-        <w:t xml:space="preserve">  {#</w:t>
-      </w:r>
-      <w:proofErr w:type="gramStart"/>
-      <w:r>
-        <w:t>Info.TechOrderManagers.length</w:t>
-      </w:r>
-      <w:proofErr w:type="gramEnd"/>
-      <w:r>
-        <w:t xml:space="preserve"> &gt;=5}</w:t>
+        <w:t>{/}  {#Info.TechOrderManagers.length &gt;=5}</w:t>
       </w:r>
       <w:r>
         <w:pict w14:anchorId="289F72EC">
           <v:shape id="_x0000_i1037" type="#_x0000_t75" alt="Microsoft Office Signature Line..." style="width:192pt;height:96pt">
-            <v:imagedata r:id="rId18" o:title=""/>
+            <v:imagedata r:id="rId13" o:title=""/>
             <o:lock v:ext="edit" ungrouping="t" rotation="t" cropping="t" verticies="t" text="t" grouping="t"/>
             <o:signatureline v:ext="edit" id="{01218CBD-1AC9-4D24-91F0-21C1AAD49B2A}" provid="{00000000-0000-0000-0000-000000000000}" o:suggestedsigner="TO FirstName LastName" o:suggestedsigner2="Technical Order Manager" o:suggestedsigneremail="TO Email" issignatureline="t"/>
           </v:shape>
         </w:pict>
       </w:r>
       <w:r>
-        <w:t>{/}</w:t>
-      </w:r>
-    </w:p>
-    <w:p>
-      <w:r>
-        <w:t xml:space="preserve">  {#</w:t>
-      </w:r>
-      <w:proofErr w:type="gramStart"/>
-      <w:r>
-        <w:t>Info.TechOrderManagers.length</w:t>
-      </w:r>
-      <w:proofErr w:type="gramEnd"/>
-      <w:r>
-        <w:t xml:space="preserve"> &gt;=6}</w:t>
+        <w:t>{/}  {#Info.TechOrderManagers.length &gt;=6}</w:t>
       </w:r>
       <w:r>
         <w:pict w14:anchorId="48EA1299">
           <v:shape id="_x0000_i1038" type="#_x0000_t75" alt="Microsoft Office Signature Line..." style="width:192pt;height:96pt">
-            <v:imagedata r:id="rId19" o:title=""/>
+            <v:imagedata r:id="rId13" o:title=""/>
             <o:lock v:ext="edit" ungrouping="t" rotation="t" cropping="t" verticies="t" text="t" grouping="t"/>
             <o:signatureline v:ext="edit" id="{FCBE8BA4-D3AD-4BC3-8449-72C754272415}" provid="{00000000-0000-0000-0000-000000000000}" o:suggestedsigner="TO FirstName LastName" o:suggestedsigner2="Technical Order Manager" o:suggestedsigneremail="TO Email" issignatureline="t"/>
           </v:shape>
         </w:pict>
       </w:r>
       <w:r>
-        <w:t>{/}</w:t>
-      </w:r>
-    </w:p>
-    <w:p>
-      <w:r>
-        <w:t xml:space="preserve">  {#</w:t>
-      </w:r>
-      <w:proofErr w:type="gramStart"/>
-      <w:r>
-        <w:t>Info.TechOrderManagers.length</w:t>
-      </w:r>
-      <w:proofErr w:type="gramEnd"/>
-      <w:r>
-        <w:t xml:space="preserve"> &gt;=7}</w:t>
+        <w:t xml:space="preserve">{/}  </w:t>
+      </w:r>
+      <w:r>
+        <w:lastRenderedPageBreak/>
+        <w:t>{#Info.TechOrderManagers.length &gt;=7}</w:t>
       </w:r>
       <w:r>
         <w:pict w14:anchorId="45399C94">
           <v:shape id="_x0000_i1039" type="#_x0000_t75" alt="Microsoft Office Signature Line..." style="width:192pt;height:96pt">
-            <v:imagedata r:id="rId17" o:title=""/>
+            <v:imagedata r:id="rId15" o:title=""/>
             <o:lock v:ext="edit" ungrouping="t" rotation="t" cropping="t" verticies="t" text="t" grouping="t"/>
             <o:signatureline v:ext="edit" id="{12E432A9-E904-404C-BBD0-AF8260FD6E04}" provid="{00000000-0000-0000-0000-000000000000}" o:suggestedsigner="TO FirstName LastName" o:suggestedsigner2="Technical Order Manager" o:suggestedsigneremail="TO Email" issignatureline="t"/>
           </v:shape>
         </w:pict>
       </w:r>
       <w:r>
-        <w:t>{/}</w:t>
-      </w:r>
-    </w:p>
-    <w:p>
-      <w:r>
-        <w:t xml:space="preserve">  {#</w:t>
-      </w:r>
-      <w:proofErr w:type="gramStart"/>
-      <w:r>
-        <w:t>Info.TechOrderManagers.length</w:t>
-      </w:r>
-      <w:proofErr w:type="gramEnd"/>
-      <w:r>
-        <w:t xml:space="preserve"> &gt;=8}</w:t>
+        <w:t>{/}  {#Info.TechOrderManagers.length &gt;=8}</w:t>
       </w:r>
       <w:r>
         <w:pict w14:anchorId="6DF92DE1">
           <v:shape id="_x0000_i1040" type="#_x0000_t75" alt="Microsoft Office Signature Line..." style="width:192pt;height:96pt">
-            <v:imagedata r:id="rId17" o:title=""/>
+            <v:imagedata r:id="rId15" o:title=""/>
             <o:lock v:ext="edit" ungrouping="t" rotation="t" cropping="t" verticies="t" text="t" grouping="t"/>
             <o:signatureline v:ext="edit" id="{00F933D7-8294-4244-95B5-379E40936944}" provid="{00000000-0000-0000-0000-000000000000}" o:suggestedsigner="TO FirstName LastName" o:suggestedsigner2="Technical Order Manager" o:suggestedsigneremail="TO Email" issignatureline="t"/>
           </v:shape>
@@ -6851,9 +7410,8 @@
         <w:t>{/}</w:t>
       </w:r>
     </w:p>
-    <w:p/>
     <w:sectPr>
-      <w:footerReference w:type="default" r:id="rId20"/>
+      <w:footerReference w:type="default" r:id="rId16"/>
       <w:pgSz w:w="12240" w:h="15840"/>
       <w:pgMar w:top="1440" w:right="1440" w:bottom="1440" w:left="1440" w:header="720" w:footer="720" w:gutter="0"/>
       <w:cols w:space="720"/>
@@ -6879,6 +7437,9 @@
         <w:continuationSeparator/>
       </w:r>
     </w:p>
+  </w:endnote>
+  <w:endnote w:type="continuationNotice" w:id="1">
+    <w:p/>
   </w:endnote>
 </w:endnotes>
 </file>
@@ -6951,6 +7512,9 @@
         <w:continuationSeparator/>
       </w:r>
     </w:p>
+  </w:footnote>
+  <w:footnote w:type="continuationNotice" w:id="1">
+    <w:p/>
   </w:footnote>
 </w:footnotes>
 </file>
@@ -12392,15 +12956,22 @@
 </file>
 
 <file path=customXml/item1.xml><?xml version="1.0" encoding="utf-8"?>
-<p:properties xmlns:p="http://schemas.microsoft.com/office/2006/metadata/properties" xmlns:xsi="http://www.w3.org/2001/XMLSchema-instance">
-  <documentManagement/>
-</p:properties>
+<b:Sources xmlns:b="http://schemas.openxmlformats.org/officeDocument/2006/bibliography" xmlns="http://schemas.openxmlformats.org/officeDocument/2006/bibliography" SelectedStyle="\APA.XSL" StyleName="APA"/>
 </file>
 
 <file path=customXml/item2.xml><?xml version="1.0" encoding="utf-8"?>
-<ct:contentTypeSchema xmlns:ct="http://schemas.microsoft.com/office/2006/metadata/contentType" xmlns:ma="http://schemas.microsoft.com/office/2006/metadata/properties/metaAttributes" ct:_="" ma:_="" ma:contentTypeName="Document" ma:contentTypeID="0x010100A253B644FCFAD7409EBAFCD290AA2418" ma:contentTypeVersion="8" ma:contentTypeDescription="Create a new document." ma:contentTypeScope="" ma:versionID="5be701be97b5a7d030840f97951bd63f">
-  <xsd:schema xmlns:xsd="http://www.w3.org/2001/XMLSchema" xmlns:xs="http://www.w3.org/2001/XMLSchema" xmlns:p="http://schemas.microsoft.com/office/2006/metadata/properties" xmlns:ns2="92ee4270-9d09-435c-8163-9480e84d542c" targetNamespace="http://schemas.microsoft.com/office/2006/metadata/properties" ma:root="true" ma:fieldsID="e754431ea33e719513553115a5b5b6cf" ns2:_="">
-    <xsd:import namespace="92ee4270-9d09-435c-8163-9480e84d542c"/>
+<?mso-contentType ?>
+<FormTemplates xmlns="http://schemas.microsoft.com/sharepoint/v3/contenttype/forms">
+  <Display>DocumentLibraryForm</Display>
+  <Edit>DocumentLibraryForm</Edit>
+  <New>DocumentLibraryForm</New>
+</FormTemplates>
+</file>
+
+<file path=customXml/item3.xml><?xml version="1.0" encoding="utf-8"?>
+<ct:contentTypeSchema xmlns:ct="http://schemas.microsoft.com/office/2006/metadata/contentType" xmlns:ma="http://schemas.microsoft.com/office/2006/metadata/properties/metaAttributes" ct:_="" ma:_="" ma:contentTypeName="Document" ma:contentTypeID="0x01010000EF9B9C82148C4B96D58E6838E54CC6" ma:contentTypeVersion="4" ma:contentTypeDescription="Create a new document." ma:contentTypeScope="" ma:versionID="f7eb6c66a49a738c5fd4ff62331d6ffd">
+  <xsd:schema xmlns:xsd="http://www.w3.org/2001/XMLSchema" xmlns:xs="http://www.w3.org/2001/XMLSchema" xmlns:p="http://schemas.microsoft.com/office/2006/metadata/properties" xmlns:ns2="32ddce0a-34ac-41bc-9466-633fbe02521d" targetNamespace="http://schemas.microsoft.com/office/2006/metadata/properties" ma:root="true" ma:fieldsID="41ca030284368ea82b9a477977a483ee" ns2:_="">
+    <xsd:import namespace="32ddce0a-34ac-41bc-9466-633fbe02521d"/>
     <xsd:element name="properties">
       <xsd:complexType>
         <xsd:sequence>
@@ -12411,10 +12982,6 @@
                 <xsd:element ref="ns2:MediaServiceFastMetadata" minOccurs="0"/>
                 <xsd:element ref="ns2:MediaServiceSearchProperties" minOccurs="0"/>
                 <xsd:element ref="ns2:MediaServiceObjectDetectorVersions" minOccurs="0"/>
-                <xsd:element ref="ns2:MediaServiceDateTaken" minOccurs="0"/>
-                <xsd:element ref="ns2:MediaServiceGenerationTime" minOccurs="0"/>
-                <xsd:element ref="ns2:MediaServiceEventHashCode" minOccurs="0"/>
-                <xsd:element ref="ns2:MediaLengthInSeconds" minOccurs="0"/>
               </xsd:all>
             </xsd:complexType>
           </xsd:element>
@@ -12422,7 +12989,7 @@
       </xsd:complexType>
     </xsd:element>
   </xsd:schema>
-  <xsd:schema xmlns:xsd="http://www.w3.org/2001/XMLSchema" xmlns:xs="http://www.w3.org/2001/XMLSchema" xmlns:dms="http://schemas.microsoft.com/office/2006/documentManagement/types" xmlns:pc="http://schemas.microsoft.com/office/infopath/2007/PartnerControls" targetNamespace="92ee4270-9d09-435c-8163-9480e84d542c" elementFormDefault="qualified">
+  <xsd:schema xmlns:xsd="http://www.w3.org/2001/XMLSchema" xmlns:xs="http://www.w3.org/2001/XMLSchema" xmlns:dms="http://schemas.microsoft.com/office/2006/documentManagement/types" xmlns:pc="http://schemas.microsoft.com/office/infopath/2007/PartnerControls" targetNamespace="32ddce0a-34ac-41bc-9466-633fbe02521d" elementFormDefault="qualified">
     <xsd:import namespace="http://schemas.microsoft.com/office/2006/documentManagement/types"/>
     <xsd:import namespace="http://schemas.microsoft.com/office/infopath/2007/PartnerControls"/>
     <xsd:element name="MediaServiceMetadata" ma:index="8" nillable="true" ma:displayName="MediaServiceMetadata" ma:hidden="true" ma:internalName="MediaServiceMetadata" ma:readOnly="true">
@@ -12443,26 +13010,6 @@
     <xsd:element name="MediaServiceObjectDetectorVersions" ma:index="11" nillable="true" ma:displayName="MediaServiceObjectDetectorVersions" ma:hidden="true" ma:indexed="true" ma:internalName="MediaServiceObjectDetectorVersions" ma:readOnly="true">
       <xsd:simpleType>
         <xsd:restriction base="dms:Text"/>
-      </xsd:simpleType>
-    </xsd:element>
-    <xsd:element name="MediaServiceDateTaken" ma:index="12" nillable="true" ma:displayName="MediaServiceDateTaken" ma:hidden="true" ma:indexed="true" ma:internalName="MediaServiceDateTaken" ma:readOnly="true">
-      <xsd:simpleType>
-        <xsd:restriction base="dms:Text"/>
-      </xsd:simpleType>
-    </xsd:element>
-    <xsd:element name="MediaServiceGenerationTime" ma:index="13" nillable="true" ma:displayName="MediaServiceGenerationTime" ma:hidden="true" ma:internalName="MediaServiceGenerationTime" ma:readOnly="true">
-      <xsd:simpleType>
-        <xsd:restriction base="dms:Text"/>
-      </xsd:simpleType>
-    </xsd:element>
-    <xsd:element name="MediaServiceEventHashCode" ma:index="14" nillable="true" ma:displayName="MediaServiceEventHashCode" ma:hidden="true" ma:internalName="MediaServiceEventHashCode" ma:readOnly="true">
-      <xsd:simpleType>
-        <xsd:restriction base="dms:Text"/>
-      </xsd:simpleType>
-    </xsd:element>
-    <xsd:element name="MediaLengthInSeconds" ma:index="15" nillable="true" ma:displayName="MediaLengthInSeconds" ma:hidden="true" ma:internalName="MediaLengthInSeconds" ma:readOnly="true">
-      <xsd:simpleType>
-        <xsd:restriction base="dms:Unknown"/>
       </xsd:simpleType>
     </xsd:element>
   </xsd:schema>
@@ -12565,35 +13112,36 @@
 </ct:contentTypeSchema>
 </file>
 
-<file path=customXml/item3.xml><?xml version="1.0" encoding="utf-8"?>
-<?mso-contentType ?>
-<FormTemplates xmlns="http://schemas.microsoft.com/sharepoint/v3/contenttype/forms">
-  <Display>DocumentLibraryForm</Display>
-  <Edit>DocumentLibraryForm</Edit>
-  <New>DocumentLibraryForm</New>
-</FormTemplates>
-</file>
-
 <file path=customXml/item4.xml><?xml version="1.0" encoding="utf-8"?>
-<b:Sources xmlns:b="http://schemas.openxmlformats.org/officeDocument/2006/bibliography" xmlns="http://schemas.openxmlformats.org/officeDocument/2006/bibliography" SelectedStyle="\APA.XSL" StyleName="APA"/>
+<p:properties xmlns:p="http://schemas.microsoft.com/office/2006/metadata/properties" xmlns:xsi="http://www.w3.org/2001/XMLSchema-instance">
+  <documentManagement/>
+</p:properties>
 </file>
 
 <file path=customXml/itemProps1.xml><?xml version="1.0" encoding="utf-8"?>
-<ds:datastoreItem xmlns:ds="http://schemas.openxmlformats.org/officeDocument/2006/customXml" ds:itemID="{F19E182A-E278-49AC-A58D-A3181FBB2975}">
+<ds:datastoreItem xmlns:ds="http://schemas.openxmlformats.org/officeDocument/2006/customXml" ds:itemID="{A976FBD8-E2B1-46C0-ACBB-B920108BE5B2}">
   <ds:schemaRefs>
-    <ds:schemaRef ds:uri="http://schemas.microsoft.com/office/2006/metadata/properties"/>
+    <ds:schemaRef ds:uri="http://schemas.openxmlformats.org/officeDocument/2006/bibliography"/>
   </ds:schemaRefs>
 </ds:datastoreItem>
 </file>
 
 <file path=customXml/itemProps2.xml><?xml version="1.0" encoding="utf-8"?>
-<ds:datastoreItem xmlns:ds="http://schemas.openxmlformats.org/officeDocument/2006/customXml" ds:itemID="{604E41F5-B545-4AA3-AFA7-16798CC9766F}">
+<ds:datastoreItem xmlns:ds="http://schemas.openxmlformats.org/officeDocument/2006/customXml" ds:itemID="{ABE91D9D-E230-4D73-BAA6-EE83D801CFC1}">
+  <ds:schemaRefs>
+    <ds:schemaRef ds:uri="http://schemas.microsoft.com/sharepoint/v3/contenttype/forms"/>
+  </ds:schemaRefs>
+</ds:datastoreItem>
+</file>
+
+<file path=customXml/itemProps3.xml><?xml version="1.0" encoding="utf-8"?>
+<ds:datastoreItem xmlns:ds="http://schemas.openxmlformats.org/officeDocument/2006/customXml" ds:itemID="{170CD711-FBFB-42AE-9838-8B77C508EAD4}">
   <ds:schemaRefs>
     <ds:schemaRef ds:uri="http://schemas.microsoft.com/office/2006/metadata/contentType"/>
     <ds:schemaRef ds:uri="http://schemas.microsoft.com/office/2006/metadata/properties/metaAttributes"/>
     <ds:schemaRef ds:uri="http://www.w3.org/2001/XMLSchema"/>
     <ds:schemaRef ds:uri="http://schemas.microsoft.com/office/2006/metadata/properties"/>
-    <ds:schemaRef ds:uri="92ee4270-9d09-435c-8163-9480e84d542c"/>
+    <ds:schemaRef ds:uri="32ddce0a-34ac-41bc-9466-633fbe02521d"/>
     <ds:schemaRef ds:uri="http://schemas.microsoft.com/office/2006/documentManagement/types"/>
     <ds:schemaRef ds:uri="http://schemas.microsoft.com/office/infopath/2007/PartnerControls"/>
     <ds:schemaRef ds:uri="http://schemas.openxmlformats.org/package/2006/metadata/core-properties"/>
@@ -12604,18 +13152,10 @@
 </ds:datastoreItem>
 </file>
 
-<file path=customXml/itemProps3.xml><?xml version="1.0" encoding="utf-8"?>
-<ds:datastoreItem xmlns:ds="http://schemas.openxmlformats.org/officeDocument/2006/customXml" ds:itemID="{ABE91D9D-E230-4D73-BAA6-EE83D801CFC1}">
+<file path=customXml/itemProps4.xml><?xml version="1.0" encoding="utf-8"?>
+<ds:datastoreItem xmlns:ds="http://schemas.openxmlformats.org/officeDocument/2006/customXml" ds:itemID="{F19E182A-E278-49AC-A58D-A3181FBB2975}">
   <ds:schemaRefs>
-    <ds:schemaRef ds:uri="http://schemas.microsoft.com/sharepoint/v3/contenttype/forms"/>
-  </ds:schemaRefs>
-</ds:datastoreItem>
-</file>
-
-<file path=customXml/itemProps4.xml><?xml version="1.0" encoding="utf-8"?>
-<ds:datastoreItem xmlns:ds="http://schemas.openxmlformats.org/officeDocument/2006/customXml" ds:itemID="{A976FBD8-E2B1-46C0-ACBB-B920108BE5B2}">
-  <ds:schemaRefs>
-    <ds:schemaRef ds:uri="http://schemas.openxmlformats.org/officeDocument/2006/bibliography"/>
+    <ds:schemaRef ds:uri="http://schemas.microsoft.com/office/2006/metadata/properties"/>
   </ds:schemaRefs>
 </ds:datastoreItem>
 </file>

</xml_diff>

<commit_message>
Add new TO Format question
</commit_message>
<xml_diff>
--- a/public/CAFTOP_Template.docx
+++ b/public/CAFTOP_Template.docx
@@ -1,6 +1,6 @@
 
 <file path=word/document.xml><?xml version="1.0" encoding="utf-8"?>
-<w:document xmlns:wpc="http://schemas.microsoft.com/office/word/2010/wordprocessingCanvas" xmlns:cx="http://schemas.microsoft.com/office/drawing/2014/chartex" xmlns:cx1="http://schemas.microsoft.com/office/drawing/2015/9/8/chartex" xmlns:cx2="http://schemas.microsoft.com/office/drawing/2015/10/21/chartex" xmlns:cx3="http://schemas.microsoft.com/office/drawing/2016/5/9/chartex" xmlns:cx4="http://schemas.microsoft.com/office/drawing/2016/5/10/chartex" xmlns:cx5="http://schemas.microsoft.com/office/drawing/2016/5/11/chartex" xmlns:cx6="http://schemas.microsoft.com/office/drawing/2016/5/12/chartex" xmlns:cx7="http://schemas.microsoft.com/office/drawing/2016/5/13/chartex" xmlns:cx8="http://schemas.microsoft.com/office/drawing/2016/5/14/chartex" xmlns:mc="http://schemas.openxmlformats.org/markup-compatibility/2006" xmlns:aink="http://schemas.microsoft.com/office/drawing/2016/ink" xmlns:am3d="http://schemas.microsoft.com/office/drawing/2017/model3d" xmlns:o="urn:schemas-microsoft-com:office:office" xmlns:oel="http://schemas.microsoft.com/office/2019/extlst" xmlns:r="http://schemas.openxmlformats.org/officeDocument/2006/relationships" xmlns:m="http://schemas.openxmlformats.org/officeDocument/2006/math" xmlns:v="urn:schemas-microsoft-com:vml" xmlns:wp14="http://schemas.microsoft.com/office/word/2010/wordprocessingDrawing" xmlns:wp="http://schemas.openxmlformats.org/drawingml/2006/wordprocessingDrawing" xmlns:w10="urn:schemas-microsoft-com:office:word" xmlns:w="http://schemas.openxmlformats.org/wordprocessingml/2006/main" xmlns:w14="http://schemas.microsoft.com/office/word/2010/wordml" xmlns:w15="http://schemas.microsoft.com/office/word/2012/wordml" xmlns:w16cex="http://schemas.microsoft.com/office/word/2018/wordml/cex" xmlns:w16cid="http://schemas.microsoft.com/office/word/2016/wordml/cid" xmlns:w16="http://schemas.microsoft.com/office/word/2018/wordml" xmlns:w16du="http://schemas.microsoft.com/office/word/2023/wordml/word16du" xmlns:w16sdtdh="http://schemas.microsoft.com/office/word/2020/wordml/sdtdatahash" xmlns:w16se="http://schemas.microsoft.com/office/word/2015/wordml/symex" xmlns:wpg="http://schemas.microsoft.com/office/word/2010/wordprocessingGroup" xmlns:wpi="http://schemas.microsoft.com/office/word/2010/wordprocessingInk" xmlns:wne="http://schemas.microsoft.com/office/word/2006/wordml" xmlns:wps="http://schemas.microsoft.com/office/word/2010/wordprocessingShape" mc:Ignorable="w14 w15 w16se w16cid w16 w16cex w16sdtdh w16du wp14">
+<w:document xmlns:wpc="http://schemas.microsoft.com/office/word/2010/wordprocessingCanvas" xmlns:cx="http://schemas.microsoft.com/office/drawing/2014/chartex" xmlns:cx1="http://schemas.microsoft.com/office/drawing/2015/9/8/chartex" xmlns:cx2="http://schemas.microsoft.com/office/drawing/2015/10/21/chartex" xmlns:cx3="http://schemas.microsoft.com/office/drawing/2016/5/9/chartex" xmlns:cx4="http://schemas.microsoft.com/office/drawing/2016/5/10/chartex" xmlns:cx5="http://schemas.microsoft.com/office/drawing/2016/5/11/chartex" xmlns:cx6="http://schemas.microsoft.com/office/drawing/2016/5/12/chartex" xmlns:cx7="http://schemas.microsoft.com/office/drawing/2016/5/13/chartex" xmlns:cx8="http://schemas.microsoft.com/office/drawing/2016/5/14/chartex" xmlns:mc="http://schemas.openxmlformats.org/markup-compatibility/2006" xmlns:aink="http://schemas.microsoft.com/office/drawing/2016/ink" xmlns:am3d="http://schemas.microsoft.com/office/drawing/2017/model3d" xmlns:o="urn:schemas-microsoft-com:office:office" xmlns:oel="http://schemas.microsoft.com/office/2019/extlst" xmlns:r="http://schemas.openxmlformats.org/officeDocument/2006/relationships" xmlns:m="http://schemas.openxmlformats.org/officeDocument/2006/math" xmlns:v="urn:schemas-microsoft-com:vml" xmlns:wp14="http://schemas.microsoft.com/office/word/2010/wordprocessingDrawing" xmlns:wp="http://schemas.openxmlformats.org/drawingml/2006/wordprocessingDrawing" xmlns:w10="urn:schemas-microsoft-com:office:word" xmlns:w="http://schemas.openxmlformats.org/wordprocessingml/2006/main" xmlns:w14="http://schemas.microsoft.com/office/word/2010/wordml" xmlns:w15="http://schemas.microsoft.com/office/word/2012/wordml" xmlns:w16cex="http://schemas.microsoft.com/office/word/2018/wordml/cex" xmlns:w16cid="http://schemas.microsoft.com/office/word/2016/wordml/cid" xmlns:w16="http://schemas.microsoft.com/office/word/2018/wordml" xmlns:w16du="http://schemas.microsoft.com/office/word/2023/wordml/word16du" xmlns:w16sdtdh="http://schemas.microsoft.com/office/word/2020/wordml/sdtdatahash" xmlns:w16sdtfl="http://schemas.microsoft.com/office/word/2024/wordml/sdtformatlock" xmlns:w16se="http://schemas.microsoft.com/office/word/2015/wordml/symex" xmlns:wpg="http://schemas.microsoft.com/office/word/2010/wordprocessingGroup" xmlns:wpi="http://schemas.microsoft.com/office/word/2010/wordprocessingInk" xmlns:wne="http://schemas.microsoft.com/office/word/2006/wordml" xmlns:wps="http://schemas.microsoft.com/office/word/2010/wordprocessingShape" mc:Ignorable="w14 w15 w16se w16cid w16 w16cex w16sdtdh w16sdtfl w16du wp14">
   <w:body>
     <w:p>
       <w:pPr>
@@ -523,7 +523,6 @@
         <w:jc w:val="center"/>
       </w:pPr>
       <w:r>
-        <w:lastRenderedPageBreak/>
         <w:t>Table of Contents</w:t>
       </w:r>
     </w:p>
@@ -1964,7 +1963,21 @@
             <w:rStyle w:val="Hyperlink"/>
             <w:noProof/>
           </w:rPr>
-          <w:t>{Info.ProgramName} Data Services Online (DSO) Upload, Packaging and Postage</w:t>
+          <w:t xml:space="preserve">{Info.ProgramName} </w:t>
+        </w:r>
+        <w:r>
+          <w:rPr>
+            <w:rStyle w:val="Hyperlink"/>
+            <w:noProof/>
+          </w:rPr>
+          <w:t>Document</w:t>
+        </w:r>
+        <w:r>
+          <w:rPr>
+            <w:rStyle w:val="Hyperlink"/>
+            <w:noProof/>
+          </w:rPr>
+          <w:t xml:space="preserve"> Services Online (DSO) Upload, Packaging and Postage</w:t>
         </w:r>
         <w:r>
           <w:rPr>
@@ -2048,7 +2061,21 @@
             <w:rStyle w:val="Hyperlink"/>
             <w:noProof/>
           </w:rPr>
-          <w:t>{Info.ProgramName} Shipping and Postage Outside of Data Services Online (DSO)</w:t>
+          <w:t xml:space="preserve">{Info.ProgramName} Shipping and Postage Outside of </w:t>
+        </w:r>
+        <w:r>
+          <w:rPr>
+            <w:rStyle w:val="Hyperlink"/>
+            <w:noProof/>
+          </w:rPr>
+          <w:t>Document</w:t>
+        </w:r>
+        <w:r>
+          <w:rPr>
+            <w:rStyle w:val="Hyperlink"/>
+            <w:noProof/>
+          </w:rPr>
+          <w:t xml:space="preserve"> Services Online (DSO)</w:t>
         </w:r>
         <w:r>
           <w:rPr>
@@ -2635,7 +2662,6 @@
         <w:rPr>
           <w:rStyle w:val="Heading1Char"/>
         </w:rPr>
-        <w:lastRenderedPageBreak/>
         <w:t>1.0</w:t>
       </w:r>
       <w:r>
@@ -3351,7 +3377,6 @@
         <w:rPr>
           <w:rStyle w:val="Heading2Char"/>
         </w:rPr>
-        <w:lastRenderedPageBreak/>
         <w:t>1.4.</w:t>
       </w:r>
       <w:r>
@@ -3758,13 +3783,34 @@
         <w:t>current source file format is</w:t>
       </w:r>
       <w:r>
-        <w:t xml:space="preserve"> Standard Generalized Markup Language (SGML)</w:t>
-      </w:r>
-      <w:r>
         <w:t xml:space="preserve"> </w:t>
       </w:r>
       <w:r>
-        <w:t>all TOs are PDF, available for distribution via ETIMS</w:t>
+        <w:t>{TechnicalOrders.</w:t>
+      </w:r>
+      <w:r>
+        <w:t>TOFormatStatement</w:t>
+      </w:r>
+      <w:r>
+        <w:t>}</w:t>
+      </w:r>
+      <w:r>
+        <w:t>.</w:t>
+      </w:r>
+      <w:r>
+        <w:t xml:space="preserve"> </w:t>
+      </w:r>
+      <w:r>
+        <w:t>A</w:t>
+      </w:r>
+      <w:r>
+        <w:t xml:space="preserve">ll TOs </w:t>
+      </w:r>
+      <w:r>
+        <w:t xml:space="preserve">are </w:t>
+      </w:r>
+      <w:r>
+        <w:t>available for distribution via ETIMS</w:t>
       </w:r>
       <w:r>
         <w:t>.</w:t>
@@ -4145,11 +4191,7 @@
         <w:t>m</w:t>
       </w:r>
       <w:r>
-        <w:t xml:space="preserve">aintenance </w:t>
-      </w:r>
-      <w:r>
-        <w:lastRenderedPageBreak/>
-        <w:t>and depot procedures in a standardized TO format.</w:t>
+        <w:t>aintenance and depot procedures in a standardized TO format.</w:t>
       </w:r>
       <w:r>
         <w:t xml:space="preserve"> </w:t>
@@ -4574,11 +4616,7 @@
       </w:r>
       <w:bookmarkEnd w:id="13"/>
       <w:r>
-        <w:t xml:space="preserve"> task provides labor associated with the sustainment of Technical Orders (TO) to ensure the most current version of TO documents are available and accurately archived. This includes conversion of engineering drawings into text searchable .PDF files, sustainment of parts </w:t>
-      </w:r>
-      <w:r>
-        <w:lastRenderedPageBreak/>
-        <w:t xml:space="preserve">configuration data extracted from Illustrated Parts Breakdown (IPB) TOs to include conversion, validation, and identification of errors to ensure data extracted from new IPB TOs is captured, sustained, and updated for the Applications, Programs, and Indentures (API/D200F) databases. Contract labor to sustain systems utilized by the AF to manage sustainment, such as Contenta, Framemaker and graphic TO source data. Effort enables the sustainment of TO publishing systems and style libraries. Sustains conversion tool utilized to convert Standard Generalized Markup Language (SGML) to Hypertext Markup Language (HTML) to allow publishing of Type I Interactive Electronic Technical Manuals (IETM) data. Provides labor to sustain user interface tools and access to electronic TO and engineering source data, and enterprise-level search linked U.S. Air Force (USAF) data sources. Effort also provides the labor to evaluate military specifications governing structure, style, and format of TO data and to assess impacts of military specification changes on TO source data. </w:t>
+        <w:t xml:space="preserve"> task provides labor associated with the sustainment of Technical Orders (TO) to ensure the most current version of TO documents are available and accurately archived. This includes conversion of engineering drawings into text searchable .PDF files, sustainment of parts configuration data extracted from Illustrated Parts Breakdown (IPB) TOs to include conversion, validation, and identification of errors to ensure data extracted from new IPB TOs is captured, sustained, and updated for the Applications, Programs, and Indentures (API/D200F) databases. Contract labor to sustain systems utilized by the AF to manage sustainment, such as Contenta, Framemaker and graphic TO source data. Effort enables the sustainment of TO publishing systems and style libraries. Sustains conversion tool utilized to convert Standard Generalized Markup Language (SGML) to Hypertext Markup Language (HTML) to allow publishing of Type I Interactive Electronic Technical Manuals (IETM) data. Provides labor to sustain user interface tools and access to electronic TO and engineering source data, and enterprise-level search linked U.S. Air Force (USAF) data sources. Effort also provides the labor to evaluate military specifications governing structure, style, and format of TO data and to assess impacts of military specification changes on TO source data. </w:t>
       </w:r>
     </w:p>
     <w:p>
@@ -4629,7 +4667,19 @@
       </w:r>
       <w:bookmarkEnd w:id="14"/>
       <w:r>
-        <w:t xml:space="preserve"> provides labor associated with the sustainment and multimedia distribution of TOs. Multimedia distribution formats consist of paper, velum, PDF, CD/DVDs, and Print- and View-On-Demand (POD/VOD) Gateway TOs. Sustainment support includes, but is not limited to, the updating, processing, quality assurance (QA) reviews, tracking and coordination of electronic and paper TOs. Efforts consists of the following: processing Recommended Changes (RC), dispensation of emergency/urgent supplements, Rapid Action Change (RAC)s, indexing, updating Data Service Online (DSO), and maintaining Enhanced Technical Information Management System (ETIMS) in accordance with (IAW) AFI 63-101/20-101, TO 00-5-1 and TO 00-5-3. This task also provides Data Review Sustainment support including, but not limited to, processing revisions, TCTO, interfiling TO changes, POD/VOD acceptability reviews, tracking, uploading and coordination of electronic TOs. Efforts consists of the following: page-by-page performing QA review, list of effective pages check, placement of merge and/or copyright statements. Each update is hyperlinked to its respective changed, added, or amended pages within the basic manual. This task ensures appropriated configuration measures are maintained for legacy TO OSS&amp;E baselines. </w:t>
+        <w:t xml:space="preserve"> provides labor associated with the sustainment and multimedia distribution of TOs. Multimedia distribution formats consist of paper, velum, PDF, CD/DVDs, and Print- and View-On-Demand (POD/VOD) Gateway TOs. Sustainment support includes, but is not limited to, the updating, processing, quality assurance (QA) reviews, tracking and coordination of electronic and paper TOs. Efforts consists of the following: processing Recommended Changes (RC), dispensation of emergency/urgent supplements, Rapid Action Change (RAC)s, indexing, updating D</w:t>
+      </w:r>
+      <w:r>
+        <w:t>ocument</w:t>
+      </w:r>
+      <w:r>
+        <w:t xml:space="preserve"> Service</w:t>
+      </w:r>
+      <w:r>
+        <w:t>s</w:t>
+      </w:r>
+      <w:r>
+        <w:t xml:space="preserve"> Online (DSO), and maintaining Enhanced Technical Information Management System (ETIMS) in accordance with (IAW) AFI 63-101/20-101, TO 00-5-1 and TO 00-5-3. This task also provides Data Review Sustainment support including, but not limited to, processing revisions, TCTO, interfiling TO changes, POD/VOD acceptability reviews, tracking, uploading and coordination of electronic TOs. Efforts consists of the following: page-by-page performing QA review, list of effective pages check, placement of merge and/or copyright statements. Each update is hyperlinked to its respective changed, added, or amended pages within the basic manual. This task ensures appropriated configuration measures are maintained for legacy TO OSS&amp;E baselines. </w:t>
       </w:r>
     </w:p>
     <w:p>
@@ -4649,11 +4699,7 @@
         <w:t>Impact Statement:</w:t>
       </w:r>
       <w:r>
-        <w:t xml:space="preserve"> This task follows guidance provided by AFI 63-101/20-101 which requires that current, valid, verified TOs and technical data must be provided that clearly identifies procedures and requirements necessary to preserve OSS&amp;E baselines and to diagnose, repair, calibrate, operate, and test systems or end items. Without full support, the technical data and the OSS&amp;E of the mission is drastically put at risk. A reduced level of </w:t>
-      </w:r>
-      <w:r>
-        <w:lastRenderedPageBreak/>
-        <w:t>support would create an unacceptable risk to life, health, property, mission capability and the environment. This support maintains the accuracy and consistency of TOs available to users. Without technically accurate data, full mission capability cannot be realized at field level.</w:t>
+        <w:t xml:space="preserve"> This task follows guidance provided by AFI 63-101/20-101 which requires that current, valid, verified TOs and technical data must be provided that clearly identifies procedures and requirements necessary to preserve OSS&amp;E baselines and to diagnose, repair, calibrate, operate, and test systems or end items. Without full support, the technical data and the OSS&amp;E of the mission is drastically put at risk. A reduced level of support would create an unacceptable risk to life, health, property, mission capability and the environment. This support maintains the accuracy and consistency of TOs available to users. Without technically accurate data, full mission capability cannot be realized at field level.</w:t>
       </w:r>
     </w:p>
     <w:p>
@@ -4799,12 +4845,14 @@
       <w:r>
         <w:rPr>
           <w:b/>
+          <w:bCs/>
         </w:rPr>
         <w:t>:</w:t>
       </w:r>
       <w:r>
         <w:rPr>
           <w:b/>
+          <w:bCs/>
         </w:rPr>
         <w:t xml:space="preserve"> </w:t>
       </w:r>
@@ -4878,13 +4926,16 @@
         <w:t xml:space="preserve">to </w:t>
       </w:r>
       <w:r>
-        <w:t>Defense Logistics Agency (DLA) Document Services</w:t>
+        <w:t>Defense Logistics Agency (DLA)</w:t>
       </w:r>
       <w:r>
         <w:t xml:space="preserve">, </w:t>
       </w:r>
       <w:r>
-        <w:t>Data Services Online (DSO)</w:t>
+        <w:t>Document</w:t>
+      </w:r>
+      <w:r>
+        <w:t xml:space="preserve"> Services Online (DSO)</w:t>
       </w:r>
       <w:r>
         <w:t>.</w:t>
@@ -5283,11 +5334,7 @@
         <w:t>,</w:t>
       </w:r>
       <w:r>
-        <w:t xml:space="preserve"> the program cannot support the </w:t>
-      </w:r>
-      <w:r>
-        <w:lastRenderedPageBreak/>
-        <w:t>users in the field with updated Tech</w:t>
+        <w:t xml:space="preserve"> the program cannot support the users in the field with updated Tech</w:t>
       </w:r>
       <w:r>
         <w:t>nical</w:t>
@@ -5372,12 +5419,18 @@
         <w:rPr>
           <w:rStyle w:val="Heading2Char"/>
         </w:rPr>
-        <w:t>Data Services Online (DSO)</w:t>
+        <w:t>Document</w:t>
       </w:r>
       <w:r>
         <w:rPr>
           <w:rStyle w:val="Heading2Char"/>
         </w:rPr>
+        <w:t xml:space="preserve"> Services Online (DSO)</w:t>
+      </w:r>
+      <w:r>
+        <w:rPr>
+          <w:rStyle w:val="Heading2Char"/>
+        </w:rPr>
         <w:t xml:space="preserve"> Upload</w:t>
       </w:r>
       <w:r>
@@ -5541,7 +5594,13 @@
         <w:rPr>
           <w:b/>
         </w:rPr>
-        <w:t>Data Services Online (DSO)</w:t>
+        <w:t>Document</w:t>
+      </w:r>
+      <w:r>
+        <w:rPr>
+          <w:b/>
+        </w:rPr>
+        <w:t xml:space="preserve"> Services Online (DSO)</w:t>
       </w:r>
       <w:r>
         <w:rPr>
@@ -5710,12 +5769,18 @@
         <w:rPr>
           <w:rStyle w:val="Heading2Char"/>
         </w:rPr>
-        <w:t>Data Services Online</w:t>
+        <w:t>Document</w:t>
       </w:r>
       <w:r>
         <w:rPr>
           <w:rStyle w:val="Heading2Char"/>
         </w:rPr>
+        <w:t xml:space="preserve"> Services Online</w:t>
+      </w:r>
+      <w:r>
+        <w:rPr>
+          <w:rStyle w:val="Heading2Char"/>
+        </w:rPr>
         <w:t xml:space="preserve"> (</w:t>
       </w:r>
       <w:r>
@@ -5900,7 +5965,10 @@
         <w:t xml:space="preserve">outside of </w:t>
       </w:r>
       <w:r>
-        <w:t>Data Services Online</w:t>
+        <w:t>Document</w:t>
+      </w:r>
+      <w:r>
+        <w:t xml:space="preserve"> Services Online</w:t>
       </w:r>
       <w:r>
         <w:t xml:space="preserve"> (</w:t>
@@ -6013,7 +6081,6 @@
     </w:p>
     <w:p>
       <w:r>
-        <w:lastRenderedPageBreak/>
         <w:t>{/}</w:t>
       </w:r>
     </w:p>
@@ -6435,7 +6502,7 @@
             <v:path o:extrusionok="f" gradientshapeok="t" o:connecttype="rect"/>
             <o:lock v:ext="edit" aspectratio="t"/>
           </v:shapetype>
-          <v:shape id="_x0000_i1025" type="#_x0000_t75" alt="Microsoft Office Signature Line..." style="width:192pt;height:96pt">
+          <v:shape id="_x0000_i1025" type="#_x0000_t75" alt="Signature Line, Unsigned" style="width:191.9pt;height:96.1pt">
             <v:imagedata r:id="rId11" o:title=""/>
             <o:lock v:ext="edit" ungrouping="t" rotation="t" cropping="t" verticies="t" text="t" grouping="t"/>
             <o:signatureline v:ext="edit" id="{02E62789-0E58-49C7-856A-0DC8CAFE65AC}" provid="{00000000-0000-0000-0000-000000000000}" o:suggestedsigner="FirstName LastName" o:suggestedsigner2="Program Manager" o:suggestedsigneremail="Email" issignatureline="t"/>
@@ -6461,8 +6528,8 @@
           <w:bCs/>
         </w:rPr>
         <w:pict w14:anchorId="42250BA7">
-          <v:shape id="_x0000_i1026" type="#_x0000_t75" alt="Microsoft Office Signature Line..." style="width:192pt;height:96pt">
-            <v:imagedata r:id="rId12" o:title=""/>
+          <v:shape id="_x0000_i1026" type="#_x0000_t75" alt="Signature Line, Unsigned" style="width:191.9pt;height:96.1pt">
+            <v:imagedata r:id="rId11" o:title=""/>
             <o:lock v:ext="edit" ungrouping="t" rotation="t" cropping="t" verticies="t" text="t" grouping="t"/>
             <o:signatureline v:ext="edit" id="{2FE24A7F-4C02-4D0D-AA34-3B237805A0F9}" provid="{00000000-0000-0000-0000-000000000000}" o:suggestedsigner="FirstName LastName" o:suggestedsigner2="Program Manager" o:suggestedsigneremail="Email" issignatureline="t"/>
           </v:shape>
@@ -6487,8 +6554,8 @@
           <w:bCs/>
         </w:rPr>
         <w:pict w14:anchorId="13D035FB">
-          <v:shape id="_x0000_i1027" type="#_x0000_t75" alt="Microsoft Office Signature Line..." style="width:192pt;height:96pt">
-            <v:imagedata r:id="rId11" o:title=""/>
+          <v:shape id="_x0000_i1027" type="#_x0000_t75" alt="Signature Line, Unsigned" style="width:191.9pt;height:96.1pt">
+            <v:imagedata r:id="rId12" o:title=""/>
             <o:lock v:ext="edit" ungrouping="t" rotation="t" cropping="t" verticies="t" text="t" grouping="t"/>
             <o:signatureline v:ext="edit" id="{BD27A615-C575-40DE-9949-C2672517FB96}" provid="{00000000-0000-0000-0000-000000000000}" o:suggestedsigner="FirstName LastName" o:suggestedsigner2="Program Manager" o:suggestedsigneremail="Email" issignatureline="t"/>
           </v:shape>
@@ -6502,7 +6569,6 @@
         <w:t xml:space="preserve">   </w:t>
       </w:r>
       <w:r>
-        <w:lastRenderedPageBreak/>
         <w:t>{/}</w:t>
       </w:r>
       <w:r>
@@ -6514,7 +6580,7 @@
           <w:bCs/>
         </w:rPr>
         <w:pict w14:anchorId="451E6F9C">
-          <v:shape id="_x0000_i1028" type="#_x0000_t75" alt="Microsoft Office Signature Line..." style="width:192pt;height:96pt">
+          <v:shape id="_x0000_i1028" type="#_x0000_t75" alt="Signature Line, Unsigned" style="width:191.9pt;height:96.1pt">
             <v:imagedata r:id="rId12" o:title=""/>
             <o:lock v:ext="edit" ungrouping="t" rotation="t" cropping="t" verticies="t" text="t" grouping="t"/>
             <o:signatureline v:ext="edit" id="{F79E3C56-4B48-4B56-8DB7-0185E17BF1E8}" provid="{00000000-0000-0000-0000-000000000000}" o:suggestedsigner="FirstName LastName" o:suggestedsigner2="Program Manager" o:suggestedsigneremail="Email" issignatureline="t"/>
@@ -6532,8 +6598,8 @@
       </w:r>
       <w:r>
         <w:pict w14:anchorId="659CAB45">
-          <v:shape id="_x0000_i1029" type="#_x0000_t75" alt="Microsoft Office Signature Line..." style="width:192pt;height:96pt">
-            <v:imagedata r:id="rId11" o:title=""/>
+          <v:shape id="_x0000_i1029" type="#_x0000_t75" alt="Signature Line, Unsigned" style="width:191.9pt;height:96.1pt">
+            <v:imagedata r:id="rId13" o:title=""/>
             <o:lock v:ext="edit" ungrouping="t" rotation="t" cropping="t" verticies="t" text="t" grouping="t"/>
             <o:signatureline v:ext="edit" id="{28339033-8C39-4735-ACC2-D8807DFF0DD9}" provid="{00000000-0000-0000-0000-000000000000}" o:suggestedsigner="FirstName LastName" o:suggestedsigner2="Program Manager" o:suggestedsigneremail="Email" issignatureline="t"/>
           </v:shape>
@@ -6550,8 +6616,8 @@
       </w:r>
       <w:r>
         <w:pict w14:anchorId="6F72759C">
-          <v:shape id="_x0000_i1030" type="#_x0000_t75" alt="Microsoft Office Signature Line..." style="width:192pt;height:96pt">
-            <v:imagedata r:id="rId12" o:title=""/>
+          <v:shape id="_x0000_i1030" type="#_x0000_t75" alt="Signature Line, Unsigned" style="width:191.9pt;height:96.1pt">
+            <v:imagedata r:id="rId14" o:title=""/>
             <o:lock v:ext="edit" ungrouping="t" rotation="t" cropping="t" verticies="t" text="t" grouping="t"/>
             <o:signatureline v:ext="edit" id="{78E9923A-2250-41BC-9212-73A6B8F35EFC}" provid="{00000000-0000-0000-0000-000000000000}" o:suggestedsigner="FirstName LastName" o:suggestedsigner2="Program Manager" o:suggestedsigneremail="Email" issignatureline="t"/>
           </v:shape>
@@ -6568,8 +6634,8 @@
       </w:r>
       <w:r>
         <w:pict w14:anchorId="261B6BC8">
-          <v:shape id="_x0000_i1031" type="#_x0000_t75" alt="Microsoft Office Signature Line..." style="width:192pt;height:96pt">
-            <v:imagedata r:id="rId11" o:title=""/>
+          <v:shape id="_x0000_i1031" type="#_x0000_t75" alt="Signature Line, Unsigned" style="width:191.9pt;height:96.1pt">
+            <v:imagedata r:id="rId15" o:title=""/>
             <o:lock v:ext="edit" ungrouping="t" rotation="t" cropping="t" verticies="t" text="t" grouping="t"/>
             <o:signatureline v:ext="edit" id="{A6CECDB8-5BFD-4C06-9C95-4A9E30C691EB}" provid="{00000000-0000-0000-0000-000000000000}" o:suggestedsigner="FirstName LastName" o:suggestedsigner2="Program Manager" o:suggestedsigneremail="Email" issignatureline="t"/>
           </v:shape>
@@ -6586,8 +6652,8 @@
       </w:r>
       <w:r>
         <w:pict w14:anchorId="50CDE46C">
-          <v:shape id="_x0000_i1041" type="#_x0000_t75" alt="Microsoft Office Signature Line..." style="width:192pt;height:96pt">
-            <v:imagedata r:id="rId13" o:title=""/>
+          <v:shape id="_x0000_i1032" type="#_x0000_t75" alt="Signature Line, Unsigned" style="width:191.9pt;height:96.1pt">
+            <v:imagedata r:id="rId15" o:title=""/>
             <o:lock v:ext="edit" ungrouping="t" rotation="t" cropping="t" verticies="t" text="t" grouping="t"/>
             <o:signatureline v:ext="edit" id="{738798CE-9880-4897-9C74-5D50139E818C}" provid="{00000000-0000-0000-0000-000000000000}" o:suggestedsigner="FirstName LastName" o:suggestedsigner2="Program Manager" o:suggestedsigneremail="Email" issignatureline="t"/>
           </v:shape>
@@ -6613,7 +6679,6 @@
         <w:rPr>
           <w:rStyle w:val="Heading1Char"/>
         </w:rPr>
-        <w:lastRenderedPageBreak/>
         <w:t>Technical Order Manager Approval</w:t>
       </w:r>
       <w:bookmarkEnd w:id="25"/>
@@ -6633,8 +6698,8 @@
       </w:r>
       <w:r>
         <w:pict w14:anchorId="0EB326D8">
-          <v:shape id="_x0000_i1042" type="#_x0000_t75" alt="Microsoft Office Signature Line..." style="width:192pt;height:96pt">
-            <v:imagedata r:id="rId14" o:title=""/>
+          <v:shape id="_x0000_i1033" type="#_x0000_t75" alt="Signature Line, Unsigned" style="width:191.9pt;height:96.1pt">
+            <v:imagedata r:id="rId16" o:title=""/>
             <o:lock v:ext="edit" ungrouping="t" rotation="t" cropping="t" verticies="t" text="t" grouping="t"/>
             <o:signatureline v:ext="edit" id="{F0D72538-6F55-4837-920F-9520253F9B5F}" provid="{00000000-0000-0000-0000-000000000000}" o:suggestedsigner="TO FirstName LastName" o:suggestedsigner2="Technical Order Manager" o:suggestedsigneremail="TO Email" issignatureline="t"/>
           </v:shape>
@@ -6648,8 +6713,8 @@
       </w:r>
       <w:r>
         <w:pict w14:anchorId="3C8CAD91">
-          <v:shape id="_x0000_i1043" type="#_x0000_t75" alt="Microsoft Office Signature Line..." style="width:192pt;height:96pt">
-            <v:imagedata r:id="rId14" o:title=""/>
+          <v:shape id="_x0000_i1034" type="#_x0000_t75" alt="Signature Line, Unsigned" style="width:191.9pt;height:96.1pt">
+            <v:imagedata r:id="rId17" o:title=""/>
             <o:lock v:ext="edit" ungrouping="t" rotation="t" cropping="t" verticies="t" text="t" grouping="t"/>
             <o:signatureline v:ext="edit" id="{8664F99E-BCC5-41F2-8956-EB21F8C91E79}" provid="{00000000-0000-0000-0000-000000000000}" o:suggestedsigner="TO FirstName LastName" o:suggestedsigner2="Technical Order Manager" o:suggestedsigneremail="TO Email" issignatureline="t"/>
           </v:shape>
@@ -6660,8 +6725,8 @@
       </w:r>
       <w:r>
         <w:pict w14:anchorId="1073A289">
-          <v:shape id="_x0000_i1044" type="#_x0000_t75" alt="Microsoft Office Signature Line..." style="width:192pt;height:96pt">
-            <v:imagedata r:id="rId14" o:title=""/>
+          <v:shape id="_x0000_i1035" type="#_x0000_t75" alt="Signature Line, Unsigned" style="width:191.9pt;height:96.1pt">
+            <v:imagedata r:id="rId17" o:title=""/>
             <o:lock v:ext="edit" ungrouping="t" rotation="t" cropping="t" verticies="t" text="t" grouping="t"/>
             <o:signatureline v:ext="edit" id="{FEB257D3-9AC1-49DF-930B-18FDA7B7B0C5}" provid="{00000000-0000-0000-0000-000000000000}" o:suggestedsigner="TO FirstName LastName" o:suggestedsigner2="Technical Order Manager" o:suggestedsigneremail="TO Email" issignatureline="t"/>
           </v:shape>
@@ -6672,8 +6737,8 @@
       </w:r>
       <w:r>
         <w:pict w14:anchorId="0D79D61D">
-          <v:shape id="_x0000_i1045" type="#_x0000_t75" alt="Microsoft Office Signature Line..." style="width:192pt;height:96pt">
-            <v:imagedata r:id="rId14" o:title=""/>
+          <v:shape id="_x0000_i1036" type="#_x0000_t75" alt="Signature Line, Unsigned" style="width:191.9pt;height:96.1pt">
+            <v:imagedata r:id="rId17" o:title=""/>
             <o:lock v:ext="edit" ungrouping="t" rotation="t" cropping="t" verticies="t" text="t" grouping="t"/>
             <o:signatureline v:ext="edit" id="{6C4D4D72-FD9C-4DBE-AF52-7CF8E787BE36}" provid="{00000000-0000-0000-0000-000000000000}" o:suggestedsigner="TO FirstName LastName" o:suggestedsigner2="Technical Order Manager" o:suggestedsigneremail="TO Email" issignatureline="t"/>
           </v:shape>
@@ -6684,8 +6749,8 @@
       </w:r>
       <w:r>
         <w:pict w14:anchorId="289F72EC">
-          <v:shape id="_x0000_i1046" type="#_x0000_t75" alt="Microsoft Office Signature Line..." style="width:192pt;height:96pt">
-            <v:imagedata r:id="rId14" o:title=""/>
+          <v:shape id="_x0000_i1037" type="#_x0000_t75" alt="Signature Line, Unsigned" style="width:191.9pt;height:96.1pt">
+            <v:imagedata r:id="rId17" o:title=""/>
             <o:lock v:ext="edit" ungrouping="t" rotation="t" cropping="t" verticies="t" text="t" grouping="t"/>
             <o:signatureline v:ext="edit" id="{01218CBD-1AC9-4D24-91F0-21C1AAD49B2A}" provid="{00000000-0000-0000-0000-000000000000}" o:suggestedsigner="TO FirstName LastName" o:suggestedsigner2="Technical Order Manager" o:suggestedsigneremail="TO Email" issignatureline="t"/>
           </v:shape>
@@ -6696,24 +6761,20 @@
       </w:r>
       <w:r>
         <w:pict w14:anchorId="48EA1299">
-          <v:shape id="_x0000_i1047" type="#_x0000_t75" alt="Microsoft Office Signature Line..." style="width:192pt;height:96pt">
-            <v:imagedata r:id="rId14" o:title=""/>
+          <v:shape id="_x0000_i1038" type="#_x0000_t75" alt="Signature Line, Unsigned" style="width:191.9pt;height:96.1pt">
+            <v:imagedata r:id="rId17" o:title=""/>
             <o:lock v:ext="edit" ungrouping="t" rotation="t" cropping="t" verticies="t" text="t" grouping="t"/>
             <o:signatureline v:ext="edit" id="{FCBE8BA4-D3AD-4BC3-8449-72C754272415}" provid="{00000000-0000-0000-0000-000000000000}" o:suggestedsigner="TO FirstName LastName" o:suggestedsigner2="Technical Order Manager" o:suggestedsigneremail="TO Email" issignatureline="t"/>
           </v:shape>
         </w:pict>
       </w:r>
       <w:r>
-        <w:t xml:space="preserve">{/}  </w:t>
-      </w:r>
-      <w:r>
-        <w:lastRenderedPageBreak/>
-        <w:t>{#Info.TechOrderManagers.length &gt;=7}</w:t>
+        <w:t>{/}  {#Info.TechOrderManagers.length &gt;=7}</w:t>
       </w:r>
       <w:r>
         <w:pict w14:anchorId="45399C94">
-          <v:shape id="_x0000_i1039" type="#_x0000_t75" alt="Microsoft Office Signature Line..." style="width:192pt;height:96pt">
-            <v:imagedata r:id="rId15" o:title=""/>
+          <v:shape id="_x0000_i1039" type="#_x0000_t75" alt="Signature Line, Unsigned" style="width:191.9pt;height:96.1pt">
+            <v:imagedata r:id="rId18" o:title=""/>
             <o:lock v:ext="edit" ungrouping="t" rotation="t" cropping="t" verticies="t" text="t" grouping="t"/>
             <o:signatureline v:ext="edit" id="{12E432A9-E904-404C-BBD0-AF8260FD6E04}" provid="{00000000-0000-0000-0000-000000000000}" o:suggestedsigner="TO FirstName LastName" o:suggestedsigner2="Technical Order Manager" o:suggestedsigneremail="TO Email" issignatureline="t"/>
           </v:shape>
@@ -6724,8 +6785,8 @@
       </w:r>
       <w:r>
         <w:pict w14:anchorId="6DF92DE1">
-          <v:shape id="_x0000_i1040" type="#_x0000_t75" alt="Microsoft Office Signature Line..." style="width:192pt;height:96pt">
-            <v:imagedata r:id="rId15" o:title=""/>
+          <v:shape id="_x0000_i1040" type="#_x0000_t75" alt="Signature Line, Unsigned" style="width:191.9pt;height:96.1pt">
+            <v:imagedata r:id="rId19" o:title=""/>
             <o:lock v:ext="edit" ungrouping="t" rotation="t" cropping="t" verticies="t" text="t" grouping="t"/>
             <o:signatureline v:ext="edit" id="{00F933D7-8294-4244-95B5-379E40936944}" provid="{00000000-0000-0000-0000-000000000000}" o:suggestedsigner="TO FirstName LastName" o:suggestedsigner2="Technical Order Manager" o:suggestedsigneremail="TO Email" issignatureline="t"/>
           </v:shape>
@@ -6736,7 +6797,7 @@
       </w:r>
     </w:p>
     <w:sectPr>
-      <w:footerReference w:type="default" r:id="rId16"/>
+      <w:footerReference w:type="default" r:id="rId20"/>
       <w:pgSz w:w="12240" w:h="15840"/>
       <w:pgMar w:top="1440" w:right="1440" w:bottom="1440" w:left="1440" w:header="720" w:footer="720" w:gutter="0"/>
       <w:cols w:space="720"/>
@@ -6748,7 +6809,7 @@
 </file>
 
 <file path=word/endnotes.xml><?xml version="1.0" encoding="utf-8"?>
-<w:endnotes xmlns:wpc="http://schemas.microsoft.com/office/word/2010/wordprocessingCanvas" xmlns:cx="http://schemas.microsoft.com/office/drawing/2014/chartex" xmlns:cx1="http://schemas.microsoft.com/office/drawing/2015/9/8/chartex" xmlns:cx2="http://schemas.microsoft.com/office/drawing/2015/10/21/chartex" xmlns:cx3="http://schemas.microsoft.com/office/drawing/2016/5/9/chartex" xmlns:cx4="http://schemas.microsoft.com/office/drawing/2016/5/10/chartex" xmlns:cx5="http://schemas.microsoft.com/office/drawing/2016/5/11/chartex" xmlns:cx6="http://schemas.microsoft.com/office/drawing/2016/5/12/chartex" xmlns:cx7="http://schemas.microsoft.com/office/drawing/2016/5/13/chartex" xmlns:cx8="http://schemas.microsoft.com/office/drawing/2016/5/14/chartex" xmlns:mc="http://schemas.openxmlformats.org/markup-compatibility/2006" xmlns:aink="http://schemas.microsoft.com/office/drawing/2016/ink" xmlns:am3d="http://schemas.microsoft.com/office/drawing/2017/model3d" xmlns:o="urn:schemas-microsoft-com:office:office" xmlns:oel="http://schemas.microsoft.com/office/2019/extlst" xmlns:r="http://schemas.openxmlformats.org/officeDocument/2006/relationships" xmlns:m="http://schemas.openxmlformats.org/officeDocument/2006/math" xmlns:v="urn:schemas-microsoft-com:vml" xmlns:wp14="http://schemas.microsoft.com/office/word/2010/wordprocessingDrawing" xmlns:wp="http://schemas.openxmlformats.org/drawingml/2006/wordprocessingDrawing" xmlns:w10="urn:schemas-microsoft-com:office:word" xmlns:w="http://schemas.openxmlformats.org/wordprocessingml/2006/main" xmlns:w14="http://schemas.microsoft.com/office/word/2010/wordml" xmlns:w15="http://schemas.microsoft.com/office/word/2012/wordml" xmlns:w16cex="http://schemas.microsoft.com/office/word/2018/wordml/cex" xmlns:w16cid="http://schemas.microsoft.com/office/word/2016/wordml/cid" xmlns:w16="http://schemas.microsoft.com/office/word/2018/wordml" xmlns:w16du="http://schemas.microsoft.com/office/word/2023/wordml/word16du" xmlns:w16sdtdh="http://schemas.microsoft.com/office/word/2020/wordml/sdtdatahash" xmlns:w16se="http://schemas.microsoft.com/office/word/2015/wordml/symex" xmlns:wpg="http://schemas.microsoft.com/office/word/2010/wordprocessingGroup" xmlns:wpi="http://schemas.microsoft.com/office/word/2010/wordprocessingInk" xmlns:wne="http://schemas.microsoft.com/office/word/2006/wordml" xmlns:wps="http://schemas.microsoft.com/office/word/2010/wordprocessingShape" mc:Ignorable="w14 w15 w16se w16cid w16 w16cex w16sdtdh w16du wp14">
+<w:endnotes xmlns:wpc="http://schemas.microsoft.com/office/word/2010/wordprocessingCanvas" xmlns:cx="http://schemas.microsoft.com/office/drawing/2014/chartex" xmlns:cx1="http://schemas.microsoft.com/office/drawing/2015/9/8/chartex" xmlns:cx2="http://schemas.microsoft.com/office/drawing/2015/10/21/chartex" xmlns:cx3="http://schemas.microsoft.com/office/drawing/2016/5/9/chartex" xmlns:cx4="http://schemas.microsoft.com/office/drawing/2016/5/10/chartex" xmlns:cx5="http://schemas.microsoft.com/office/drawing/2016/5/11/chartex" xmlns:cx6="http://schemas.microsoft.com/office/drawing/2016/5/12/chartex" xmlns:cx7="http://schemas.microsoft.com/office/drawing/2016/5/13/chartex" xmlns:cx8="http://schemas.microsoft.com/office/drawing/2016/5/14/chartex" xmlns:mc="http://schemas.openxmlformats.org/markup-compatibility/2006" xmlns:aink="http://schemas.microsoft.com/office/drawing/2016/ink" xmlns:am3d="http://schemas.microsoft.com/office/drawing/2017/model3d" xmlns:o="urn:schemas-microsoft-com:office:office" xmlns:oel="http://schemas.microsoft.com/office/2019/extlst" xmlns:r="http://schemas.openxmlformats.org/officeDocument/2006/relationships" xmlns:m="http://schemas.openxmlformats.org/officeDocument/2006/math" xmlns:v="urn:schemas-microsoft-com:vml" xmlns:wp14="http://schemas.microsoft.com/office/word/2010/wordprocessingDrawing" xmlns:wp="http://schemas.openxmlformats.org/drawingml/2006/wordprocessingDrawing" xmlns:w10="urn:schemas-microsoft-com:office:word" xmlns:w="http://schemas.openxmlformats.org/wordprocessingml/2006/main" xmlns:w14="http://schemas.microsoft.com/office/word/2010/wordml" xmlns:w15="http://schemas.microsoft.com/office/word/2012/wordml" xmlns:w16cex="http://schemas.microsoft.com/office/word/2018/wordml/cex" xmlns:w16cid="http://schemas.microsoft.com/office/word/2016/wordml/cid" xmlns:w16="http://schemas.microsoft.com/office/word/2018/wordml" xmlns:w16du="http://schemas.microsoft.com/office/word/2023/wordml/word16du" xmlns:w16sdtdh="http://schemas.microsoft.com/office/word/2020/wordml/sdtdatahash" xmlns:w16sdtfl="http://schemas.microsoft.com/office/word/2024/wordml/sdtformatlock" xmlns:w16se="http://schemas.microsoft.com/office/word/2015/wordml/symex" xmlns:wpg="http://schemas.microsoft.com/office/word/2010/wordprocessingGroup" xmlns:wpi="http://schemas.microsoft.com/office/word/2010/wordprocessingInk" xmlns:wne="http://schemas.microsoft.com/office/word/2006/wordml" xmlns:wps="http://schemas.microsoft.com/office/word/2010/wordprocessingShape" mc:Ignorable="w14 w15 w16se w16cid w16 w16cex w16sdtdh w16sdtfl w16du wp14">
   <w:endnote w:type="separator" w:id="-1">
     <w:p>
       <w:r>
@@ -6770,7 +6831,7 @@
 </file>
 
 <file path=word/footer1.xml><?xml version="1.0" encoding="utf-8"?>
-<w:ftr xmlns:wpc="http://schemas.microsoft.com/office/word/2010/wordprocessingCanvas" xmlns:cx="http://schemas.microsoft.com/office/drawing/2014/chartex" xmlns:cx1="http://schemas.microsoft.com/office/drawing/2015/9/8/chartex" xmlns:cx2="http://schemas.microsoft.com/office/drawing/2015/10/21/chartex" xmlns:cx3="http://schemas.microsoft.com/office/drawing/2016/5/9/chartex" xmlns:cx4="http://schemas.microsoft.com/office/drawing/2016/5/10/chartex" xmlns:cx5="http://schemas.microsoft.com/office/drawing/2016/5/11/chartex" xmlns:cx6="http://schemas.microsoft.com/office/drawing/2016/5/12/chartex" xmlns:cx7="http://schemas.microsoft.com/office/drawing/2016/5/13/chartex" xmlns:cx8="http://schemas.microsoft.com/office/drawing/2016/5/14/chartex" xmlns:mc="http://schemas.openxmlformats.org/markup-compatibility/2006" xmlns:aink="http://schemas.microsoft.com/office/drawing/2016/ink" xmlns:am3d="http://schemas.microsoft.com/office/drawing/2017/model3d" xmlns:o="urn:schemas-microsoft-com:office:office" xmlns:oel="http://schemas.microsoft.com/office/2019/extlst" xmlns:r="http://schemas.openxmlformats.org/officeDocument/2006/relationships" xmlns:m="http://schemas.openxmlformats.org/officeDocument/2006/math" xmlns:v="urn:schemas-microsoft-com:vml" xmlns:wp14="http://schemas.microsoft.com/office/word/2010/wordprocessingDrawing" xmlns:wp="http://schemas.openxmlformats.org/drawingml/2006/wordprocessingDrawing" xmlns:w10="urn:schemas-microsoft-com:office:word" xmlns:w="http://schemas.openxmlformats.org/wordprocessingml/2006/main" xmlns:w14="http://schemas.microsoft.com/office/word/2010/wordml" xmlns:w15="http://schemas.microsoft.com/office/word/2012/wordml" xmlns:w16cex="http://schemas.microsoft.com/office/word/2018/wordml/cex" xmlns:w16cid="http://schemas.microsoft.com/office/word/2016/wordml/cid" xmlns:w16="http://schemas.microsoft.com/office/word/2018/wordml" xmlns:w16du="http://schemas.microsoft.com/office/word/2023/wordml/word16du" xmlns:w16sdtdh="http://schemas.microsoft.com/office/word/2020/wordml/sdtdatahash" xmlns:w16se="http://schemas.microsoft.com/office/word/2015/wordml/symex" xmlns:wpg="http://schemas.microsoft.com/office/word/2010/wordprocessingGroup" xmlns:wpi="http://schemas.microsoft.com/office/word/2010/wordprocessingInk" xmlns:wne="http://schemas.microsoft.com/office/word/2006/wordml" xmlns:wps="http://schemas.microsoft.com/office/word/2010/wordprocessingShape" mc:Ignorable="w14 w15 w16se w16cid w16 w16cex w16sdtdh w16du wp14">
+<w:ftr xmlns:wpc="http://schemas.microsoft.com/office/word/2010/wordprocessingCanvas" xmlns:cx="http://schemas.microsoft.com/office/drawing/2014/chartex" xmlns:cx1="http://schemas.microsoft.com/office/drawing/2015/9/8/chartex" xmlns:cx2="http://schemas.microsoft.com/office/drawing/2015/10/21/chartex" xmlns:cx3="http://schemas.microsoft.com/office/drawing/2016/5/9/chartex" xmlns:cx4="http://schemas.microsoft.com/office/drawing/2016/5/10/chartex" xmlns:cx5="http://schemas.microsoft.com/office/drawing/2016/5/11/chartex" xmlns:cx6="http://schemas.microsoft.com/office/drawing/2016/5/12/chartex" xmlns:cx7="http://schemas.microsoft.com/office/drawing/2016/5/13/chartex" xmlns:cx8="http://schemas.microsoft.com/office/drawing/2016/5/14/chartex" xmlns:mc="http://schemas.openxmlformats.org/markup-compatibility/2006" xmlns:aink="http://schemas.microsoft.com/office/drawing/2016/ink" xmlns:am3d="http://schemas.microsoft.com/office/drawing/2017/model3d" xmlns:o="urn:schemas-microsoft-com:office:office" xmlns:oel="http://schemas.microsoft.com/office/2019/extlst" xmlns:r="http://schemas.openxmlformats.org/officeDocument/2006/relationships" xmlns:m="http://schemas.openxmlformats.org/officeDocument/2006/math" xmlns:v="urn:schemas-microsoft-com:vml" xmlns:wp14="http://schemas.microsoft.com/office/word/2010/wordprocessingDrawing" xmlns:wp="http://schemas.openxmlformats.org/drawingml/2006/wordprocessingDrawing" xmlns:w10="urn:schemas-microsoft-com:office:word" xmlns:w="http://schemas.openxmlformats.org/wordprocessingml/2006/main" xmlns:w14="http://schemas.microsoft.com/office/word/2010/wordml" xmlns:w15="http://schemas.microsoft.com/office/word/2012/wordml" xmlns:w16cex="http://schemas.microsoft.com/office/word/2018/wordml/cex" xmlns:w16cid="http://schemas.microsoft.com/office/word/2016/wordml/cid" xmlns:w16="http://schemas.microsoft.com/office/word/2018/wordml" xmlns:w16du="http://schemas.microsoft.com/office/word/2023/wordml/word16du" xmlns:w16sdtdh="http://schemas.microsoft.com/office/word/2020/wordml/sdtdatahash" xmlns:w16sdtfl="http://schemas.microsoft.com/office/word/2024/wordml/sdtformatlock" xmlns:w16se="http://schemas.microsoft.com/office/word/2015/wordml/symex" xmlns:wpg="http://schemas.microsoft.com/office/word/2010/wordprocessingGroup" xmlns:wpi="http://schemas.microsoft.com/office/word/2010/wordprocessingInk" xmlns:wne="http://schemas.microsoft.com/office/word/2006/wordml" xmlns:wps="http://schemas.microsoft.com/office/word/2010/wordprocessingShape" mc:Ignorable="w14 w15 w16se w16cid w16 w16cex w16sdtdh w16sdtfl w16du wp14">
   <w:sdt>
     <w:sdtPr>
       <w:id w:val="-1660145732"/>
@@ -6823,7 +6884,7 @@
 </file>
 
 <file path=word/footnotes.xml><?xml version="1.0" encoding="utf-8"?>
-<w:footnotes xmlns:wpc="http://schemas.microsoft.com/office/word/2010/wordprocessingCanvas" xmlns:cx="http://schemas.microsoft.com/office/drawing/2014/chartex" xmlns:cx1="http://schemas.microsoft.com/office/drawing/2015/9/8/chartex" xmlns:cx2="http://schemas.microsoft.com/office/drawing/2015/10/21/chartex" xmlns:cx3="http://schemas.microsoft.com/office/drawing/2016/5/9/chartex" xmlns:cx4="http://schemas.microsoft.com/office/drawing/2016/5/10/chartex" xmlns:cx5="http://schemas.microsoft.com/office/drawing/2016/5/11/chartex" xmlns:cx6="http://schemas.microsoft.com/office/drawing/2016/5/12/chartex" xmlns:cx7="http://schemas.microsoft.com/office/drawing/2016/5/13/chartex" xmlns:cx8="http://schemas.microsoft.com/office/drawing/2016/5/14/chartex" xmlns:mc="http://schemas.openxmlformats.org/markup-compatibility/2006" xmlns:aink="http://schemas.microsoft.com/office/drawing/2016/ink" xmlns:am3d="http://schemas.microsoft.com/office/drawing/2017/model3d" xmlns:o="urn:schemas-microsoft-com:office:office" xmlns:oel="http://schemas.microsoft.com/office/2019/extlst" xmlns:r="http://schemas.openxmlformats.org/officeDocument/2006/relationships" xmlns:m="http://schemas.openxmlformats.org/officeDocument/2006/math" xmlns:v="urn:schemas-microsoft-com:vml" xmlns:wp14="http://schemas.microsoft.com/office/word/2010/wordprocessingDrawing" xmlns:wp="http://schemas.openxmlformats.org/drawingml/2006/wordprocessingDrawing" xmlns:w10="urn:schemas-microsoft-com:office:word" xmlns:w="http://schemas.openxmlformats.org/wordprocessingml/2006/main" xmlns:w14="http://schemas.microsoft.com/office/word/2010/wordml" xmlns:w15="http://schemas.microsoft.com/office/word/2012/wordml" xmlns:w16cex="http://schemas.microsoft.com/office/word/2018/wordml/cex" xmlns:w16cid="http://schemas.microsoft.com/office/word/2016/wordml/cid" xmlns:w16="http://schemas.microsoft.com/office/word/2018/wordml" xmlns:w16du="http://schemas.microsoft.com/office/word/2023/wordml/word16du" xmlns:w16sdtdh="http://schemas.microsoft.com/office/word/2020/wordml/sdtdatahash" xmlns:w16se="http://schemas.microsoft.com/office/word/2015/wordml/symex" xmlns:wpg="http://schemas.microsoft.com/office/word/2010/wordprocessingGroup" xmlns:wpi="http://schemas.microsoft.com/office/word/2010/wordprocessingInk" xmlns:wne="http://schemas.microsoft.com/office/word/2006/wordml" xmlns:wps="http://schemas.microsoft.com/office/word/2010/wordprocessingShape" mc:Ignorable="w14 w15 w16se w16cid w16 w16cex w16sdtdh w16du wp14">
+<w:footnotes xmlns:wpc="http://schemas.microsoft.com/office/word/2010/wordprocessingCanvas" xmlns:cx="http://schemas.microsoft.com/office/drawing/2014/chartex" xmlns:cx1="http://schemas.microsoft.com/office/drawing/2015/9/8/chartex" xmlns:cx2="http://schemas.microsoft.com/office/drawing/2015/10/21/chartex" xmlns:cx3="http://schemas.microsoft.com/office/drawing/2016/5/9/chartex" xmlns:cx4="http://schemas.microsoft.com/office/drawing/2016/5/10/chartex" xmlns:cx5="http://schemas.microsoft.com/office/drawing/2016/5/11/chartex" xmlns:cx6="http://schemas.microsoft.com/office/drawing/2016/5/12/chartex" xmlns:cx7="http://schemas.microsoft.com/office/drawing/2016/5/13/chartex" xmlns:cx8="http://schemas.microsoft.com/office/drawing/2016/5/14/chartex" xmlns:mc="http://schemas.openxmlformats.org/markup-compatibility/2006" xmlns:aink="http://schemas.microsoft.com/office/drawing/2016/ink" xmlns:am3d="http://schemas.microsoft.com/office/drawing/2017/model3d" xmlns:o="urn:schemas-microsoft-com:office:office" xmlns:oel="http://schemas.microsoft.com/office/2019/extlst" xmlns:r="http://schemas.openxmlformats.org/officeDocument/2006/relationships" xmlns:m="http://schemas.openxmlformats.org/officeDocument/2006/math" xmlns:v="urn:schemas-microsoft-com:vml" xmlns:wp14="http://schemas.microsoft.com/office/word/2010/wordprocessingDrawing" xmlns:wp="http://schemas.openxmlformats.org/drawingml/2006/wordprocessingDrawing" xmlns:w10="urn:schemas-microsoft-com:office:word" xmlns:w="http://schemas.openxmlformats.org/wordprocessingml/2006/main" xmlns:w14="http://schemas.microsoft.com/office/word/2010/wordml" xmlns:w15="http://schemas.microsoft.com/office/word/2012/wordml" xmlns:w16cex="http://schemas.microsoft.com/office/word/2018/wordml/cex" xmlns:w16cid="http://schemas.microsoft.com/office/word/2016/wordml/cid" xmlns:w16="http://schemas.microsoft.com/office/word/2018/wordml" xmlns:w16du="http://schemas.microsoft.com/office/word/2023/wordml/word16du" xmlns:w16sdtdh="http://schemas.microsoft.com/office/word/2020/wordml/sdtdatahash" xmlns:w16sdtfl="http://schemas.microsoft.com/office/word/2024/wordml/sdtformatlock" xmlns:w16se="http://schemas.microsoft.com/office/word/2015/wordml/symex" xmlns:wpg="http://schemas.microsoft.com/office/word/2010/wordprocessingGroup" xmlns:wpi="http://schemas.microsoft.com/office/word/2010/wordprocessingInk" xmlns:wne="http://schemas.microsoft.com/office/word/2006/wordml" xmlns:wps="http://schemas.microsoft.com/office/word/2010/wordprocessingShape" mc:Ignorable="w14 w15 w16se w16cid w16 w16cex w16sdtdh w16sdtfl w16du wp14">
   <w:footnote w:type="separator" w:id="-1">
     <w:p>
       <w:r>
@@ -6845,7 +6906,7 @@
 </file>
 
 <file path=word/numbering.xml><?xml version="1.0" encoding="utf-8"?>
-<w:numbering xmlns:wpc="http://schemas.microsoft.com/office/word/2010/wordprocessingCanvas" xmlns:cx="http://schemas.microsoft.com/office/drawing/2014/chartex" xmlns:cx1="http://schemas.microsoft.com/office/drawing/2015/9/8/chartex" xmlns:cx2="http://schemas.microsoft.com/office/drawing/2015/10/21/chartex" xmlns:cx3="http://schemas.microsoft.com/office/drawing/2016/5/9/chartex" xmlns:cx4="http://schemas.microsoft.com/office/drawing/2016/5/10/chartex" xmlns:cx5="http://schemas.microsoft.com/office/drawing/2016/5/11/chartex" xmlns:cx6="http://schemas.microsoft.com/office/drawing/2016/5/12/chartex" xmlns:cx7="http://schemas.microsoft.com/office/drawing/2016/5/13/chartex" xmlns:cx8="http://schemas.microsoft.com/office/drawing/2016/5/14/chartex" xmlns:mc="http://schemas.openxmlformats.org/markup-compatibility/2006" xmlns:aink="http://schemas.microsoft.com/office/drawing/2016/ink" xmlns:am3d="http://schemas.microsoft.com/office/drawing/2017/model3d" xmlns:o="urn:schemas-microsoft-com:office:office" xmlns:oel="http://schemas.microsoft.com/office/2019/extlst" xmlns:r="http://schemas.openxmlformats.org/officeDocument/2006/relationships" xmlns:m="http://schemas.openxmlformats.org/officeDocument/2006/math" xmlns:v="urn:schemas-microsoft-com:vml" xmlns:wp14="http://schemas.microsoft.com/office/word/2010/wordprocessingDrawing" xmlns:wp="http://schemas.openxmlformats.org/drawingml/2006/wordprocessingDrawing" xmlns:w10="urn:schemas-microsoft-com:office:word" xmlns:w="http://schemas.openxmlformats.org/wordprocessingml/2006/main" xmlns:w14="http://schemas.microsoft.com/office/word/2010/wordml" xmlns:w15="http://schemas.microsoft.com/office/word/2012/wordml" xmlns:w16cex="http://schemas.microsoft.com/office/word/2018/wordml/cex" xmlns:w16cid="http://schemas.microsoft.com/office/word/2016/wordml/cid" xmlns:w16="http://schemas.microsoft.com/office/word/2018/wordml" xmlns:w16du="http://schemas.microsoft.com/office/word/2023/wordml/word16du" xmlns:w16sdtdh="http://schemas.microsoft.com/office/word/2020/wordml/sdtdatahash" xmlns:w16se="http://schemas.microsoft.com/office/word/2015/wordml/symex" xmlns:wpg="http://schemas.microsoft.com/office/word/2010/wordprocessingGroup" xmlns:wpi="http://schemas.microsoft.com/office/word/2010/wordprocessingInk" xmlns:wne="http://schemas.microsoft.com/office/word/2006/wordml" xmlns:wps="http://schemas.microsoft.com/office/word/2010/wordprocessingShape" mc:Ignorable="w14 w15 w16se w16cid w16 w16cex w16sdtdh w16du wp14">
+<w:numbering xmlns:wpc="http://schemas.microsoft.com/office/word/2010/wordprocessingCanvas" xmlns:cx="http://schemas.microsoft.com/office/drawing/2014/chartex" xmlns:cx1="http://schemas.microsoft.com/office/drawing/2015/9/8/chartex" xmlns:cx2="http://schemas.microsoft.com/office/drawing/2015/10/21/chartex" xmlns:cx3="http://schemas.microsoft.com/office/drawing/2016/5/9/chartex" xmlns:cx4="http://schemas.microsoft.com/office/drawing/2016/5/10/chartex" xmlns:cx5="http://schemas.microsoft.com/office/drawing/2016/5/11/chartex" xmlns:cx6="http://schemas.microsoft.com/office/drawing/2016/5/12/chartex" xmlns:cx7="http://schemas.microsoft.com/office/drawing/2016/5/13/chartex" xmlns:cx8="http://schemas.microsoft.com/office/drawing/2016/5/14/chartex" xmlns:mc="http://schemas.openxmlformats.org/markup-compatibility/2006" xmlns:aink="http://schemas.microsoft.com/office/drawing/2016/ink" xmlns:am3d="http://schemas.microsoft.com/office/drawing/2017/model3d" xmlns:o="urn:schemas-microsoft-com:office:office" xmlns:oel="http://schemas.microsoft.com/office/2019/extlst" xmlns:r="http://schemas.openxmlformats.org/officeDocument/2006/relationships" xmlns:m="http://schemas.openxmlformats.org/officeDocument/2006/math" xmlns:v="urn:schemas-microsoft-com:vml" xmlns:wp14="http://schemas.microsoft.com/office/word/2010/wordprocessingDrawing" xmlns:wp="http://schemas.openxmlformats.org/drawingml/2006/wordprocessingDrawing" xmlns:w10="urn:schemas-microsoft-com:office:word" xmlns:w="http://schemas.openxmlformats.org/wordprocessingml/2006/main" xmlns:w14="http://schemas.microsoft.com/office/word/2010/wordml" xmlns:w15="http://schemas.microsoft.com/office/word/2012/wordml" xmlns:w16cex="http://schemas.microsoft.com/office/word/2018/wordml/cex" xmlns:w16cid="http://schemas.microsoft.com/office/word/2016/wordml/cid" xmlns:w16="http://schemas.microsoft.com/office/word/2018/wordml" xmlns:w16du="http://schemas.microsoft.com/office/word/2023/wordml/word16du" xmlns:w16sdtdh="http://schemas.microsoft.com/office/word/2020/wordml/sdtdatahash" xmlns:w16sdtfl="http://schemas.microsoft.com/office/word/2024/wordml/sdtformatlock" xmlns:w16se="http://schemas.microsoft.com/office/word/2015/wordml/symex" xmlns:wpg="http://schemas.microsoft.com/office/word/2010/wordprocessingGroup" xmlns:wpi="http://schemas.microsoft.com/office/word/2010/wordprocessingInk" xmlns:wne="http://schemas.microsoft.com/office/word/2006/wordml" xmlns:wps="http://schemas.microsoft.com/office/word/2010/wordprocessingShape" mc:Ignorable="w14 w15 w16se w16cid w16 w16cex w16sdtdh w16sdtfl w16du wp14">
   <w:abstractNum w:abstractNumId="0" w15:restartNumberingAfterBreak="0">
     <w:nsid w:val="02A109C2"/>
     <w:multiLevelType w:val="hybridMultilevel"/>
@@ -11282,7 +11343,7 @@
 </file>
 
 <file path=word/styles.xml><?xml version="1.0" encoding="utf-8"?>
-<w:styles xmlns:mc="http://schemas.openxmlformats.org/markup-compatibility/2006" xmlns:r="http://schemas.openxmlformats.org/officeDocument/2006/relationships" xmlns:w="http://schemas.openxmlformats.org/wordprocessingml/2006/main" xmlns:w14="http://schemas.microsoft.com/office/word/2010/wordml" xmlns:w15="http://schemas.microsoft.com/office/word/2012/wordml" xmlns:w16cex="http://schemas.microsoft.com/office/word/2018/wordml/cex" xmlns:w16cid="http://schemas.microsoft.com/office/word/2016/wordml/cid" xmlns:w16="http://schemas.microsoft.com/office/word/2018/wordml" xmlns:w16du="http://schemas.microsoft.com/office/word/2023/wordml/word16du" xmlns:w16sdtdh="http://schemas.microsoft.com/office/word/2020/wordml/sdtdatahash" xmlns:w16se="http://schemas.microsoft.com/office/word/2015/wordml/symex" mc:Ignorable="w14 w15 w16se w16cid w16 w16cex w16sdtdh w16du">
+<w:styles xmlns:mc="http://schemas.openxmlformats.org/markup-compatibility/2006" xmlns:r="http://schemas.openxmlformats.org/officeDocument/2006/relationships" xmlns:w="http://schemas.openxmlformats.org/wordprocessingml/2006/main" xmlns:w14="http://schemas.microsoft.com/office/word/2010/wordml" xmlns:w15="http://schemas.microsoft.com/office/word/2012/wordml" xmlns:w16cex="http://schemas.microsoft.com/office/word/2018/wordml/cex" xmlns:w16cid="http://schemas.microsoft.com/office/word/2016/wordml/cid" xmlns:w16="http://schemas.microsoft.com/office/word/2018/wordml" xmlns:w16du="http://schemas.microsoft.com/office/word/2023/wordml/word16du" xmlns:w16sdtdh="http://schemas.microsoft.com/office/word/2020/wordml/sdtdatahash" xmlns:w16sdtfl="http://schemas.microsoft.com/office/word/2024/wordml/sdtformatlock" xmlns:w16se="http://schemas.microsoft.com/office/word/2015/wordml/symex" mc:Ignorable="w14 w15 w16se w16cid w16 w16cex w16sdtdh w16sdtfl w16du">
   <w:docDefaults>
     <w:rPrDefault>
       <w:rPr>
@@ -12370,22 +12431,9 @@
 </file>
 
 <file path=customXml/item1.xml><?xml version="1.0" encoding="utf-8"?>
-<b:Sources xmlns:b="http://schemas.openxmlformats.org/officeDocument/2006/bibliography" xmlns="http://schemas.openxmlformats.org/officeDocument/2006/bibliography" SelectedStyle="\APA.XSL" StyleName="APA"/>
-</file>
-
-<file path=customXml/item2.xml><?xml version="1.0" encoding="utf-8"?>
-<?mso-contentType ?>
-<FormTemplates xmlns="http://schemas.microsoft.com/sharepoint/v3/contenttype/forms">
-  <Display>DocumentLibraryForm</Display>
-  <Edit>DocumentLibraryForm</Edit>
-  <New>DocumentLibraryForm</New>
-</FormTemplates>
-</file>
-
-<file path=customXml/item3.xml><?xml version="1.0" encoding="utf-8"?>
-<ct:contentTypeSchema xmlns:ct="http://schemas.microsoft.com/office/2006/metadata/contentType" xmlns:ma="http://schemas.microsoft.com/office/2006/metadata/properties/metaAttributes" ct:_="" ma:_="" ma:contentTypeName="Document" ma:contentTypeID="0x01010000EF9B9C82148C4B96D58E6838E54CC6" ma:contentTypeVersion="4" ma:contentTypeDescription="Create a new document." ma:contentTypeScope="" ma:versionID="f7eb6c66a49a738c5fd4ff62331d6ffd">
-  <xsd:schema xmlns:xsd="http://www.w3.org/2001/XMLSchema" xmlns:xs="http://www.w3.org/2001/XMLSchema" xmlns:p="http://schemas.microsoft.com/office/2006/metadata/properties" xmlns:ns2="32ddce0a-34ac-41bc-9466-633fbe02521d" targetNamespace="http://schemas.microsoft.com/office/2006/metadata/properties" ma:root="true" ma:fieldsID="41ca030284368ea82b9a477977a483ee" ns2:_="">
-    <xsd:import namespace="32ddce0a-34ac-41bc-9466-633fbe02521d"/>
+<ct:contentTypeSchema xmlns:ct="http://schemas.microsoft.com/office/2006/metadata/contentType" xmlns:ma="http://schemas.microsoft.com/office/2006/metadata/properties/metaAttributes" ct:_="" ma:_="" ma:contentTypeName="Document" ma:contentTypeID="0x010100E113F5C5227B894AAC342FD2F815418E" ma:contentTypeVersion="4" ma:contentTypeDescription="Create a new document." ma:contentTypeScope="" ma:versionID="18579694af609a883fd22d647fd1c722">
+  <xsd:schema xmlns:xsd="http://www.w3.org/2001/XMLSchema" xmlns:xs="http://www.w3.org/2001/XMLSchema" xmlns:p="http://schemas.microsoft.com/office/2006/metadata/properties" xmlns:ns2="41673593-3133-4377-ad1e-fd322142c67b" targetNamespace="http://schemas.microsoft.com/office/2006/metadata/properties" ma:root="true" ma:fieldsID="c9a4975ee0e8e3ff0f00864584e943c4" ns2:_="">
+    <xsd:import namespace="41673593-3133-4377-ad1e-fd322142c67b"/>
     <xsd:element name="properties">
       <xsd:complexType>
         <xsd:sequence>
@@ -12403,7 +12451,7 @@
       </xsd:complexType>
     </xsd:element>
   </xsd:schema>
-  <xsd:schema xmlns:xsd="http://www.w3.org/2001/XMLSchema" xmlns:xs="http://www.w3.org/2001/XMLSchema" xmlns:dms="http://schemas.microsoft.com/office/2006/documentManagement/types" xmlns:pc="http://schemas.microsoft.com/office/infopath/2007/PartnerControls" targetNamespace="32ddce0a-34ac-41bc-9466-633fbe02521d" elementFormDefault="qualified">
+  <xsd:schema xmlns:xsd="http://www.w3.org/2001/XMLSchema" xmlns:xs="http://www.w3.org/2001/XMLSchema" xmlns:dms="http://schemas.microsoft.com/office/2006/documentManagement/types" xmlns:pc="http://schemas.microsoft.com/office/infopath/2007/PartnerControls" targetNamespace="41673593-3133-4377-ad1e-fd322142c67b" elementFormDefault="qualified">
     <xsd:import namespace="http://schemas.microsoft.com/office/2006/documentManagement/types"/>
     <xsd:import namespace="http://schemas.microsoft.com/office/infopath/2007/PartnerControls"/>
     <xsd:element name="MediaServiceMetadata" ma:index="8" nillable="true" ma:displayName="MediaServiceMetadata" ma:hidden="true" ma:internalName="MediaServiceMetadata" ma:readOnly="true">
@@ -12526,6 +12574,19 @@
 </ct:contentTypeSchema>
 </file>
 
+<file path=customXml/item2.xml><?xml version="1.0" encoding="utf-8"?>
+<?mso-contentType ?>
+<FormTemplates xmlns="http://schemas.microsoft.com/sharepoint/v3/contenttype/forms">
+  <Display>DocumentLibraryForm</Display>
+  <Edit>DocumentLibraryForm</Edit>
+  <New>DocumentLibraryForm</New>
+</FormTemplates>
+</file>
+
+<file path=customXml/item3.xml><?xml version="1.0" encoding="utf-8"?>
+<b:Sources xmlns:b="http://schemas.openxmlformats.org/officeDocument/2006/bibliography" xmlns="http://schemas.openxmlformats.org/officeDocument/2006/bibliography" SelectedStyle="\APA.XSL" StyleName="APA"/>
+</file>
+
 <file path=customXml/item4.xml><?xml version="1.0" encoding="utf-8"?>
 <p:properties xmlns:p="http://schemas.microsoft.com/office/2006/metadata/properties" xmlns:xsi="http://www.w3.org/2001/XMLSchema-instance">
   <documentManagement/>
@@ -12533,9 +12594,19 @@
 </file>
 
 <file path=customXml/itemProps1.xml><?xml version="1.0" encoding="utf-8"?>
-<ds:datastoreItem xmlns:ds="http://schemas.openxmlformats.org/officeDocument/2006/customXml" ds:itemID="{A976FBD8-E2B1-46C0-ACBB-B920108BE5B2}">
+<ds:datastoreItem xmlns:ds="http://schemas.openxmlformats.org/officeDocument/2006/customXml" ds:itemID="{5B6FE2F0-DA02-4148-B23F-C30C1B82D96F}">
   <ds:schemaRefs>
-    <ds:schemaRef ds:uri="http://schemas.openxmlformats.org/officeDocument/2006/bibliography"/>
+    <ds:schemaRef ds:uri="http://schemas.microsoft.com/office/2006/metadata/contentType"/>
+    <ds:schemaRef ds:uri="http://schemas.microsoft.com/office/2006/metadata/properties/metaAttributes"/>
+    <ds:schemaRef ds:uri="http://www.w3.org/2001/XMLSchema"/>
+    <ds:schemaRef ds:uri="http://schemas.microsoft.com/office/2006/metadata/properties"/>
+    <ds:schemaRef ds:uri="41673593-3133-4377-ad1e-fd322142c67b"/>
+    <ds:schemaRef ds:uri="http://schemas.microsoft.com/office/2006/documentManagement/types"/>
+    <ds:schemaRef ds:uri="http://schemas.microsoft.com/office/infopath/2007/PartnerControls"/>
+    <ds:schemaRef ds:uri="http://schemas.openxmlformats.org/package/2006/metadata/core-properties"/>
+    <ds:schemaRef ds:uri="http://purl.org/dc/elements/1.1/"/>
+    <ds:schemaRef ds:uri="http://purl.org/dc/terms/"/>
+    <ds:schemaRef ds:uri="http://schemas.microsoft.com/internal/obd"/>
   </ds:schemaRefs>
 </ds:datastoreItem>
 </file>
@@ -12549,19 +12620,9 @@
 </file>
 
 <file path=customXml/itemProps3.xml><?xml version="1.0" encoding="utf-8"?>
-<ds:datastoreItem xmlns:ds="http://schemas.openxmlformats.org/officeDocument/2006/customXml" ds:itemID="{170CD711-FBFB-42AE-9838-8B77C508EAD4}">
+<ds:datastoreItem xmlns:ds="http://schemas.openxmlformats.org/officeDocument/2006/customXml" ds:itemID="{A976FBD8-E2B1-46C0-ACBB-B920108BE5B2}">
   <ds:schemaRefs>
-    <ds:schemaRef ds:uri="http://schemas.microsoft.com/office/2006/metadata/contentType"/>
-    <ds:schemaRef ds:uri="http://schemas.microsoft.com/office/2006/metadata/properties/metaAttributes"/>
-    <ds:schemaRef ds:uri="http://www.w3.org/2001/XMLSchema"/>
-    <ds:schemaRef ds:uri="http://schemas.microsoft.com/office/2006/metadata/properties"/>
-    <ds:schemaRef ds:uri="32ddce0a-34ac-41bc-9466-633fbe02521d"/>
-    <ds:schemaRef ds:uri="http://schemas.microsoft.com/office/2006/documentManagement/types"/>
-    <ds:schemaRef ds:uri="http://schemas.microsoft.com/office/infopath/2007/PartnerControls"/>
-    <ds:schemaRef ds:uri="http://schemas.openxmlformats.org/package/2006/metadata/core-properties"/>
-    <ds:schemaRef ds:uri="http://purl.org/dc/elements/1.1/"/>
-    <ds:schemaRef ds:uri="http://purl.org/dc/terms/"/>
-    <ds:schemaRef ds:uri="http://schemas.microsoft.com/internal/obd"/>
+    <ds:schemaRef ds:uri="http://schemas.openxmlformats.org/officeDocument/2006/bibliography"/>
   </ds:schemaRefs>
 </ds:datastoreItem>
 </file>
@@ -12569,21 +12630,13 @@
 <file path=customXml/itemProps4.xml><?xml version="1.0" encoding="utf-8"?>
 <ds:datastoreItem xmlns:ds="http://schemas.openxmlformats.org/officeDocument/2006/customXml" ds:itemID="{F19E182A-E278-49AC-A58D-A3181FBB2975}">
   <ds:schemaRefs>
-    <ds:schemaRef ds:uri="http://purl.org/dc/terms/"/>
-    <ds:schemaRef ds:uri="http://schemas.microsoft.com/office/infopath/2007/PartnerControls"/>
-    <ds:schemaRef ds:uri="http://purl.org/dc/dcmitype/"/>
-    <ds:schemaRef ds:uri="http://schemas.microsoft.com/office/2006/documentManagement/types"/>
-    <ds:schemaRef ds:uri="http://schemas.openxmlformats.org/package/2006/metadata/core-properties"/>
-    <ds:schemaRef ds:uri="http://www.w3.org/XML/1998/namespace"/>
-    <ds:schemaRef ds:uri="32ddce0a-34ac-41bc-9466-633fbe02521d"/>
     <ds:schemaRef ds:uri="http://schemas.microsoft.com/office/2006/metadata/properties"/>
-    <ds:schemaRef ds:uri="http://purl.org/dc/elements/1.1/"/>
   </ds:schemaRefs>
 </ds:datastoreItem>
 </file>
 
 <file path=docMetadata/LabelInfo.xml><?xml version="1.0" encoding="utf-8"?>
 <clbl:labelList xmlns:clbl="http://schemas.microsoft.com/office/2020/mipLabelMetadata">
-  <clbl:label id="{8331b18d-2d87-48ef-a35f-ac8818ebf9b4}" enabled="0" method="" siteId="{8331b18d-2d87-48ef-a35f-ac8818ebf9b4}" removed="1"/>
+  <clbl:label id="{37adc8ff-f4a3-4a14-9c0d-84b4985de0d2}" enabled="1" method="Privileged" siteId="{8331b18d-2d87-48ef-a35f-ac8818ebf9b4}" removed="0"/>
 </clbl:labelList>
 </file>
</xml_diff>